<commit_message>
docs(p7): document Türkiye/Azerbaijan/Comoros exclusion; reconcile economy/wave counts to audit
Per the scope document (wbes_asia_country_scope.md §4) and the WB/ADB regional
taxonomy: Türkiye and Azerbaijan (WB Europe & Central Asia) and Comoros (Sub-
Saharan Africa) sit outside the ADB Asia frame and are excluded; Central Asia +
Armenia/Georgia/Cyprus are retained as emerging-Asia. Added an explicit exclusion
rationale to the methods (EN + VI) so the scope is defensible at desk review.

Reconciled headline counts to the reproducible audit: 49->48 economies and
102->107 country-year waves throughout; corrected the sub-region roster (added
Georgia, removed Oman) to match the 48-economy estimation set; and fixed the
inaccurate "Oman contributes to M2" claim (Oman's 2003 vintage has zero usable
productivity/export rows, so it does not enter any model). N=84,910 unchanged.
Rebuilt P7 DOCX (EN + VN).

https://claude.ai/code/session_01TNqoRFY1vAVQL6GWg8X9M3
</commit_message>
<xml_diff>
--- a/dist/submission/p7_capstone_JIBS.docx
+++ b/dist/submission/p7_capstone_JIBS.docx
@@ -130,7 +130,7 @@
         <w:t xml:space="preserve"> </w:t>
       </w:r>
       <w:r>
-        <w:t xml:space="preserve">for institutional strength rather than as a uniform enhancer. Using harmonised microdata from 91,982 firm-observations (baseline estimation sample N = 84,910 after non-missing productivity and export-intensity requirements; 29,840 in the fully specified model) across 49 economies and 102 country-year waves of the World Bank Enterprise Survey (2003–2025), spanning all six groups of the Institutional Context Regime Variation (ICRV) framework, we estimate a hierarchical set of OLS models with HC1 robust standard errors. We confirm a robustly inverted-U I–P relationship with a turning point at approximately 36% of sales from exports (Lind–Mehlum test p &lt; .001; confirmed in M11 at TP=34.6%, p=.002). Institutional regime systematically relocates this optimum: the performance-maximising export intensity shifts from earlier-peaking in advanced regimes to later-peaking in frontier and vulnerable regimes. Digital adoption (DAI) both raises the performance level and reshapes the curve — compressing ascending-limb returns at low FSTS and attenuating performance decline at high FSTS (FSTS×DAI p &lt; .01; FSTS²×DAI p &lt; .01 in M8–M9) — and its curve-reshaping potency is significantly stronger in weaker-institution regimes (DAI×ICRV p = .012), consistent with digital-for-institutional substitution. Technological capability (TCI) raises the performance level without reliably reshaping the curve, and managerial experience and female top management improve performance. The account offers a parsimonious resolution to the fragmented Asian I–P literature: divergent country findings are not mutually contradictory but locate firms at different positions on a single optimum whose location is jointly set by institutional quality and digital capability.</w:t>
+        <w:t xml:space="preserve">for institutional strength rather than as a uniform enhancer. Using harmonised microdata from 91,982 firm-observations (baseline estimation sample N = 84,910 after non-missing productivity and export-intensity requirements; 29,840 in the fully specified model) across 48 economies and 107 country-year waves of the World Bank Enterprise Survey (2003–2025), spanning all six groups of the Institutional Context Regime Variation (ICRV) framework, we estimate a hierarchical set of OLS models with HC1 robust standard errors. We confirm a robustly inverted-U I–P relationship with a turning point at approximately 36% of sales from exports (Lind–Mehlum test p &lt; .001; confirmed in M11 at TP=34.6%, p=.002). Institutional regime systematically relocates this optimum: the performance-maximising export intensity shifts from earlier-peaking in advanced regimes to later-peaking in frontier and vulnerable regimes. Digital adoption (DAI) both raises the performance level and reshapes the curve — compressing ascending-limb returns at low FSTS and attenuating performance decline at high FSTS (FSTS×DAI p &lt; .01; FSTS²×DAI p &lt; .01 in M8–M9) — and its curve-reshaping potency is significantly stronger in weaker-institution regimes (DAI×ICRV p = .012), consistent with digital-for-institutional substitution. Technological capability (TCI) raises the performance level without reliably reshaping the curve, and managerial experience and female top management improve performance. The account offers a parsimonious resolution to the fragmented Asian I–P literature: divergent country findings are not mutually contradictory but locate firms at different positions on a single optimum whose location is jointly set by institutional quality and digital capability.</w:t>
       </w:r>
     </w:p>
     <w:p>
@@ -213,7 +213,7 @@
         <w:pStyle w:val="BodyText"/>
       </w:pPr>
       <w:r>
-        <w:t xml:space="preserve">This paper addresses that gap. We pool 91,982 firm-observations from 49 Asian and Pacific economies spanning 2003–2025, harmonised from the World Bank Enterprise Survey (WBES); after imposing non-missing productivity and export-intensity requirements, the baseline estimation sample is 84,910 firm-observations (falling to 29,840 in the fully specified model M11). Our sample spans all six ICRV regime groups — from advanced innovation-driven economies (Singapore, Korea, Taiwan, HongKong, Israel, Cyprus) to Pacific Small Island Developing States (Vanuatu, Solomon Islands, Fiji, Tonga, Samoa, Kiribati, Papua New Guinea, Timor-Leste) and Gulf advanced-resource economies (Bahrain, Kuwait, Qatar, Brunei, Saudi Arabia, Oman) — classified through the Institutional Context Regime Variation (ICRV) framework that anchors the broader dissertation programme of which this study is part.</w:t>
+        <w:t xml:space="preserve">This paper addresses that gap. We pool 91,982 firm-observations from 48 Asian and Pacific economies spanning 2003–2025, harmonised from the World Bank Enterprise Survey (WBES); after imposing non-missing productivity and export-intensity requirements, the baseline estimation sample is 84,910 firm-observations (falling to 29,840 in the fully specified model M11). Our sample spans all six ICRV regime groups — from advanced innovation-driven economies (Singapore, Korea, Taiwan, HongKong, Israel, Cyprus) to Pacific Small Island Developing States (Vanuatu, Solomon Islands, Fiji, Tonga, Samoa, Kiribati, Papua New Guinea, Timor-Leste) and Gulf advanced-resource economies (Bahrain, Kuwait, Qatar, Brunei, Saudi Arabia) — classified through the Institutional Context Regime Variation (ICRV) framework that anchors the broader dissertation programme of which this study is part.</w:t>
       </w:r>
     </w:p>
     <w:p>
@@ -871,15 +871,15 @@
         <w:pStyle w:val="FirstParagraph"/>
       </w:pPr>
       <w:r>
-        <w:t xml:space="preserve">Data derive from the World Bank Enterprise Surveys (WBES), a stratified random-sample survey of formal private-sector enterprises conducted periodically across over 130 countries. We use microdata from 49 Asian and Pacific economies across 102 country-year waves spanning 2003–2025. This coverage encompasses six UN M.49 Asian sub-regions: East Asia (China, HongKong, Korea, Mongolia, Taiwan), Southeast Asia (Brunei, Cambodia, Indonesia, Laos, Malaysia, Myanmar, Philippines, Singapore, Thailand, Timor-Leste, Vietnam), South Asia (Afghanistan, Bangladesh, Bhutan, India, Maldives, Nepal, Pakistan, Sri Lanka), Central Asia (Kazakhstan, Kyrgyz Republic, Tajikistan, Turkmenistan, Uzbekistan), West Asia (Armenia, Bahrain, Cyprus, Iraq, Israel, Jordan, Kuwait, Lebanon, Oman, Qatar, Saudi Arabia, Yemen), and Pacific/SIDS (Fiji, Kiribati, Papua New Guinea, Samoa, Solomon Islands, Tonga, Vanuatu).</w:t>
-      </w:r>
-    </w:p>
-    <w:p>
-      <w:pPr>
-        <w:pStyle w:val="BodyText"/>
-      </w:pPr>
-      <w:r>
-        <w:t xml:space="preserve">The final analytical dataset contains 91,982 firm-observations (before applying outcome and FSTS non-missing requirements); imposing those requirements yields the M2 baseline estimation sample of 84,910 firm-observations, falling to 29,840 in M11 as digital-capability and managerial controls are added. Oman’s available data (2003 vintage) predates the digital-capability variables used in M6–M11; it contributes to M2 but drops from M3+ due to missing controls. WBES designs are cross-sectional within each wave, with standardised instruments ensuring common variable definitions across economies and years. We apply three harmonisation steps: (1) variable-priority mapping for candidate items across PICS3 (2009–2013), Standardised (2014–2018), and BREADY/BEE (2019–2025) questionnaire generations; (2) encoding-robust reading (primary UTF-8 with Latin-1/CP1252 fallback); (3) deduplication — selecting the largest file per (country, year) pair when multiple uploads exist.</w:t>
+        <w:t xml:space="preserve">Data derive from the World Bank Enterprise Surveys (WBES), a stratified random-sample survey of formal private-sector enterprises conducted periodically across over 130 countries. We use microdata from 48 Asian and Pacific economies across 107 country-year waves spanning 2003–2025. This coverage encompasses six UN M.49 Asian sub-regions: East Asia (China, HongKong, Korea, Mongolia, Taiwan), Southeast Asia (Brunei, Cambodia, Indonesia, Laos, Malaysia, Myanmar, Philippines, Singapore, Thailand, Timor-Leste, Vietnam), South Asia (Afghanistan, Bangladesh, Bhutan, India, Maldives, Nepal, Pakistan, Sri Lanka), Central Asia (Kazakhstan, Kyrgyz Republic, Tajikistan, Turkmenistan, Uzbekistan), West Asia (Armenia, Bahrain, Cyprus, Georgia, Iraq, Israel, Jordan, Kuwait, Lebanon, Qatar, Saudi Arabia, Yemen), and Pacific/SIDS (Fiji, Kiribati, Papua New Guinea, Samoa, Solomon Islands, Tonga, Vanuatu).</w:t>
+      </w:r>
+    </w:p>
+    <w:p>
+      <w:pPr>
+        <w:pStyle w:val="BodyText"/>
+      </w:pPr>
+      <w:r>
+        <w:t xml:space="preserve">The final analytical dataset contains 91,982 firm-observations (before applying outcome and FSTS non-missing requirements); imposing those requirements yields the M2 baseline estimation sample of 84,910 firm-observations, falling to 29,840 in M11 as digital-capability and managerial controls are added. Three economies that appear in the harmonised WBES pool fall outside the study’s Asia-Pacific frame and are excluded: Türkiye and Azerbaijan — which the World Bank files under the Europe &amp; Central Asia region and which lie outside the Asian Development Bank’s regional classification used to bound the sample — and Comoros (Sub-Saharan Africa). Central Asian and South Caucasus economies that the World Bank likewise files under Europe &amp; Central Asia (Kazakhstan, the Kyrgyz Republic, Tajikistan, Turkmenistan, Uzbekistan, Armenia and Georgia) are retained, consistent with their treatment as emerging-Asia economies under the ADB framework. Oman’s single available vintage (2003) lacks the productivity, export-intensity and digital-capability items and therefore does not enter the estimation sample. WBES designs are cross-sectional within each wave, with standardised instruments ensuring common variable definitions across economies and years. We apply three harmonisation steps: (1) variable-priority mapping for candidate items across PICS3 (2009–2013), Standardised (2014–2018), and BREADY/BEE (2019–2025) questionnaire generations; (2) encoding-robust reading (primary UTF-8 with Latin-1/CP1252 fallback); (3) deduplication — selecting the largest file per (country, year) pair when multiple uploads exist.</w:t>
       </w:r>
     </w:p>
     <w:bookmarkEnd w:id="30"/>
@@ -1102,7 +1102,7 @@
         <w:pStyle w:val="FirstParagraph"/>
       </w:pPr>
       <w:r>
-        <w:t xml:space="preserve">The full analytic sample spans 49 economies and 102 country-year waves. The mean FSTS across firms is approximately 12% (median ≈ 0), reflecting the fact that most WBES firms are domestically oriented; exporters (FSTS &gt; 0) represent approximately 18% of the sample. Labour productivity ranges from ln(LP) ≈ 10 (Tajikistan, Timor-Leste) to ln(LP) ≈ 20 (Vietnam, Indonesia — reflecting PPP-unadjusted nominal sales differences). Pairwise correlations among focal variables are modest (|r| &lt; .15 for all pairs), and variance inflation factors in the full model are below 3.5, ruling out multicollinearity concerns.</w:t>
+        <w:t xml:space="preserve">The full analytic sample spans 48 economies and 107 country-year waves. The mean FSTS across firms is approximately 12% (median ≈ 0), reflecting the fact that most WBES firms are domestically oriented; exporters (FSTS &gt; 0) represent approximately 18% of the sample. Labour productivity ranges from ln(LP) ≈ 10 (Tajikistan, Timor-Leste) to ln(LP) ≈ 20 (Vietnam, Indonesia — reflecting PPP-unadjusted nominal sales differences). Pairwise correlations among focal variables are modest (|r| &lt; .15 for all pairs), and variance inflation factors in the full model are below 3.5, ruling out multicollinearity concerns.</w:t>
       </w:r>
     </w:p>
     <w:bookmarkEnd w:id="35"/>
@@ -1150,7 +1150,7 @@
         <w:t xml:space="preserve"> </w:t>
       </w:r>
       <w:r>
-        <w:t xml:space="preserve">The I–P relationship is robustly inverted-U in the pooled sample of 49 Asian and Pacific economies, with a turning point of approximately 36% foreign sales intensity.</w:t>
+        <w:t xml:space="preserve">The I–P relationship is robustly inverted-U in the pooled sample of 48 Asian and Pacific economies, with a turning point of approximately 36% foreign sales intensity.</w:t>
       </w:r>
     </w:p>
     <w:bookmarkEnd w:id="36"/>
@@ -1242,7 +1242,7 @@
         <w:t xml:space="preserve"> </w:t>
       </w:r>
       <w:r>
-        <w:t xml:space="preserve">TCI raises the performance level consistently across specifications, but neither the ascending nor descending limb amplification reaches significance. The null curvature moderation likely reflects heterogeneous TCI effects across the institutionally diverse 49-economy sample, attenuating individual-country patterns documented in P3/P5.</w:t>
+        <w:t xml:space="preserve">TCI raises the performance level consistently across specifications, but neither the ascending nor descending limb amplification reaches significance. The null curvature moderation likely reflects heterogeneous TCI effects across the institutionally diverse 48-economy sample, attenuating individual-country patterns documented in P3/P5.</w:t>
       </w:r>
     </w:p>
     <w:bookmarkEnd w:id="37"/>
@@ -1713,7 +1713,7 @@
         <w:t xml:space="preserve"> </w:t>
       </w:r>
       <w:r>
-        <w:t xml:space="preserve">as a parsimonious contingency construct for cross-national IB research. By ordering economies jointly on institutional capability and resource vulnerability — dimensions that the varieties-of-capitalism (Hall &amp; Soskice, 2001) and institutional-voids (Khanna &amp; Palepu, 1997) traditions treat separately — ICRV predicts both the slope and the curvature of the I–P function across 49 economies, providing a transportable scaffold for theorising firm strategy under heterogeneous institutional regimes.</w:t>
+        <w:t xml:space="preserve">as a parsimonious contingency construct for cross-national IB research. By ordering economies jointly on institutional capability and resource vulnerability — dimensions that the varieties-of-capitalism (Hall &amp; Soskice, 2001) and institutional-voids (Khanna &amp; Palepu, 1997) traditions treat separately — ICRV predicts both the slope and the curvature of the I–P function across 48 economies, providing a transportable scaffold for theorising firm strategy under heterogeneous institutional regimes.</w:t>
       </w:r>
     </w:p>
     <w:bookmarkEnd w:id="43"/>
@@ -1731,7 +1731,7 @@
         <w:pStyle w:val="FirstParagraph"/>
       </w:pPr>
       <w:r>
-        <w:t xml:space="preserve">The central finding — an inverted-U with a turning point at approximately 36% foreign sales intensity, robust across 49 economies and six ICRV groups — offers a parsimonious resolution to apparent inconsistencies in the Asian I–P literature. Studies finding positive linear effects (Pangarkar, 2008: Singapore; Cho et al., 2023: Korea) are working with samples centred well below the 36% turning point; their firms are on the ascending limb. Studies finding null or negative results (Mondal et al., 2022: India family firms) may be capturing firms above the turning point in a high-WBES-wave year. Our ICRV moderation result provides a further refinement: the turning point itself varies from approximately 28% (Group I) to 55% (Group V–VI), so studies in institutionally advanced economies are likely to find earlier-peaking effects than studies in frontier economies.</w:t>
+        <w:t xml:space="preserve">The central finding — an inverted-U with a turning point at approximately 36% foreign sales intensity, robust across 48 economies and six ICRV groups — offers a parsimonious resolution to apparent inconsistencies in the Asian I–P literature. Studies finding positive linear effects (Pangarkar, 2008: Singapore; Cho et al., 2023: Korea) are working with samples centred well below the 36% turning point; their firms are on the ascending limb. Studies finding null or negative results (Mondal et al., 2022: India family firms) may be capturing firms above the turning point in a high-WBES-wave year. Our ICRV moderation result provides a further refinement: the turning point itself varies from approximately 28% (Group I) to 55% (Group V–VI), so studies in institutionally advanced economies are likely to find earlier-peaking effects than studies in frontier economies.</w:t>
       </w:r>
     </w:p>
     <w:bookmarkEnd w:id="44"/>
@@ -1749,7 +1749,7 @@
         <w:pStyle w:val="FirstParagraph"/>
       </w:pPr>
       <w:r>
-        <w:t xml:space="preserve">The finding that TCI raises the performance level without reliably reshaping the I–P curve in the pooled sample distinguishes the cross-economy result from country-specific evidence. In P3 Vietnam and P5 China, TCI moderated the curve shape; in the 49-economy pool, institutional heterogeneity attenuates that moderation signal. This is consistent with the absorptive capacity argument (Cohen &amp; Levinthal, 1990): high-TCI firms process international market signals more effectively, but the curve-shaping benefit requires institutional complementarity (e.g., strong IP protection, technology transfer infrastructure) that is inconsistently present across the full ICRV spectrum. The practical implication is that technological capability raises the performance floor universally, but its curve-reshaping role is context-contingent and cannot be assumed at scale.</w:t>
+        <w:t xml:space="preserve">The finding that TCI raises the performance level without reliably reshaping the I–P curve in the pooled sample distinguishes the cross-economy result from country-specific evidence. In P3 Vietnam and P5 China, TCI moderated the curve shape; in the 48-economy pool, institutional heterogeneity attenuates that moderation signal. This is consistent with the absorptive capacity argument (Cohen &amp; Levinthal, 1990): high-TCI firms process international market signals more effectively, but the curve-shaping benefit requires institutional complementarity (e.g., strong IP protection, technology transfer infrastructure) that is inconsistently present across the full ICRV spectrum. The practical implication is that technological capability raises the performance floor universally, but its curve-reshaping role is context-contingent and cannot be assumed at scale.</w:t>
       </w:r>
     </w:p>
     <w:bookmarkEnd w:id="45"/>
@@ -1845,7 +1845,7 @@
         <w:t xml:space="preserve"> </w:t>
       </w:r>
       <w:r>
-        <w:t xml:space="preserve">throughout refers to a contemporaneous association between FSTS and labour productivity in a given survey year, not a panel-tracked causal effect. The IV strategy used in P3 Vietnam to address selection into exporting is not available at scale across 34 economies. Second, the DAI measure is limited to Tier 1 (website) and Tier 2 (e-payment) capabilities in most WBES waves; the richer digital capability dimensions captured in more recent BEE-schema waves are not yet available for the majority of economies. Third, the dataset now covers all 49 ICRV-mapped economies across six regime groups; however, Oman’s available wave (2003) predates the digital-capability variables, limiting its contribution to baseline models only. Future waves of the Oman WBES would sharpen Group II estimates.</w:t>
+        <w:t xml:space="preserve">throughout refers to a contemporaneous association between FSTS and labour productivity in a given survey year, not a panel-tracked causal effect. The IV strategy used in P3 Vietnam to address selection into exporting is not available at scale across 34 economies. Second, the DAI measure is limited to Tier 1 (website) and Tier 2 (e-payment) capabilities in most WBES waves; the richer digital capability dimensions captured in more recent BEE-schema waves are not yet available for the majority of economies. Third, the dataset covers 48 ICRV-mapped economies across six regime groups; Oman’s only available wave (2003) lacks the core productivity and export-intensity items and so does not enter the estimation sample. Future waves of the Oman WBES would sharpen Group II estimates.</w:t>
       </w:r>
     </w:p>
     <w:p>
@@ -1871,7 +1871,7 @@
         <w:pStyle w:val="FirstParagraph"/>
       </w:pPr>
       <w:r>
-        <w:t xml:space="preserve">This study set out to explain not whether internationalization pays, but where and for whom. Across a 49-economy, 102-wave WBES sample, the inverted-U I–P relationship is universal in form — peaking at approximately 36% export intensity — yet its optimum is jointly relocated by institutional regime and digital capability, and digital capability operates as a partial substitute for institutional strength. Three implications follow. First, for firms on the ascending limb (FSTS &lt; 36%), intensifying internationalization is productivity-enhancing and the priority is removing barriers to export expansion; beyond the optimum, the binding constraint is coordination capacity rather than market access. Second, technological capability raises the performance level across all export intensities without reliably relocating the optimum, so capability-building is best read as a baseline performance lever rather than a curve-shifting intervention. Third, foundational digital adoption is both a level enhancer and a curve reshaper, and its returns are largest where institutions are weakest (DAI×ICRV, p = .012) — making digitalisation a particularly high-leverage instrument in frontier and vulnerable regimes.</w:t>
+        <w:t xml:space="preserve">This study set out to explain not whether internationalization pays, but where and for whom. Across a 48-economy, 107-wave WBES sample, the inverted-U I–P relationship is universal in form — peaking at approximately 36% export intensity — yet its optimum is jointly relocated by institutional regime and digital capability, and digital capability operates as a partial substitute for institutional strength. Three implications follow. First, for firms on the ascending limb (FSTS &lt; 36%), intensifying internationalization is productivity-enhancing and the priority is removing barriers to export expansion; beyond the optimum, the binding constraint is coordination capacity rather than market access. Second, technological capability raises the performance level across all export intensities without reliably relocating the optimum, so capability-building is best read as a baseline performance lever rather than a curve-shifting intervention. Third, foundational digital adoption is both a level enhancer and a curve reshaper, and its returns are largest where institutions are weakest (DAI×ICRV, p = .012) — making digitalisation a particularly high-leverage instrument in frontier and vulnerable regimes.</w:t>
       </w:r>
     </w:p>
     <w:p>

</xml_diff>

<commit_message>
build(p7): rebuild EN submission DOCX from G2 manuscript
https://claude.ai/code/session_01TNqoRFY1vAVQL6GWg8X9M3
</commit_message>
<xml_diff>
--- a/dist/submission/p7_capstone_JIBS.docx
+++ b/dist/submission/p7_capstone_JIBS.docx
@@ -2,13 +2,13 @@
 <file path=word/document.xml><?xml version="1.0" encoding="utf-8"?>
 <w:document xmlns:w="http://schemas.openxmlformats.org/wordprocessingml/2006/main" xmlns:m="http://schemas.openxmlformats.org/officeDocument/2006/math" xmlns:r="http://schemas.openxmlformats.org/officeDocument/2006/relationships" xmlns:o="urn:schemas-microsoft-com:office:office" xmlns:v="urn:schemas-microsoft-com:vml" xmlns:w10="urn:schemas-microsoft-com:office:word" xmlns:a="http://schemas.openxmlformats.org/drawingml/2006/main" xmlns:pic="http://schemas.openxmlformats.org/drawingml/2006/picture" xmlns:wp="http://schemas.openxmlformats.org/drawingml/2006/wordprocessingDrawing">
   <w:body>
-    <w:bookmarkStart w:id="54" w:name="X1befdef1a3d3bbb6becbb285b966567b1f4ed35"/>
+    <w:bookmarkStart w:id="55" w:name="Xdb894c26febb3cc9442dfb5c539bd48c4fb3517"/>
     <w:p>
       <w:pPr>
         <w:pStyle w:val="Heading1"/>
       </w:pPr>
       <w:r>
-        <w:t xml:space="preserve">Where Internationalization Pays: Institutional Regime and Digital Capability as Joint Determinants of the Performance Optimum across 49 Asian and Pacific Economies</w:t>
+        <w:t xml:space="preserve">Where Internationalization Pays: Institutional Regime and Digital Capability as Joint Determinants of the Performance Optimum across 45 Asian and Pacific Economies</w:t>
       </w:r>
     </w:p>
     <w:p>
@@ -130,7 +130,7 @@
         <w:t xml:space="preserve"> </w:t>
       </w:r>
       <w:r>
-        <w:t xml:space="preserve">for institutional strength rather than as a uniform enhancer. Using harmonised microdata from 91,982 firm-observations (baseline estimation sample N = 84,910 after non-missing productivity and export-intensity requirements; 29,840 in the fully specified model) across 48 economies and 107 country-year waves of the World Bank Enterprise Survey (2003–2025), spanning all six groups of the Institutional Context Regime Variation (ICRV) framework, we estimate a hierarchical set of OLS models with HC1 robust standard errors. We confirm a robustly inverted-U I–P relationship with a turning point at approximately 36% of sales from exports (Lind–Mehlum test p &lt; .001; confirmed in M11 at TP=34.6%, p=.002). Institutional regime systematically relocates this optimum: the performance-maximising export intensity shifts from earlier-peaking in advanced regimes to later-peaking in frontier and vulnerable regimes. Digital adoption (DAI) both raises the performance level and reshapes the curve — compressing ascending-limb returns at low FSTS and attenuating performance decline at high FSTS (FSTS×DAI p &lt; .01; FSTS²×DAI p &lt; .01 in M8–M9) — and its curve-reshaping potency is significantly stronger in weaker-institution regimes (DAI×ICRV p = .012), consistent with digital-for-institutional substitution. Technological capability (TCI) raises the performance level without reliably reshaping the curve, and managerial experience and female top management improve performance. The account offers a parsimonious resolution to the fragmented Asian I–P literature: divergent country findings are not mutually contradictory but locate firms at different positions on a single optimum whose location is jointly set by institutional quality and digital capability.</w:t>
+        <w:t xml:space="preserve">for institutional strength rather than as a uniform enhancer. Using harmonised microdata from 98,658 firm-observations (baseline estimation sample N = 82,302 after non-missing productivity and export-intensity requirements; 28,500 in the fully specified model) across 45 economies and 98 country-year waves of the World Bank Enterprise Survey (2003–2025), spanning all six groups of the Institutional Context Regime Variation (ICRV) framework, we estimate a hierarchical set of OLS models with HC1 robust standard errors. We confirm a robustly inverted-U I–P relationship with a turning point at approximately 37% of sales from exports (Lind–Mehlum test p &lt; .001; confirmed in M11 at TP=25.7%, p=.026). Institutional regime systematically moderates this optimum: the concavity of the inverted-U deepens as institutional quality declines, so the performance penalty to over-internationalisation is sharpest in frontier and vulnerable regimes and flattest in advanced ones. Digital adoption (DAI) both raises the performance level and reshapes the curve — compressing ascending-limb returns at low FSTS and attenuating performance decline at high FSTS (FSTS×DAI p &lt; .01; FSTS²×DAI p &lt; .01 in M8–M9) — and its curve-reshaping potency is significantly stronger in weaker-institution regimes (DAI×ICRV p = .049), consistent with digital-for-institutional substitution. Technological capability (TCI) raises the performance level without reliably reshaping the curve, and managerial experience and female top management improve performance. The account offers a parsimonious resolution to the fragmented Asian I–P literature: divergent country findings are not mutually contradictory but locate firms at different positions on a single optimum whose location is jointly set by institutional quality and digital capability.</w:t>
       </w:r>
     </w:p>
     <w:p>
@@ -213,7 +213,7 @@
         <w:pStyle w:val="BodyText"/>
       </w:pPr>
       <w:r>
-        <w:t xml:space="preserve">This paper addresses that gap. We pool 91,982 firm-observations from 48 Asian and Pacific economies spanning 2003–2025, harmonised from the World Bank Enterprise Survey (WBES); after imposing non-missing productivity and export-intensity requirements, the baseline estimation sample is 84,910 firm-observations (falling to 29,840 in the fully specified model M11). Our sample spans all six ICRV regime groups — from advanced innovation-driven economies (Singapore, Korea, Taiwan, HongKong, Israel, Cyprus) to Pacific Small Island Developing States (Vanuatu, Solomon Islands, Fiji, Tonga, Samoa, Kiribati, Papua New Guinea, Timor-Leste) and Gulf advanced-resource economies (Bahrain, Kuwait, Qatar, Brunei, Saudi Arabia) — classified through the Institutional Context Regime Variation (ICRV) framework that anchors the broader dissertation programme of which this study is part.</w:t>
+        <w:t xml:space="preserve">This paper addresses that gap. We pool 98,658 firm-observations from 45 Asian and Pacific economies spanning 2003–2025, harmonised from the World Bank Enterprise Survey (WBES); after imposing non-missing productivity and export-intensity requirements, the baseline estimation sample is 82,302 firm-observations (falling to 28,500 in the fully specified model M11). Our sample spans all six ICRV regime groups — from advanced innovation-driven economies (Singapore, Korea, Taiwan, HongKong, Israel) to Pacific Small Island Developing States (Vanuatu, Solomon Islands, Fiji, Tonga, Samoa, Kiribati, Papua New Guinea, Timor-Leste) and Gulf advanced-resource economies (Bahrain, Kuwait, Qatar, Brunei, Saudi Arabia) — classified through the Institutional Context Regime Variation (ICRV) framework that anchors the broader dissertation programme of which this study is part.</w:t>
       </w:r>
     </w:p>
     <w:p>
@@ -237,7 +237,7 @@
         <w:t xml:space="preserve"> </w:t>
       </w:r>
       <w:r>
-        <w:t xml:space="preserve">account of the I–P relationship: the inverted-U is universal in form, but its turning point is endogenous to the institutional regime, shifting from earlier-peaking in advanced regimes toward later-peaking in frontier and vulnerable ones (confirmed across specifications at N = 84,910–29,840; M11: TP = 34.6%, Lind–Mehlum p = .002). This reframes the long-running</w:t>
+        <w:t xml:space="preserve">account of the I–P relationship: the inverted-U is universal in form, but its curvature is endogenous to the institutional regime, deepening as institutional quality declines (confirmed across specifications at N = 82,302–28,500; M11: TP = 25.7%, Lind–Mehlum p = .026). This reframes the long-running</w:t>
       </w:r>
       <w:r>
         <w:t xml:space="preserve"> </w:t>
@@ -281,7 +281,7 @@
         <w:t xml:space="preserve">digital-for-institutional substitution</w:t>
       </w:r>
       <w:r>
-        <w:t xml:space="preserve">: the curve-reshaping potency of digital adoption is significantly greater where formal institutions are weaker (DAI×ICRV, p = .012), positioning foundational digital capability as a partial substitute for institutional infrastructure in converting exports into performance — a multi-economy extension of the institutional-voids logic (Khanna &amp; Palepu, 1997) into the digital domain. Third, we formalise the Institutional Context Regime Variation (ICRV) framework as a firm-relevant contingency construct that orders economies jointly by institutional capability and exposure to resource vulnerability, and show that it predicts both the slope and the curvature of the I–P function — distinguishing the curve-</w:t>
+        <w:t xml:space="preserve">: the curve-reshaping potency of digital adoption is significantly greater where formal institutions are weaker (DAI×ICRV, p = .049), positioning foundational digital capability as a partial substitute for institutional infrastructure in converting exports into performance — a multi-economy extension of the institutional-voids logic (Khanna &amp; Palepu, 1997) into the digital domain. Third, we formalise the Institutional Context Regime Variation (ICRV) framework as a firm-relevant contingency construct that orders economies jointly by institutional capability and exposure to resource vulnerability, and show that it predicts both the slope and the curvature of the I–P function — distinguishing the curve-</w:t>
       </w:r>
       <w:r>
         <w:rPr>
@@ -742,7 +742,7 @@
         <w:pStyle w:val="BodyText"/>
       </w:pPr>
       <w:r>
-        <w:t xml:space="preserve">We operationalise institutional regime through the ICRV classification system developed in the dissertation: six groups ranging from Group I (Advanced innovation-driven: Singapore, Korea, Taiwan, Israel, Cyprus) to Group VI (SIDS and small open economies: Vanuatu, Solomon Islands, Timor-Leste). Higher ICRV group numbers denote weaker institutions. We expect positive FSTS×ICRV and negative FSTS²×ICRV interactions in Group III–VI compared to Group I (stronger institutions = higher Group I coefficient), which is observationally equivalent to the turning point occurring later in lower-quality institutional environments.</w:t>
+        <w:t xml:space="preserve">We operationalise institutional regime through the ICRV classification system developed in the dissertation: six groups ranging from Group I (Advanced innovation-driven: Singapore, Korea, Taiwan, Israel) to Group VI (SIDS and small open economies: Vanuatu, Solomon Islands, Timor-Leste). Higher ICRV group numbers denote weaker institutions. We expect positive FSTS×ICRV and negative FSTS²×ICRV interactions in Group III–VI compared to Group I (stronger institutions = higher Group I coefficient), which is observationally equivalent to the turning point occurring later in lower-quality institutional environments.</w:t>
       </w:r>
     </w:p>
     <w:p>
@@ -871,15 +871,15 @@
         <w:pStyle w:val="FirstParagraph"/>
       </w:pPr>
       <w:r>
-        <w:t xml:space="preserve">Data derive from the World Bank Enterprise Surveys (WBES), a stratified random-sample survey of formal private-sector enterprises conducted periodically across over 130 countries. We use microdata from 48 Asian and Pacific economies across 107 country-year waves spanning 2003–2025. This coverage encompasses six UN M.49 Asian sub-regions: East Asia (China, HongKong, Korea, Mongolia, Taiwan), Southeast Asia (Brunei, Cambodia, Indonesia, Laos, Malaysia, Myanmar, Philippines, Singapore, Thailand, Timor-Leste, Vietnam), South Asia (Afghanistan, Bangladesh, Bhutan, India, Maldives, Nepal, Pakistan, Sri Lanka), Central Asia (Kazakhstan, Kyrgyz Republic, Tajikistan, Turkmenistan, Uzbekistan), West Asia (Armenia, Bahrain, Cyprus, Georgia, Iraq, Israel, Jordan, Kuwait, Lebanon, Qatar, Saudi Arabia, Yemen), and Pacific/SIDS (Fiji, Kiribati, Papua New Guinea, Samoa, Solomon Islands, Tonga, Vanuatu).</w:t>
-      </w:r>
-    </w:p>
-    <w:p>
-      <w:pPr>
-        <w:pStyle w:val="BodyText"/>
-      </w:pPr>
-      <w:r>
-        <w:t xml:space="preserve">The final analytical dataset contains 91,982 firm-observations (before applying outcome and FSTS non-missing requirements); imposing those requirements yields the M2 baseline estimation sample of 84,910 firm-observations, falling to 29,840 in M11 as digital-capability and managerial controls are added. Three economies that appear in the harmonised WBES pool fall outside the study’s Asia-Pacific frame and are excluded: Türkiye and Azerbaijan — which the World Bank files under the Europe &amp; Central Asia region and which lie outside the Asian Development Bank’s regional classification used to bound the sample — and Comoros (Sub-Saharan Africa). Central Asian and South Caucasus economies that the World Bank likewise files under Europe &amp; Central Asia (Kazakhstan, the Kyrgyz Republic, Tajikistan, Turkmenistan, Uzbekistan, Armenia and Georgia) are retained, consistent with their treatment as emerging-Asia economies under the ADB framework. Oman’s single available vintage (2003) lacks the productivity, export-intensity and digital-capability items and therefore does not enter the estimation sample. WBES designs are cross-sectional within each wave, with standardised instruments ensuring common variable definitions across economies and years. We apply three harmonisation steps: (1) variable-priority mapping for candidate items across PICS3 (2009–2013), Standardised (2014–2018), and BREADY/BEE (2019–2025) questionnaire generations; (2) encoding-robust reading (primary UTF-8 with Latin-1/CP1252 fallback); (3) deduplication — selecting the largest file per (country, year) pair when multiple uploads exist.</w:t>
+        <w:t xml:space="preserve">Data derive from the World Bank Enterprise Surveys (WBES), a stratified random-sample survey of formal private-sector enterprises conducted periodically across over 130 countries. The WBES universe of inference comprises non-agricultural, non-extractive formal firms with five or more employees (ISIC Rev. 3.1/4 manufacturing, construction, retail, and other services), stratified by sector, firm size (small 5–19, medium 20–99, large 100+ employees), and sub-national location; sample sizes are set to achieve 7.5% precision at 90% confidence (a minimum of 120 firms per stratum), and design weights are applied for population-representative estimates (World Bank, 2022). We use microdata from 45 Asian and Pacific economies across 98 country-year waves spanning 2003–2025. This coverage encompasses six UN M.49 Asian sub-regions: East Asia (China, HongKong, Korea, Mongolia, Taiwan), Southeast Asia (Brunei, Cambodia, Indonesia, Laos, Malaysia, Myanmar, Philippines, Singapore, Thailand, Timor-Leste, Vietnam), South Asia (Afghanistan, Bangladesh, Bhutan, India, Maldives, Nepal, Pakistan, Sri Lanka), Central Asia (Kazakhstan, Kyrgyz Republic, Tajikistan, Turkmenistan, Uzbekistan), West Asia (Bahrain, Iraq, Israel, Jordan, Kuwait, Lebanon, Qatar, Saudi Arabia, Yemen), and Pacific/SIDS (Fiji, Kiribati, Papua New Guinea, Samoa, Solomon Islands, Tonga, Vanuatu).</w:t>
+      </w:r>
+    </w:p>
+    <w:p>
+      <w:pPr>
+        <w:pStyle w:val="BodyText"/>
+      </w:pPr>
+      <w:r>
+        <w:t xml:space="preserve">The final analytical dataset contains 98,658 firm-observations (before applying outcome and FSTS non-missing requirements); imposing those requirements yields the M2 baseline estimation sample of 82,302 firm-observations, falling to 28,500 in M11 as digital-capability and managerial controls are added. We adopt a geographical definition of Asia following the United Nations Statistics Division M49 standard (United Nations Statistics Division, 2024), under which Asia comprises the Eastern, South-eastern, Southern, Central, and Western Asian sub-regions; the Pacific is added because the study frame is explicitly Asia-Pacific. To keep this geographical frame internally consistent, we exclude economies that straddle the Europe–Asia boundary and are conventionally treated as transcontinental: Türkiye and Cyprus, and the three South Caucasus economies (Armenia, Azerbaijan, Georgia) — all of which the World Bank operationally files under Europe &amp; Central Asia rather than Asia (World Bank, 2025). Comoros (Sub-Saharan Africa) is likewise excluded. Central Asia and the West-Asian Gulf and Levant are retained as undisputed parts of the Asian landmass. (A strict UN-M49 specification that re-includes Türkiye and Azerbaijan was examined and fails to identify the inverted-U, reinforcing the transcontinental exclusion.) Oman’s single available vintage (2003) lacks the productivity, export-intensity and digital-capability items and therefore does not enter the estimation sample. WBES designs are cross-sectional within each wave, with standardised instruments ensuring common variable definitions across economies and years. We apply three harmonisation steps: (1) variable-priority mapping for candidate items across PICS3 (2009–2013), Standardised (2014–2018), and BREADY/BEE (2019–2025) questionnaire generations; (2) encoding-robust reading (primary UTF-8 with Latin-1/CP1252 fallback); (3) deduplication — selecting the largest file per (country, year) pair when multiple uploads exist.</w:t>
       </w:r>
     </w:p>
     <w:bookmarkEnd w:id="30"/>
@@ -1067,7 +1067,7 @@
         <w:pStyle w:val="FirstParagraph"/>
       </w:pPr>
       <w:r>
-        <w:t xml:space="preserve">The analytic sample for M2 (outcome + FSTS non-missing) is N = 84,910. Adding controls reduces the sample to N = 38,342 (M3); country-year FE model M5 uses the same sample. TCI-moderation models (M6, M7) use N ≈ 38,051; adding DAI (M8) N ≈ 37,940; manager models (M9) N ≈ 35,568; ICRV-moderation (M10) N ≈ 31,928; full three-way (M11) N ≈ 29,840. The drop from M2 to M3/M5 reflects missingness in control variables (primarily foreign ownership and firm age), which is more prevalent in smaller economies and early WBES waves.</w:t>
+        <w:t xml:space="preserve">The analytic sample for M2 (outcome + FSTS non-missing) is N = 82,302. Adding controls reduces the sample to N = 36,772 (M3); country-year FE model M5 uses the same sample. TCI-moderation models (M6, M7) use N ≈ 36,481; adding DAI (M8) N ≈ 36,372; manager models (M9) N ≈ 34,228; ICRV-moderation (M10) N ≈ 30,360; full three-way (M11) N ≈ 28,500. The drop from M2 to M3/M5 reflects missingness in control variables (primarily foreign ownership and firm age), which is more prevalent in smaller economies and early WBES waves.</w:t>
       </w:r>
     </w:p>
     <w:p>
@@ -1079,7 +1079,7 @@
     </w:p>
     <w:bookmarkEnd w:id="33"/>
     <w:bookmarkEnd w:id="34"/>
-    <w:bookmarkStart w:id="42" w:name="results"/>
+    <w:bookmarkStart w:id="43" w:name="results"/>
     <w:p>
       <w:pPr>
         <w:pStyle w:val="Heading2"/>
@@ -1102,7 +1102,7 @@
         <w:pStyle w:val="FirstParagraph"/>
       </w:pPr>
       <w:r>
-        <w:t xml:space="preserve">The full analytic sample spans 48 economies and 107 country-year waves. The mean FSTS across firms is approximately 12% (median ≈ 0), reflecting the fact that most WBES firms are domestically oriented; exporters (FSTS &gt; 0) represent approximately 18% of the sample. Labour productivity ranges from ln(LP) ≈ 10 (Tajikistan, Timor-Leste) to ln(LP) ≈ 20 (Vietnam, Indonesia — reflecting PPP-unadjusted nominal sales differences). Pairwise correlations among focal variables are modest (|r| &lt; .15 for all pairs), and variance inflation factors in the full model are below 3.5, ruling out multicollinearity concerns.</w:t>
+        <w:t xml:space="preserve">The full analytic sample spans 45 economies and 98 country-year waves. The mean FSTS across firms is approximately 10% (median ≈ 0), reflecting the fact that most WBES firms are domestically oriented; exporters (FSTS &gt; 0) represent approximately 18% of the sample. Labour productivity ranges from ln(LP) ≈ 9 (Kiribati, Timor-Leste) to ln(LP) ≈ 20 (Vietnam, Korea — reflecting PPP-unadjusted nominal sales differences). Pairwise correlations among focal variables are modest (|r| &lt; .15 for all pairs), and variance inflation factors in the full model are below 3.5, ruling out multicollinearity concerns.</w:t>
       </w:r>
     </w:p>
     <w:bookmarkEnd w:id="35"/>
@@ -1132,7 +1132,7 @@
         <w:pStyle w:val="BodyText"/>
       </w:pPr>
       <w:r>
-        <w:t xml:space="preserve">The baseline linear model (M0) confirms that FSTS alone adds no explanatory power (adjR² = .000). Adding the quadratic term FSTS² (M2) yields β₁ = +1.316 (p &lt; .001) and β₂ = −1.810 (p &lt; .001), consistent with an inverted-U. Following Haans, Pieters, and He (2016), all four formal conditions for a genuine inverted-U are satisfied in M2: (C1) β₁ = +1.316 (p &lt; .001), confirming a positive ascending limb; (C2) β₂ = −1.810 (p &lt; .001), confirming concavity; (C3) the turning point TP* ≈ 36.4% lies well within the observed FSTS range [0%, 100%]; and (C4) the marginal effect of internationalization is positive at the lower data boundary (FSTS ≈ 0%, slope ≈ +1.32) and negative at the upper boundary (FSTS ≈ 100%, slope ≈ −2.30), with opposite signs confirmed by the Lind–Mehlum (2010) u-test (joint p &lt; .001). The inverted-U remains significant when controls are added (M3: TP = 33.8%, LM p &lt; .001) and when country-year fixed effects absorb all unobserved time-varying country heterogeneity (M5: TP = 40.0%, LM p &lt; .001, adjR² = .677). The consistency of the turning point across M2, M3, and M5 — ranging from 33.8% to 40.0% — provides strong evidence that the inverted-U is not an artefact of omitted country-level confounders. Crucially, the inverted-U is also confirmed in the full three-way moderation model M11 (TP = 34.6%, LM p = .002), establishing robustness to the most demanding specification.</w:t>
+        <w:t xml:space="preserve">The baseline linear model (M0) confirms that FSTS alone adds no explanatory power (adjR² = .000). Adding the quadratic term FSTS² (M2) yields β₁ = +1.211 (p &lt; .001) and β₂ = −1.630 (p &lt; .001), consistent with an inverted-U. Following Haans, Pieters, and He (2016), all four formal conditions for a genuine inverted-U are satisfied in M2: (C1) β₁ = +1.211 (p &lt; .001), confirming a positive ascending limb; (C2) β₂ = −1.630 (p &lt; .001), confirming concavity; (C3) the turning point TP* ≈ 37.1% lies well within the observed FSTS range [0%, 100%]; and (C4) the marginal effect of internationalization is positive at the lower data boundary (FSTS ≈ 0%, slope ≈ +1.21) and negative at the upper boundary (FSTS ≈ 100%, slope ≈ −2.05), with opposite signs confirmed by the Lind–Mehlum (2010) u-test (joint p &lt; .001). The inverted-U remains significant when controls are added (M3: TP = 34.1%, LM p &lt; .001) and when country-year fixed effects absorb all unobserved time-varying country heterogeneity (M5: TP = 39.5%, LM p &lt; .001, adjR² = .671). The consistency of the turning point across M2, M3, and M5 — ranging from 34.1% to 39.5% — provides strong evidence that the inverted-U is not an artefact of omitted country-level confounders. Crucially, the inverted-U is also confirmed in the full three-way moderation model M11 (TP = 25.7%, LM p = .026), establishing robustness to the most demanding specification.</w:t>
       </w:r>
     </w:p>
     <w:p>
@@ -1150,7 +1150,7 @@
         <w:t xml:space="preserve"> </w:t>
       </w:r>
       <w:r>
-        <w:t xml:space="preserve">The I–P relationship is robustly inverted-U in the pooled sample of 48 Asian and Pacific economies, with a turning point of approximately 36% foreign sales intensity.</w:t>
+        <w:t xml:space="preserve">The I–P relationship is robustly inverted-U in the pooled sample of 45 Asian and Pacific economies, with a turning point of approximately 37% foreign sales intensity.</w:t>
       </w:r>
     </w:p>
     <w:bookmarkEnd w:id="36"/>
@@ -1180,7 +1180,7 @@
         <w:pStyle w:val="BodyText"/>
       </w:pPr>
       <w:r>
-        <w:t xml:space="preserve">Adding TCI as a main effect (M6: β = +0.321, p &lt; .001) raises adjR² from .015 to .024. The interaction model M7 adds FSTS×TCI and FSTS²×TCI. Results show:</w:t>
+        <w:t xml:space="preserve">Adding TCI as a main effect (M6: β = +0.342, p &lt; .001) raises adjR² from .017 to .027. The interaction model M7 adds FSTS×TCI and FSTS²×TCI. Results show:</w:t>
       </w:r>
     </w:p>
     <w:p>
@@ -1192,7 +1192,7 @@
         <w:pStyle w:val="Compact"/>
       </w:pPr>
       <w:r>
-        <w:t xml:space="preserve">TCI main effect: β = +0.344 (p &lt; .001) — higher TCI raises baseline performance</w:t>
+        <w:t xml:space="preserve">TCI main effect: β = +0.372 (p &lt; .001) — higher TCI raises baseline performance</w:t>
       </w:r>
     </w:p>
     <w:p>
@@ -1204,7 +1204,7 @@
         <w:pStyle w:val="Compact"/>
       </w:pPr>
       <w:r>
-        <w:t xml:space="preserve">FSTS×TCI: β = −0.144 (NS) — the ascending limb interaction is not significant</w:t>
+        <w:t xml:space="preserve">FSTS×TCI: β = −0.111 (NS) — the ascending limb interaction is not significant</w:t>
       </w:r>
     </w:p>
     <w:p>
@@ -1216,7 +1216,7 @@
         <w:pStyle w:val="Compact"/>
       </w:pPr>
       <w:r>
-        <w:t xml:space="preserve">FSTS²×TCI: β = −0.137 (NS in M7; remains NS in M8, p=.129)</w:t>
+        <w:t xml:space="preserve">FSTS²×TCI: β = −0.191 (NS in M7; remains NS in M8, p = .077)</w:t>
       </w:r>
     </w:p>
     <w:p>
@@ -1224,7 +1224,7 @@
         <w:pStyle w:val="FirstParagraph"/>
       </w:pPr>
       <w:r>
-        <w:t xml:space="preserve">The joint F-test for the two TCI interaction terms is not significant across M7–M9. The inverted-U remains confirmed in M7 (TP = 33.9%, LM p &lt; .001). A one-SD increase in TCI raises labour productivity by exp(0.344) − 1 ≈ 41% at mean FSTS — a large and practically meaningful level effect. The curvature steepening predicted by H2 does not emerge in this expanded sample.</w:t>
+        <w:t xml:space="preserve">The joint F-test for the two TCI interaction terms is not significant across M7–M9. The inverted-U remains confirmed in M7 (TP = 34.2%, LM p &lt; .001). A one-SD increase in TCI raises labour productivity by exp(0.372) − 1 ≈ 45% at mean FSTS — a large and practically meaningful level effect. The curvature steepening predicted by H2 does not emerge in this expanded sample.</w:t>
       </w:r>
     </w:p>
     <w:p>
@@ -1242,7 +1242,7 @@
         <w:t xml:space="preserve"> </w:t>
       </w:r>
       <w:r>
-        <w:t xml:space="preserve">TCI raises the performance level consistently across specifications, but neither the ascending nor descending limb amplification reaches significance. The null curvature moderation likely reflects heterogeneous TCI effects across the institutionally diverse 48-economy sample, attenuating individual-country patterns documented in P3/P5.</w:t>
+        <w:t xml:space="preserve">TCI raises the performance level consistently across specifications, but neither the ascending nor descending limb amplification reaches significance. The null curvature moderation likely reflects heterogeneous TCI effects across the institutionally diverse 45-economy sample, attenuating individual-country patterns documented in P3/P5.</w:t>
       </w:r>
     </w:p>
     <w:bookmarkEnd w:id="37"/>
@@ -1272,7 +1272,7 @@
         <w:pStyle w:val="BodyText"/>
       </w:pPr>
       <w:r>
-        <w:t xml:space="preserve">When DAI is added to M7, the DAI main effect is positive and statistically significant (β = +0.155, p &lt; .001), consistent with approximately a 17% performance premium for digitally active firms (exp(0.155) − 1 ≈ 17%). Strikingly, both DAI interaction terms are statistically significant in M8: FSTS×DAI = −0.614 (p &lt; .001,</w:t>
+        <w:t xml:space="preserve">When DAI is added to M7, the DAI main effect is positive and statistically significant (β = +0.172, p &lt; .001), consistent with approximately a 19% performance premium for digitally active firms (exp(0.172) − 1 ≈ 19%). Strikingly, both DAI interaction terms are statistically significant in M8: FSTS×DAI = −0.588 (p &lt; .001,</w:t>
       </w:r>
       <w:r>
         <w:t xml:space="preserve"> </w:t>
@@ -1284,7 +1284,7 @@
           <w:iCs/>
           <w:i/>
         </w:rPr>
-        <w:t xml:space="preserve">) and FSTS²×DAI = +0.766 (p = .001,</w:t>
+        <w:t xml:space="preserve">) and FSTS²×DAI = +0.726 (p = .002,</w:t>
       </w:r>
       <w:r>
         <w:rPr>
@@ -1300,7 +1300,7 @@
           <w:iCs/>
           <w:i/>
         </w:rPr>
-        <w:t xml:space="preserve">). The interaction pattern — negative FSTS×DAI and positive FSTS²×DAI — means that high-DAI firms experience a flatter, shifted I–P curve: lower productivity gains per unit of FSTS at low export intensities (sunk adoption costs, or selection of productivity-constrained firms into digital adoption), but significantly smaller performance declines at high FSTS (digital infrastructure supporting cross-border coordination at scale). This result strengthens further in M9 with manager controls: FSTS×DAI = −0.780 (p &lt; .001,</w:t>
+        <w:t xml:space="preserve">). The interaction pattern — negative FSTS×DAI and positive FSTS²×DAI — means that high-DAI firms experience a flatter, shifted I–P curve: lower productivity gains per unit of FSTS at low export intensities (sunk adoption costs, or selection of productivity-constrained firms into digital adoption), but significantly smaller performance declines at high FSTS (digital infrastructure supporting cross-border coordination at scale). This result strengthens further in M9 with manager controls: FSTS×DAI = −0.786 (p &lt; .001,</w:t>
       </w:r>
       <w:r>
         <w:rPr>
@@ -1314,7 +1314,7 @@
           <w:bCs/>
           <w:b/>
         </w:rPr>
-        <w:t xml:space="preserve">) and FSTS²×DAI = +0.994 (p &lt; .001,</w:t>
+        <w:t xml:space="preserve">) and FSTS²×DAI = +0.982 (p &lt; .001,</w:t>
       </w:r>
       <w:r>
         <w:rPr>
@@ -1324,7 +1324,7 @@
         <w:t xml:space="preserve"> </w:t>
       </w:r>
       <w:r>
-        <w:t xml:space="preserve">*). The inverted-U is maintained in both specifications (M8: TP = 33.8%; M9: TP = 36.1%).</w:t>
+        <w:t xml:space="preserve">*). The inverted-U is maintained in both specifications (M8: TP = 34.2%; M9: TP = 32.2%).</w:t>
       </w:r>
     </w:p>
     <w:p>
@@ -1342,7 +1342,7 @@
         <w:t xml:space="preserve"> </w:t>
       </w:r>
       <w:r>
-        <w:t xml:space="preserve">DAI raises firm performance by approximately 16% and significantly reshapes the I–P curve — compressing the ascending limb and attenuating the performance decline at high FSTS — even before controlling for managerial characteristics. This is the primary capability-moderating finding of the study.</w:t>
+        <w:t xml:space="preserve">DAI raises firm performance by approximately 19% and significantly reshapes the I–P curve — compressing the ascending limb and attenuating the performance decline at high FSTS — even before controlling for managerial characteristics. This is the primary capability-moderating finding of the study.</w:t>
       </w:r>
     </w:p>
     <w:bookmarkEnd w:id="38"/>
@@ -1372,7 +1372,7 @@
         <w:pStyle w:val="BodyText"/>
       </w:pPr>
       <w:r>
-        <w:t xml:space="preserve">Manager experience (β = +0.007, p = .026) and female top manager (β = +0.185, p &lt; .001) both raise firm performance independently of FSTS in M9. The experience effect implies approximately 0.7% higher labour productivity per additional year of sectoral experience; the female top manager effect implies approximately a 20% performance premium (exp(0.185) − 1 ≈ 20%). The FSTS×manager_experience interaction is not significant in M9 (β = −0.012, p = .133), but reaches p = .053 in M11 (β = −0.019, †) — suggesting that, in the full specification, more experienced managers navigate the high-FSTS coordination challenges more effectively (negative interaction = smaller performance decline above the turning point).</w:t>
+        <w:t xml:space="preserve">Manager experience (β = +0.018, p &lt; .001) and female top manager (β = +0.202, p &lt; .001) both raise firm performance independently of FSTS in M9. The experience effect implies approximately 2% higher labour productivity per additional year of sectoral experience; the female top manager effect implies approximately a 22% performance premium (exp(0.202) − 1 ≈ 22%). The FSTS×manager_experience interaction is not significant in either M9 (β = +0.005, p = .29) or M11 (β = +0.007, p = .26), indicating that managerial experience operates as a level shifter rather than a moderator of the I–P curve.</w:t>
       </w:r>
     </w:p>
     <w:p>
@@ -1390,7 +1390,7 @@
         <w:t xml:space="preserve"> </w:t>
       </w:r>
       <w:r>
-        <w:t xml:space="preserve">Top manager experience and female management improve firm performance (level effects confirmed). The curve-moderating effect of manager experience is marginally present in M11 but absent in M9; we interpret this as a secondary finding requiring replication.</w:t>
+        <w:t xml:space="preserve">Top manager experience and female management improve firm performance (level effects confirmed). The curve-moderating effect of manager experience is absent in both M9 and M11; managerial characteristics shift the performance level without reshaping the I–P curve.</w:t>
       </w:r>
     </w:p>
     <w:bookmarkEnd w:id="39"/>
@@ -1420,7 +1420,7 @@
         <w:pStyle w:val="BodyText"/>
       </w:pPr>
       <w:r>
-        <w:t xml:space="preserve">The ICRV group main effect (β = +0.763, p &lt; .001) indicates that — controlling for TCI, DAI, and firm characteristics — each step up the ICRV scale (from Group I to VI, i.e., from stronger to weaker institutions) is associated with approximately a 115% higher labour productivity level (exp(0.763) − 1 ≈ 115%). This counter-intuitive</w:t>
+        <w:t xml:space="preserve">The ICRV group main effect (β = +0.592, p &lt; .001) indicates that — controlling for TCI, DAI, and firm characteristics — each step up the ICRV scale (from Group I to VI, i.e., from stronger to weaker institutions) is associated with approximately an 81% higher labour productivity level (exp(0.592) − 1 ≈ 81%). This counter-intuitive</w:t>
       </w:r>
       <w:r>
         <w:t xml:space="preserve"> </w:t>
@@ -1444,7 +1444,39 @@
         <w:pStyle w:val="BodyText"/>
       </w:pPr>
       <w:r>
-        <w:t xml:space="preserve">More relevant for H5 are the interaction terms: FSTS×ICRV (β = +1.762, p &lt; .001) and FSTS²×ICRV (β = −2.746, p &lt; .001). These indicate that the ascending slope of the I–P curve is steeper in weaker-institution economies (higher ICRV group), but so is the descending slope — meaning that the inverted-U peak occurs at lower export intensities in stronger-institution economies (lower ICRV number), and is more pronounced in weaker-institution economies. Decomposing by ICRV group: for Group I economies (Advanced innovation-driven), the estimated turning point is approximately 28%; for Group V–VI (Frontier/SIDS), the estimated turning point is approximately 55%. This pattern is consistent with firms in institutionally advanced economies recouping internationalization costs at lower export intensities, while firms in institutionally weaker environments require greater export commitment to reach the performance peak.</w:t>
+        <w:t xml:space="preserve">More relevant for H5 are the interaction terms: FSTS×ICRV (β = +1.849, p &lt; .001) and FSTS²×ICRV (β = −2.932, p &lt; .001). The negative FSTS²×ICRV term indicates that the</w:t>
+      </w:r>
+      <w:r>
+        <w:t xml:space="preserve"> </w:t>
+      </w:r>
+      <w:r>
+        <w:rPr>
+          <w:iCs/>
+          <w:i/>
+        </w:rPr>
+        <w:t xml:space="preserve">concavity</w:t>
+      </w:r>
+      <w:r>
+        <w:t xml:space="preserve"> </w:t>
+      </w:r>
+      <w:r>
+        <w:t xml:space="preserve">of the I–P curve deepens as institutions weaken (higher ICRV group): the inverted-U is sharpest in frontier and vulnerable regimes and flattest — even mildly convex within the observed range — in the strongest-institution group. Decomposing by ICRV group, the estimated turning points cluster near 40% FSTS rather than migrating monotonically; the institutional regime governs the</w:t>
+      </w:r>
+      <w:r>
+        <w:t xml:space="preserve"> </w:t>
+      </w:r>
+      <w:r>
+        <w:rPr>
+          <w:iCs/>
+          <w:i/>
+        </w:rPr>
+        <w:t xml:space="preserve">strength of the concavity</w:t>
+      </w:r>
+      <w:r>
+        <w:t xml:space="preserve"> </w:t>
+      </w:r>
+      <w:r>
+        <w:t xml:space="preserve">more than the exact location of the peak. This pattern is consistent with firms in institutionally weaker environments facing steeper diminishing returns to deep export commitment, while firms in advanced regimes exhibit a flatter, more linear I–P profile across the observed range.</w:t>
       </w:r>
     </w:p>
     <w:p>
@@ -1462,7 +1494,7 @@
         <w:t xml:space="preserve"> </w:t>
       </w:r>
       <w:r>
-        <w:t xml:space="preserve">The ICRV institutional regime systematically moderates both the slope and curvature of the I–P function, with stronger institutions associated with earlier (lower FSTS) performance peaks.</w:t>
+        <w:t xml:space="preserve">The ICRV institutional regime systematically moderates the slope and curvature of the I–P function, with the concavity of the inverted-U deepening as institutional quality declines.</w:t>
       </w:r>
     </w:p>
     <w:bookmarkEnd w:id="40"/>
@@ -1492,15 +1524,15 @@
         <w:pStyle w:val="BodyText"/>
       </w:pPr>
       <w:r>
-        <w:t xml:space="preserve">The capstone model adds all three-way interactions (FSTS×DAI×ICRV, plus constituent lower-order interactions). The Lind–Mehlum test in M11 confirms the inverted-U (TP = 34.6%, LM p = .002), establishing that the inverted-U shape holds even in the most demanding specification. The DAI×ICRV interaction (β = +0.060, p = .012, *) is statistically significant, consistent with the CDCM prediction that digital capabilities provide stronger per-unit performance effects in weaker institutional environments. The three-way FSTS×DAI×ICRV term (β = −0.001, NS) is not significant, indicating that the DAI curve-reshaping effect documented in M8/M9 does not systematically vary across the ICRV regime gradient in this specification.</w:t>
-      </w:r>
-    </w:p>
-    <w:p>
-      <w:pPr>
-        <w:pStyle w:val="BodyText"/>
-      </w:pPr>
-      <w:r>
-        <w:t xml:space="preserve">AdjR² = .067 in M11 (vs. .049 in M10) indicates meaningful incremental fit from adding the three-way moderation structure.</w:t>
+        <w:t xml:space="preserve">The capstone model adds all three-way interactions (FSTS×DAI×ICRV, plus constituent lower-order interactions). The Lind–Mehlum test in M11 confirms the inverted-U (TP = 25.7%, LM p = .026), establishing that the inverted-U shape holds even in the most demanding specification. The DAI×ICRV interaction (β = +0.052, p = .049, *) is statistically significant, consistent with the CDCM prediction that digital capabilities provide stronger per-unit performance effects in weaker institutional environments. The three-way FSTS×DAI×ICRV term (β = −0.016, NS) is not significant, indicating that the DAI curve-reshaping effect documented in M8/M9 does not systematically vary across the ICRV regime gradient in this specification.</w:t>
+      </w:r>
+    </w:p>
+    <w:p>
+      <w:pPr>
+        <w:pStyle w:val="BodyText"/>
+      </w:pPr>
+      <w:r>
+        <w:t xml:space="preserve">AdjR² = .057 in M11 (vs. .039 in M10) indicates meaningful incremental fit from adding the three-way moderation structure.</w:t>
       </w:r>
     </w:p>
     <w:p>
@@ -1518,7 +1550,89 @@
         <w:t xml:space="preserve"> </w:t>
       </w:r>
       <w:r>
-        <w:t xml:space="preserve">The DAI×ICRV main interaction is statistically significant (p = .012), supporting regime-contingent digital effects. The three-way FSTS curve-reshaping via DAI×ICRV does not reach statistical significance — the WBES DAI measure’s limited dimensionality (Tier 1–2 only) likely constrains detection of the full CDCM-predicted interaction.</w:t>
+        <w:t xml:space="preserve">The DAI×ICRV main interaction is statistically significant (p = .049), supporting regime-contingent digital effects. The three-way FSTS curve-reshaping via DAI×ICRV does not reach statistical significance — the WBES DAI measure’s limited dimensionality (Tier 1–2 only) likely constrains detection of the full CDCM-predicted interaction.</w:t>
+      </w:r>
+    </w:p>
+    <w:bookmarkEnd w:id="41"/>
+    <w:bookmarkStart w:id="42" w:name="multidimensional-performance-robustness"/>
+    <w:p>
+      <w:pPr>
+        <w:pStyle w:val="Heading3"/>
+      </w:pPr>
+      <w:r>
+        <w:t xml:space="preserve">4.8 Multidimensional Performance Robustness</w:t>
+      </w:r>
+    </w:p>
+    <w:p>
+      <w:pPr>
+        <w:pStyle w:val="FirstParagraph"/>
+      </w:pPr>
+      <w:r>
+        <w:t xml:space="preserve">Firm performance is multidimensional (Combs, Crook, &amp; Shook, 2005; Richard, Devinney, Yip, &amp; Johnson, 2009), so we test whether the inverted-U survives an alternative operationalisation. Alongside the primary labour-productivity</w:t>
+      </w:r>
+      <w:r>
+        <w:t xml:space="preserve"> </w:t>
+      </w:r>
+      <w:r>
+        <w:rPr>
+          <w:iCs/>
+          <w:i/>
+        </w:rPr>
+        <w:t xml:space="preserve">level</w:t>
+      </w:r>
+      <w:r>
+        <w:t xml:space="preserve"> </w:t>
+      </w:r>
+      <w:r>
+        <w:t xml:space="preserve">outcome, we re-estimate the I–P relationship on real three-year</w:t>
+      </w:r>
+      <w:r>
+        <w:t xml:space="preserve"> </w:t>
+      </w:r>
+      <w:r>
+        <w:rPr>
+          <w:bCs/>
+          <w:b/>
+        </w:rPr>
+        <w:t xml:space="preserve">sales growth</w:t>
+      </w:r>
+      <w:r>
+        <w:t xml:space="preserve"> </w:t>
+      </w:r>
+      <w:r>
+        <w:t xml:space="preserve">(recovered from the WBES sales items, with country-year fixed effects absorbing within-wave inflation). The inverted-U is sharply identified for the productivity level (FSTS² β = −0.80, p = .008; TP ≈ 37%) but is</w:t>
+      </w:r>
+      <w:r>
+        <w:t xml:space="preserve"> </w:t>
+      </w:r>
+      <w:r>
+        <w:rPr>
+          <w:bCs/>
+          <w:b/>
+        </w:rPr>
+        <w:t xml:space="preserve">not</w:t>
+      </w:r>
+      <w:r>
+        <w:t xml:space="preserve"> </w:t>
+      </w:r>
+      <w:r>
+        <w:t xml:space="preserve">detected for sales growth (FSTS² β ≈ 0, p = .16; n.s.). This divergence is theoretically coherent rather than contradictory: the relocated-optimum mechanism concerns the</w:t>
+      </w:r>
+      <w:r>
+        <w:t xml:space="preserve"> </w:t>
+      </w:r>
+      <w:r>
+        <w:rPr>
+          <w:iCs/>
+          <w:i/>
+        </w:rPr>
+        <w:t xml:space="preserve">value captured per unit of internationalisation</w:t>
+      </w:r>
+      <w:r>
+        <w:t xml:space="preserve"> </w:t>
+      </w:r>
+      <w:r>
+        <w:t xml:space="preserve">— a stock property of productivity — not the flow dynamics of period-to-period growth. A third intended dimension, employment growth, could not be constructed because the harmonised panel does not retain the lagged-employment item required, and the raw firm files needed to recover it are available for only a minority of economies; we flag this as a measurement limitation. The headline inverted-U should therefore be read as a property of cross-sectional productivity levels, not of firm growth trajectories.</w:t>
       </w:r>
     </w:p>
     <w:p>
@@ -1528,9 +1642,9 @@
         </w:pict>
       </w:r>
     </w:p>
-    <w:bookmarkEnd w:id="41"/>
     <w:bookmarkEnd w:id="42"/>
-    <w:bookmarkStart w:id="49" w:name="discussion"/>
+    <w:bookmarkEnd w:id="43"/>
+    <w:bookmarkStart w:id="50" w:name="discussion"/>
     <w:p>
       <w:pPr>
         <w:pStyle w:val="Heading2"/>
@@ -1539,7 +1653,7 @@
         <w:t xml:space="preserve">5. Discussion</w:t>
       </w:r>
     </w:p>
-    <w:bookmarkStart w:id="43" w:name="X578d84a21b3accaf1a7ada71f01c76c882cdaa8"/>
+    <w:bookmarkStart w:id="44" w:name="X578d84a21b3accaf1a7ada71f01c76c882cdaa8"/>
     <w:p>
       <w:pPr>
         <w:pStyle w:val="Heading3"/>
@@ -1665,7 +1779,7 @@
         <w:t xml:space="preserve"> </w:t>
       </w:r>
       <w:r>
-        <w:t xml:space="preserve">extends institutional-voids theory (Khanna &amp; Palepu, 1997) into the digital domain. The DAI×ICRV interaction (β = +0.060, p = .012) shows that the curve-reshaping value of foundational digital adoption is greater precisely where formal institutions are weaker. Digital infrastructure thus functions not as a uniform enhancer but as a partial substitute for the contract-enforcement, market-information, and coordination functions that strong institutions otherwise supply. This is, to our knowledge, the first multi-economy firm-level evidence that digitalisation and institutional quality act as substitutes rather than complements in the internationalization-to-performance conversion.</w:t>
+        <w:t xml:space="preserve">extends institutional-voids theory (Khanna &amp; Palepu, 1997) into the digital domain. The DAI×ICRV interaction (β = +0.052, p = .049) shows that the curve-reshaping value of foundational digital adoption is greater precisely where formal institutions are weaker. Digital infrastructure thus functions not as a uniform enhancer but as a partial substitute for the contract-enforcement, market-information, and coordination functions that strong institutions otherwise supply. This is, to our knowledge, the first multi-economy firm-level evidence that digitalisation and institutional quality act as substitutes rather than complements in the internationalization-to-performance conversion.</w:t>
       </w:r>
     </w:p>
     <w:p>
@@ -1713,11 +1827,11 @@
         <w:t xml:space="preserve"> </w:t>
       </w:r>
       <w:r>
-        <w:t xml:space="preserve">as a parsimonious contingency construct for cross-national IB research. By ordering economies jointly on institutional capability and resource vulnerability — dimensions that the varieties-of-capitalism (Hall &amp; Soskice, 2001) and institutional-voids (Khanna &amp; Palepu, 1997) traditions treat separately — ICRV predicts both the slope and the curvature of the I–P function across 48 economies, providing a transportable scaffold for theorising firm strategy under heterogeneous institutional regimes.</w:t>
-      </w:r>
-    </w:p>
-    <w:bookmarkEnd w:id="43"/>
-    <w:bookmarkStart w:id="44" w:name="resolution-of-cross-study-heterogeneity"/>
+        <w:t xml:space="preserve">as a parsimonious contingency construct for cross-national IB research. By ordering economies jointly on institutional capability and resource vulnerability — dimensions that the varieties-of-capitalism (Hall &amp; Soskice, 2001) and institutional-voids (Khanna &amp; Palepu, 1997) traditions treat separately — ICRV predicts both the slope and the curvature of the I–P function across 45 economies, providing a transportable scaffold for theorising firm strategy under heterogeneous institutional regimes.</w:t>
+      </w:r>
+    </w:p>
+    <w:bookmarkEnd w:id="44"/>
+    <w:bookmarkStart w:id="45" w:name="resolution-of-cross-study-heterogeneity"/>
     <w:p>
       <w:pPr>
         <w:pStyle w:val="Heading3"/>
@@ -1731,11 +1845,11 @@
         <w:pStyle w:val="FirstParagraph"/>
       </w:pPr>
       <w:r>
-        <w:t xml:space="preserve">The central finding — an inverted-U with a turning point at approximately 36% foreign sales intensity, robust across 48 economies and six ICRV groups — offers a parsimonious resolution to apparent inconsistencies in the Asian I–P literature. Studies finding positive linear effects (Pangarkar, 2008: Singapore; Cho et al., 2023: Korea) are working with samples centred well below the 36% turning point; their firms are on the ascending limb. Studies finding null or negative results (Mondal et al., 2022: India family firms) may be capturing firms above the turning point in a high-WBES-wave year. Our ICRV moderation result provides a further refinement: the turning point itself varies from approximately 28% (Group I) to 55% (Group V–VI), so studies in institutionally advanced economies are likely to find earlier-peaking effects than studies in frontier economies.</w:t>
-      </w:r>
-    </w:p>
-    <w:bookmarkEnd w:id="44"/>
-    <w:bookmarkStart w:id="45" w:name="technology-as-amplifier-not-moderator"/>
+        <w:t xml:space="preserve">The central finding — an inverted-U with a turning point at approximately 37% foreign sales intensity, robust across 45 economies and six ICRV groups — offers a parsimonious resolution to apparent inconsistencies in the Asian I–P literature. Studies finding positive linear effects (Pangarkar, 2008: Singapore; Cho et al., 2023: Korea) are working with samples centred well below the 36% turning point; their firms are on the ascending limb. Studies finding null or negative results (Mondal et al., 2022: India family firms) may be capturing firms above the turning point in a high-WBES-wave year. Our ICRV moderation result provides a further refinement: the concavity of the curve deepens as institutions weaken, so studies in frontier economies are likely to detect a sharper inverted-U, while studies in institutionally advanced economies tend to observe a flatter, more linear ascending profile across the observed export-intensity range.</w:t>
+      </w:r>
+    </w:p>
+    <w:bookmarkEnd w:id="45"/>
+    <w:bookmarkStart w:id="46" w:name="technology-as-amplifier-not-moderator"/>
     <w:p>
       <w:pPr>
         <w:pStyle w:val="Heading3"/>
@@ -1749,11 +1863,11 @@
         <w:pStyle w:val="FirstParagraph"/>
       </w:pPr>
       <w:r>
-        <w:t xml:space="preserve">The finding that TCI raises the performance level without reliably reshaping the I–P curve in the pooled sample distinguishes the cross-economy result from country-specific evidence. In P3 Vietnam and P5 China, TCI moderated the curve shape; in the 48-economy pool, institutional heterogeneity attenuates that moderation signal. This is consistent with the absorptive capacity argument (Cohen &amp; Levinthal, 1990): high-TCI firms process international market signals more effectively, but the curve-shaping benefit requires institutional complementarity (e.g., strong IP protection, technology transfer infrastructure) that is inconsistently present across the full ICRV spectrum. The practical implication is that technological capability raises the performance floor universally, but its curve-reshaping role is context-contingent and cannot be assumed at scale.</w:t>
-      </w:r>
-    </w:p>
-    <w:bookmarkEnd w:id="45"/>
-    <w:bookmarkStart w:id="46" w:name="Xf6197b5ae9fc313cd14220a896ca012fd7330cf"/>
+        <w:t xml:space="preserve">The finding that TCI raises the performance level without reliably reshaping the I–P curve in the pooled sample distinguishes the cross-economy result from country-specific evidence. In P3 Vietnam and P5 China, TCI moderated the curve shape; in the 45-economy pool, institutional heterogeneity attenuates that moderation signal. This is consistent with the absorptive capacity argument (Cohen &amp; Levinthal, 1990): high-TCI firms process international market signals more effectively, but the curve-shaping benefit requires institutional complementarity (e.g., strong IP protection, technology transfer infrastructure) that is inconsistently present across the full ICRV spectrum. The practical implication is that technological capability raises the performance floor universally, but its curve-reshaping role is context-contingent and cannot be assumed at scale.</w:t>
+      </w:r>
+    </w:p>
+    <w:bookmarkEnd w:id="46"/>
+    <w:bookmarkStart w:id="47" w:name="Xf6197b5ae9fc313cd14220a896ca012fd7330cf"/>
     <w:p>
       <w:pPr>
         <w:pStyle w:val="Heading3"/>
@@ -1767,11 +1881,11 @@
         <w:pStyle w:val="FirstParagraph"/>
       </w:pPr>
       <w:r>
-        <w:t xml:space="preserve">The capability-complementarity curve reshaping found for DAI in M9 — and the significant DAI×ICRV interaction (β = +0.060, p = .012) in M11 — provides the first multi-economy evidence for the CDCM prediction that digital capabilities’ performance effects are context-contingent. In institutionally stronger economies (Group I–II), digital infrastructure is near-universal and therefore provides competitive advantage only to early adopters at the margin; in weaker institutional environments (Group IV–VI), digital adoption remains differentiating. The implication is that policies promoting digitalisation in frontier economies are likely to generate stronger firm-level returns per unit of adoption than equivalent policies in advanced economies.</w:t>
-      </w:r>
-    </w:p>
-    <w:bookmarkEnd w:id="46"/>
-    <w:bookmarkStart w:id="47" w:name="managerial-heterogeneity"/>
+        <w:t xml:space="preserve">The capability-complementarity curve reshaping found for DAI in M9 — and the significant DAI×ICRV interaction (β = +0.052, p = .049) in M11 — provides the first multi-economy evidence for the CDCM prediction that digital capabilities’ performance effects are context-contingent. In institutionally stronger economies (Group I–II), digital infrastructure is near-universal and therefore provides competitive advantage only to early adopters at the margin; in weaker institutional environments (Group IV–VI), digital adoption remains differentiating. The implication is that policies promoting digitalisation in frontier economies are likely to generate stronger firm-level returns per unit of adoption than equivalent policies in advanced economies.</w:t>
+      </w:r>
+    </w:p>
+    <w:bookmarkEnd w:id="47"/>
+    <w:bookmarkStart w:id="48" w:name="managerial-heterogeneity"/>
     <w:p>
       <w:pPr>
         <w:pStyle w:val="Heading3"/>
@@ -1812,8 +1926,8 @@
         <w:t xml:space="preserve">policy note (Buchhave et al., 2026) documents that women who hold management positions have cleared exceptional retention barriers: childbirth reduces women’s wage employment probability by 8.1 percentage points and urban household income by 27%, with no significant effect on fathers. Women who reach managerial rank therefore represent a highly selected and committed workforce stratum, consistent with the productivity premium we estimate. At the sector level, IFC (2022) similarly documents that female leadership in Vietnamese banking is associated with superior risk management and stakeholder orientation — the relational-capital mechanisms posited by Upper Echelons Theory (Hambrick &amp; Mason, 1984). These convergent pieces of evidence strengthen the interpretation that the WBES-estimated premium reflects genuine managerial capability rather than endogenous selection into high-productivity firms.</w:t>
       </w:r>
     </w:p>
-    <w:bookmarkEnd w:id="47"/>
-    <w:bookmarkStart w:id="48" w:name="limitations"/>
+    <w:bookmarkEnd w:id="48"/>
+    <w:bookmarkStart w:id="49" w:name="limitations"/>
     <w:p>
       <w:pPr>
         <w:pStyle w:val="Heading3"/>
@@ -1855,9 +1969,9 @@
         </w:pict>
       </w:r>
     </w:p>
-    <w:bookmarkEnd w:id="48"/>
     <w:bookmarkEnd w:id="49"/>
-    <w:bookmarkStart w:id="50" w:name="conclusions"/>
+    <w:bookmarkEnd w:id="50"/>
+    <w:bookmarkStart w:id="51" w:name="conclusions"/>
     <w:p>
       <w:pPr>
         <w:pStyle w:val="Heading2"/>
@@ -1871,7 +1985,7 @@
         <w:pStyle w:val="FirstParagraph"/>
       </w:pPr>
       <w:r>
-        <w:t xml:space="preserve">This study set out to explain not whether internationalization pays, but where and for whom. Across a 48-economy, 107-wave WBES sample, the inverted-U I–P relationship is universal in form — peaking at approximately 36% export intensity — yet its optimum is jointly relocated by institutional regime and digital capability, and digital capability operates as a partial substitute for institutional strength. Three implications follow. First, for firms on the ascending limb (FSTS &lt; 36%), intensifying internationalization is productivity-enhancing and the priority is removing barriers to export expansion; beyond the optimum, the binding constraint is coordination capacity rather than market access. Second, technological capability raises the performance level across all export intensities without reliably relocating the optimum, so capability-building is best read as a baseline performance lever rather than a curve-shifting intervention. Third, foundational digital adoption is both a level enhancer and a curve reshaper, and its returns are largest where institutions are weakest (DAI×ICRV, p = .012) — making digitalisation a particularly high-leverage instrument in frontier and vulnerable regimes.</w:t>
+        <w:t xml:space="preserve">This study set out to explain not whether internationalization pays, but where and for whom. Across a 45-economy, 98-wave WBES sample, the inverted-U I–P relationship is universal in form — peaking at approximately 37% export intensity — yet its optimum is jointly relocated by institutional regime and digital capability, and digital capability operates as a partial substitute for institutional strength. Three implications follow. First, for firms on the ascending limb (FSTS &lt; 36%), intensifying internationalization is productivity-enhancing and the priority is removing barriers to export expansion; beyond the optimum, the binding constraint is coordination capacity rather than market access. Second, technological capability raises the performance level across all export intensities without reliably relocating the optimum, so capability-building is best read as a baseline performance lever rather than a curve-shifting intervention. Third, foundational digital adoption is both a level enhancer and a curve reshaper, and its returns are largest where institutions are weakest (DAI×ICRV, p = .049) — making digitalisation a particularly high-leverage instrument in frontier and vulnerable regimes.</w:t>
       </w:r>
     </w:p>
     <w:p>
@@ -1897,8 +2011,8 @@
         </w:pict>
       </w:r>
     </w:p>
-    <w:bookmarkEnd w:id="50"/>
-    <w:bookmarkStart w:id="51" w:name="references"/>
+    <w:bookmarkEnd w:id="51"/>
+    <w:bookmarkStart w:id="52" w:name="references"/>
     <w:p>
       <w:pPr>
         <w:pStyle w:val="Heading2"/>
@@ -2041,6 +2155,30 @@
         <w:pStyle w:val="BodyText"/>
       </w:pPr>
       <w:r>
+        <w:t xml:space="preserve">Combs, J. G., Crook, T. R., &amp; Shook, C. L. (2005). The dimensionality of organizational performance and its implications for strategic management research. In D. J. Ketchen &amp; D. D. Bergh (Eds.),</w:t>
+      </w:r>
+      <w:r>
+        <w:t xml:space="preserve"> </w:t>
+      </w:r>
+      <w:r>
+        <w:rPr>
+          <w:iCs/>
+          <w:i/>
+        </w:rPr>
+        <w:t xml:space="preserve">Research methodology in strategy and management</w:t>
+      </w:r>
+      <w:r>
+        <w:t xml:space="preserve"> </w:t>
+      </w:r>
+      <w:r>
+        <w:t xml:space="preserve">(Vol. 2, pp. 259–286). Emerald. https://doi.org/10.1016/S1479-8387(05)02011-4</w:t>
+      </w:r>
+    </w:p>
+    <w:p>
+      <w:pPr>
+        <w:pStyle w:val="BodyText"/>
+      </w:pPr>
+      <w:r>
         <w:t xml:space="preserve">Cohen, W. M., &amp; Levinthal, D. A. (1990). Absorptive capacity: A new perspective on learning and innovation.</w:t>
       </w:r>
       <w:r>
@@ -2569,6 +2707,27 @@
         <w:pStyle w:val="BodyText"/>
       </w:pPr>
       <w:r>
+        <w:t xml:space="preserve">Richard, P. J., Devinney, T. M., Yip, G. S., &amp; Johnson, G. (2009). Measuring organizational performance: Towards methodological best practice.</w:t>
+      </w:r>
+      <w:r>
+        <w:t xml:space="preserve"> </w:t>
+      </w:r>
+      <w:r>
+        <w:rPr>
+          <w:iCs/>
+          <w:i/>
+        </w:rPr>
+        <w:t xml:space="preserve">Journal of Management, 35</w:t>
+      </w:r>
+      <w:r>
+        <w:t xml:space="preserve">(3), 718–804. https://doi.org/10.1177/0149206308330560</w:t>
+      </w:r>
+    </w:p>
+    <w:p>
+      <w:pPr>
+        <w:pStyle w:val="BodyText"/>
+      </w:pPr>
+      <w:r>
         <w:t xml:space="preserve">Scott, W. R. (2008).</w:t>
       </w:r>
       <w:r>
@@ -2635,6 +2794,27 @@
         <w:pStyle w:val="BodyText"/>
       </w:pPr>
       <w:r>
+        <w:t xml:space="preserve">United Nations Statistics Division. (2024).</w:t>
+      </w:r>
+      <w:r>
+        <w:t xml:space="preserve"> </w:t>
+      </w:r>
+      <w:r>
+        <w:rPr>
+          <w:iCs/>
+          <w:i/>
+        </w:rPr>
+        <w:t xml:space="preserve">Standard country or area codes for statistical use (M49)</w:t>
+      </w:r>
+      <w:r>
+        <w:t xml:space="preserve">. United Nations. https://unstats.un.org/unsd/methodology/m49/</w:t>
+      </w:r>
+    </w:p>
+    <w:p>
+      <w:pPr>
+        <w:pStyle w:val="BodyText"/>
+      </w:pPr>
+      <w:r>
         <w:t xml:space="preserve">Verhoef, P. C., Broekhuizen, T., Bart, Y., Bhattacharya, A., Dong, J. Q., Fabian, N., &amp; Haenlein, M. (2021). Digital transformation: A multidisciplinary reflection and research agenda.</w:t>
       </w:r>
       <w:r>
@@ -2670,6 +2850,27 @@
       </w:r>
       <w:r>
         <w:t xml:space="preserve">(2), 171–180. https://doi.org/10.1002/smj.4250050207</w:t>
+      </w:r>
+    </w:p>
+    <w:p>
+      <w:pPr>
+        <w:pStyle w:val="BodyText"/>
+      </w:pPr>
+      <w:r>
+        <w:t xml:space="preserve">World Bank. (2022).</w:t>
+      </w:r>
+      <w:r>
+        <w:t xml:space="preserve"> </w:t>
+      </w:r>
+      <w:r>
+        <w:rPr>
+          <w:iCs/>
+          <w:i/>
+        </w:rPr>
+        <w:t xml:space="preserve">Enterprise surveys: Sampling methodology</w:t>
+      </w:r>
+      <w:r>
+        <w:t xml:space="preserve">. World Bank Group. https://www.enterprisesurveys.org</w:t>
       </w:r>
     </w:p>
     <w:p>
@@ -2856,8 +3057,8 @@
         </w:pict>
       </w:r>
     </w:p>
-    <w:bookmarkEnd w:id="51"/>
-    <w:bookmarkStart w:id="52" w:name="appendix-a-model-sequence"/>
+    <w:bookmarkEnd w:id="52"/>
+    <w:bookmarkStart w:id="53" w:name="appendix-a-model-sequence"/>
     <w:p>
       <w:pPr>
         <w:pStyle w:val="Heading2"/>
@@ -3620,7 +3821,7 @@
               <w:jc w:val="left"/>
             </w:pPr>
             <w:r>
-              <w:t xml:space="preserve">84,910</w:t>
+              <w:t xml:space="preserve">82,302</w:t>
             </w:r>
           </w:p>
         </w:tc>
@@ -3694,7 +3895,7 @@
               <w:jc w:val="left"/>
             </w:pPr>
             <w:r>
-              <w:t xml:space="preserve">84,910</w:t>
+              <w:t xml:space="preserve">82,302</w:t>
             </w:r>
           </w:p>
         </w:tc>
@@ -3768,19 +3969,19 @@
               <w:jc w:val="left"/>
             </w:pPr>
             <w:r>
-              <w:t xml:space="preserve">84,910</w:t>
-            </w:r>
-          </w:p>
-        </w:tc>
-        <w:tc>
-          <w:tcPr/>
-          <w:p>
-            <w:pPr>
-              <w:pStyle w:val="Compact"/>
-              <w:jc w:val="left"/>
-            </w:pPr>
-            <w:r>
-              <w:t xml:space="preserve">.003</w:t>
+              <w:t xml:space="preserve">82,302</w:t>
+            </w:r>
+          </w:p>
+        </w:tc>
+        <w:tc>
+          <w:tcPr/>
+          <w:p>
+            <w:pPr>
+              <w:pStyle w:val="Compact"/>
+              <w:jc w:val="left"/>
+            </w:pPr>
+            <w:r>
+              <w:t xml:space="preserve">.002</w:t>
             </w:r>
           </w:p>
         </w:tc>
@@ -3796,7 +3997,7 @@
                 <w:bCs/>
                 <w:b/>
               </w:rPr>
-              <w:t xml:space="preserve">36.4</w:t>
+              <w:t xml:space="preserve">37.1</w:t>
             </w:r>
           </w:p>
         </w:tc>
@@ -3846,19 +4047,19 @@
               <w:jc w:val="left"/>
             </w:pPr>
             <w:r>
-              <w:t xml:space="preserve">38,342</w:t>
-            </w:r>
-          </w:p>
-        </w:tc>
-        <w:tc>
-          <w:tcPr/>
-          <w:p>
-            <w:pPr>
-              <w:pStyle w:val="Compact"/>
-              <w:jc w:val="left"/>
-            </w:pPr>
-            <w:r>
-              <w:t xml:space="preserve">.015</w:t>
+              <w:t xml:space="preserve">36,772</w:t>
+            </w:r>
+          </w:p>
+        </w:tc>
+        <w:tc>
+          <w:tcPr/>
+          <w:p>
+            <w:pPr>
+              <w:pStyle w:val="Compact"/>
+              <w:jc w:val="left"/>
+            </w:pPr>
+            <w:r>
+              <w:t xml:space="preserve">.017</w:t>
             </w:r>
           </w:p>
         </w:tc>
@@ -3874,7 +4075,7 @@
                 <w:bCs/>
                 <w:b/>
               </w:rPr>
-              <w:t xml:space="preserve">33.8</w:t>
+              <w:t xml:space="preserve">34.1</w:t>
             </w:r>
           </w:p>
         </w:tc>
@@ -3924,19 +4125,19 @@
               <w:jc w:val="left"/>
             </w:pPr>
             <w:r>
-              <w:t xml:space="preserve">38,342</w:t>
-            </w:r>
-          </w:p>
-        </w:tc>
-        <w:tc>
-          <w:tcPr/>
-          <w:p>
-            <w:pPr>
-              <w:pStyle w:val="Compact"/>
-              <w:jc w:val="left"/>
-            </w:pPr>
-            <w:r>
-              <w:t xml:space="preserve">.677</w:t>
+              <w:t xml:space="preserve">36,772</w:t>
+            </w:r>
+          </w:p>
+        </w:tc>
+        <w:tc>
+          <w:tcPr/>
+          <w:p>
+            <w:pPr>
+              <w:pStyle w:val="Compact"/>
+              <w:jc w:val="left"/>
+            </w:pPr>
+            <w:r>
+              <w:t xml:space="preserve">.671</w:t>
             </w:r>
           </w:p>
         </w:tc>
@@ -3952,7 +4153,7 @@
                 <w:bCs/>
                 <w:b/>
               </w:rPr>
-              <w:t xml:space="preserve">40.0</w:t>
+              <w:t xml:space="preserve">39.5</w:t>
             </w:r>
           </w:p>
         </w:tc>
@@ -4002,31 +4203,31 @@
               <w:jc w:val="left"/>
             </w:pPr>
             <w:r>
-              <w:t xml:space="preserve">38,051</w:t>
-            </w:r>
-          </w:p>
-        </w:tc>
-        <w:tc>
-          <w:tcPr/>
-          <w:p>
-            <w:pPr>
-              <w:pStyle w:val="Compact"/>
-              <w:jc w:val="left"/>
-            </w:pPr>
-            <w:r>
-              <w:t xml:space="preserve">.024</w:t>
-            </w:r>
-          </w:p>
-        </w:tc>
-        <w:tc>
-          <w:tcPr/>
-          <w:p>
-            <w:pPr>
-              <w:pStyle w:val="Compact"/>
-              <w:jc w:val="left"/>
-            </w:pPr>
-            <w:r>
-              <w:t xml:space="preserve">32.7</w:t>
+              <w:t xml:space="preserve">36,481</w:t>
+            </w:r>
+          </w:p>
+        </w:tc>
+        <w:tc>
+          <w:tcPr/>
+          <w:p>
+            <w:pPr>
+              <w:pStyle w:val="Compact"/>
+              <w:jc w:val="left"/>
+            </w:pPr>
+            <w:r>
+              <w:t xml:space="preserve">.027</w:t>
+            </w:r>
+          </w:p>
+        </w:tc>
+        <w:tc>
+          <w:tcPr/>
+          <w:p>
+            <w:pPr>
+              <w:pStyle w:val="Compact"/>
+              <w:jc w:val="left"/>
+            </w:pPr>
+            <w:r>
+              <w:t xml:space="preserve">33.0</w:t>
             </w:r>
           </w:p>
         </w:tc>
@@ -4076,19 +4277,19 @@
               <w:jc w:val="left"/>
             </w:pPr>
             <w:r>
-              <w:t xml:space="preserve">38,051</w:t>
-            </w:r>
-          </w:p>
-        </w:tc>
-        <w:tc>
-          <w:tcPr/>
-          <w:p>
-            <w:pPr>
-              <w:pStyle w:val="Compact"/>
-              <w:jc w:val="left"/>
-            </w:pPr>
-            <w:r>
-              <w:t xml:space="preserve">.025</w:t>
+              <w:t xml:space="preserve">36,481</w:t>
+            </w:r>
+          </w:p>
+        </w:tc>
+        <w:tc>
+          <w:tcPr/>
+          <w:p>
+            <w:pPr>
+              <w:pStyle w:val="Compact"/>
+              <w:jc w:val="left"/>
+            </w:pPr>
+            <w:r>
+              <w:t xml:space="preserve">.028</w:t>
             </w:r>
           </w:p>
         </w:tc>
@@ -4104,7 +4305,7 @@
                 <w:bCs/>
                 <w:b/>
               </w:rPr>
-              <w:t xml:space="preserve">33.9</w:t>
+              <w:t xml:space="preserve">34.2</w:t>
             </w:r>
           </w:p>
         </w:tc>
@@ -4154,19 +4355,19 @@
               <w:jc w:val="left"/>
             </w:pPr>
             <w:r>
-              <w:t xml:space="preserve">37,940</w:t>
-            </w:r>
-          </w:p>
-        </w:tc>
-        <w:tc>
-          <w:tcPr/>
-          <w:p>
-            <w:pPr>
-              <w:pStyle w:val="Compact"/>
-              <w:jc w:val="left"/>
-            </w:pPr>
-            <w:r>
-              <w:t xml:space="preserve">.030</w:t>
+              <w:t xml:space="preserve">36,372</w:t>
+            </w:r>
+          </w:p>
+        </w:tc>
+        <w:tc>
+          <w:tcPr/>
+          <w:p>
+            <w:pPr>
+              <w:pStyle w:val="Compact"/>
+              <w:jc w:val="left"/>
+            </w:pPr>
+            <w:r>
+              <w:t xml:space="preserve">.033</w:t>
             </w:r>
           </w:p>
         </w:tc>
@@ -4182,7 +4383,7 @@
                 <w:bCs/>
                 <w:b/>
               </w:rPr>
-              <w:t xml:space="preserve">33.8</w:t>
+              <w:t xml:space="preserve">34.2</w:t>
             </w:r>
           </w:p>
         </w:tc>
@@ -4232,19 +4433,19 @@
               <w:jc w:val="left"/>
             </w:pPr>
             <w:r>
-              <w:t xml:space="preserve">35,568</w:t>
-            </w:r>
-          </w:p>
-        </w:tc>
-        <w:tc>
-          <w:tcPr/>
-          <w:p>
-            <w:pPr>
-              <w:pStyle w:val="Compact"/>
-              <w:jc w:val="left"/>
-            </w:pPr>
-            <w:r>
-              <w:t xml:space="preserve">.035</w:t>
+              <w:t xml:space="preserve">34,228</w:t>
+            </w:r>
+          </w:p>
+        </w:tc>
+        <w:tc>
+          <w:tcPr/>
+          <w:p>
+            <w:pPr>
+              <w:pStyle w:val="Compact"/>
+              <w:jc w:val="left"/>
+            </w:pPr>
+            <w:r>
+              <w:t xml:space="preserve">.042</w:t>
             </w:r>
           </w:p>
         </w:tc>
@@ -4260,7 +4461,7 @@
                 <w:bCs/>
                 <w:b/>
               </w:rPr>
-              <w:t xml:space="preserve">36.1</w:t>
+              <w:t xml:space="preserve">32.2</w:t>
             </w:r>
           </w:p>
         </w:tc>
@@ -4310,19 +4511,19 @@
               <w:jc w:val="left"/>
             </w:pPr>
             <w:r>
-              <w:t xml:space="preserve">31,928</w:t>
-            </w:r>
-          </w:p>
-        </w:tc>
-        <w:tc>
-          <w:tcPr/>
-          <w:p>
-            <w:pPr>
-              <w:pStyle w:val="Compact"/>
-              <w:jc w:val="left"/>
-            </w:pPr>
-            <w:r>
-              <w:t xml:space="preserve">.049</w:t>
+              <w:t xml:space="preserve">30,360</w:t>
+            </w:r>
+          </w:p>
+        </w:tc>
+        <w:tc>
+          <w:tcPr/>
+          <w:p>
+            <w:pPr>
+              <w:pStyle w:val="Compact"/>
+              <w:jc w:val="left"/>
+            </w:pPr>
+            <w:r>
+              <w:t xml:space="preserve">.039</w:t>
             </w:r>
           </w:p>
         </w:tc>
@@ -4384,19 +4585,19 @@
               <w:jc w:val="left"/>
             </w:pPr>
             <w:r>
-              <w:t xml:space="preserve">29,840</w:t>
-            </w:r>
-          </w:p>
-        </w:tc>
-        <w:tc>
-          <w:tcPr/>
-          <w:p>
-            <w:pPr>
-              <w:pStyle w:val="Compact"/>
-              <w:jc w:val="left"/>
-            </w:pPr>
-            <w:r>
-              <w:t xml:space="preserve">.067</w:t>
+              <w:t xml:space="preserve">28,500</w:t>
+            </w:r>
+          </w:p>
+        </w:tc>
+        <w:tc>
+          <w:tcPr/>
+          <w:p>
+            <w:pPr>
+              <w:pStyle w:val="Compact"/>
+              <w:jc w:val="left"/>
+            </w:pPr>
+            <w:r>
+              <w:t xml:space="preserve">.057</w:t>
             </w:r>
           </w:p>
         </w:tc>
@@ -4412,19 +4613,19 @@
                 <w:bCs/>
                 <w:b/>
               </w:rPr>
-              <w:t xml:space="preserve">34.6</w:t>
-            </w:r>
-          </w:p>
-        </w:tc>
-        <w:tc>
-          <w:tcPr/>
-          <w:p>
-            <w:pPr>
-              <w:pStyle w:val="Compact"/>
-              <w:jc w:val="left"/>
-            </w:pPr>
-            <w:r>
-              <w:t xml:space="preserve">.002</w:t>
+              <w:t xml:space="preserve">25.7</w:t>
+            </w:r>
+          </w:p>
+        </w:tc>
+        <w:tc>
+          <w:tcPr/>
+          <w:p>
+            <w:pPr>
+              <w:pStyle w:val="Compact"/>
+              <w:jc w:val="left"/>
+            </w:pPr>
+            <w:r>
+              <w:t xml:space="preserve">.026</w:t>
             </w:r>
           </w:p>
         </w:tc>
@@ -4585,55 +4786,55 @@
               <w:jc w:val="left"/>
             </w:pPr>
             <w:r>
-              <w:t xml:space="preserve">+1.316***</w:t>
-            </w:r>
-          </w:p>
-        </w:tc>
-        <w:tc>
-          <w:tcPr/>
-          <w:p>
-            <w:pPr>
-              <w:pStyle w:val="Compact"/>
-              <w:jc w:val="left"/>
-            </w:pPr>
-            <w:r>
-              <w:t xml:space="preserve">+2.083***</w:t>
-            </w:r>
-          </w:p>
-        </w:tc>
-        <w:tc>
-          <w:tcPr/>
-          <w:p>
-            <w:pPr>
-              <w:pStyle w:val="Compact"/>
-              <w:jc w:val="left"/>
-            </w:pPr>
-            <w:r>
-              <w:t xml:space="preserve">+2.000***</w:t>
-            </w:r>
-          </w:p>
-        </w:tc>
-        <w:tc>
-          <w:tcPr/>
-          <w:p>
-            <w:pPr>
-              <w:pStyle w:val="Compact"/>
-              <w:jc w:val="left"/>
-            </w:pPr>
-            <w:r>
-              <w:t xml:space="preserve">+2.522***</w:t>
-            </w:r>
-          </w:p>
-        </w:tc>
-        <w:tc>
-          <w:tcPr/>
-          <w:p>
-            <w:pPr>
-              <w:pStyle w:val="Compact"/>
-              <w:jc w:val="left"/>
-            </w:pPr>
-            <w:r>
-              <w:t xml:space="preserve">−5.560***</w:t>
+              <w:t xml:space="preserve">+1.211***</w:t>
+            </w:r>
+          </w:p>
+        </w:tc>
+        <w:tc>
+          <w:tcPr/>
+          <w:p>
+            <w:pPr>
+              <w:pStyle w:val="Compact"/>
+              <w:jc w:val="left"/>
+            </w:pPr>
+            <w:r>
+              <w:t xml:space="preserve">+2.249***</w:t>
+            </w:r>
+          </w:p>
+        </w:tc>
+        <w:tc>
+          <w:tcPr/>
+          <w:p>
+            <w:pPr>
+              <w:pStyle w:val="Compact"/>
+              <w:jc w:val="left"/>
+            </w:pPr>
+            <w:r>
+              <w:t xml:space="preserve">+2.154***</w:t>
+            </w:r>
+          </w:p>
+        </w:tc>
+        <w:tc>
+          <w:tcPr/>
+          <w:p>
+            <w:pPr>
+              <w:pStyle w:val="Compact"/>
+              <w:jc w:val="left"/>
+            </w:pPr>
+            <w:r>
+              <w:t xml:space="preserve">+2.429***</w:t>
+            </w:r>
+          </w:p>
+        </w:tc>
+        <w:tc>
+          <w:tcPr/>
+          <w:p>
+            <w:pPr>
+              <w:pStyle w:val="Compact"/>
+              <w:jc w:val="left"/>
+            </w:pPr>
+            <w:r>
+              <w:t xml:space="preserve">−6.497***</w:t>
             </w:r>
           </w:p>
         </w:tc>
@@ -4659,55 +4860,55 @@
               <w:jc w:val="left"/>
             </w:pPr>
             <w:r>
-              <w:t xml:space="preserve">−1.810***</w:t>
-            </w:r>
-          </w:p>
-        </w:tc>
-        <w:tc>
-          <w:tcPr/>
-          <w:p>
-            <w:pPr>
-              <w:pStyle w:val="Compact"/>
-              <w:jc w:val="left"/>
-            </w:pPr>
-            <w:r>
-              <w:t xml:space="preserve">−3.074***</w:t>
-            </w:r>
-          </w:p>
-        </w:tc>
-        <w:tc>
-          <w:tcPr/>
-          <w:p>
-            <w:pPr>
-              <w:pStyle w:val="Compact"/>
-              <w:jc w:val="left"/>
-            </w:pPr>
-            <w:r>
-              <w:t xml:space="preserve">−2.954***</w:t>
-            </w:r>
-          </w:p>
-        </w:tc>
-        <w:tc>
-          <w:tcPr/>
-          <w:p>
-            <w:pPr>
-              <w:pStyle w:val="Compact"/>
-              <w:jc w:val="left"/>
-            </w:pPr>
-            <w:r>
-              <w:t xml:space="preserve">−3.497***</w:t>
-            </w:r>
-          </w:p>
-        </w:tc>
-        <w:tc>
-          <w:tcPr/>
-          <w:p>
-            <w:pPr>
-              <w:pStyle w:val="Compact"/>
-              <w:jc w:val="left"/>
-            </w:pPr>
-            <w:r>
-              <w:t xml:space="preserve">+8.517***</w:t>
+              <w:t xml:space="preserve">−1.630***</w:t>
+            </w:r>
+          </w:p>
+        </w:tc>
+        <w:tc>
+          <w:tcPr/>
+          <w:p>
+            <w:pPr>
+              <w:pStyle w:val="Compact"/>
+              <w:jc w:val="left"/>
+            </w:pPr>
+            <w:r>
+              <w:t xml:space="preserve">−3.287***</w:t>
+            </w:r>
+          </w:p>
+        </w:tc>
+        <w:tc>
+          <w:tcPr/>
+          <w:p>
+            <w:pPr>
+              <w:pStyle w:val="Compact"/>
+              <w:jc w:val="left"/>
+            </w:pPr>
+            <w:r>
+              <w:t xml:space="preserve">−3.147***</w:t>
+            </w:r>
+          </w:p>
+        </w:tc>
+        <w:tc>
+          <w:tcPr/>
+          <w:p>
+            <w:pPr>
+              <w:pStyle w:val="Compact"/>
+              <w:jc w:val="left"/>
+            </w:pPr>
+            <w:r>
+              <w:t xml:space="preserve">−3.768***</w:t>
+            </w:r>
+          </w:p>
+        </w:tc>
+        <w:tc>
+          <w:tcPr/>
+          <w:p>
+            <w:pPr>
+              <w:pStyle w:val="Compact"/>
+              <w:jc w:val="left"/>
+            </w:pPr>
+            <w:r>
+              <w:t xml:space="preserve">+10.449***</w:t>
             </w:r>
           </w:p>
         </w:tc>
@@ -4745,43 +4946,43 @@
               <w:jc w:val="left"/>
             </w:pPr>
             <w:r>
-              <w:t xml:space="preserve">+0.344***</w:t>
-            </w:r>
-          </w:p>
-        </w:tc>
-        <w:tc>
-          <w:tcPr/>
-          <w:p>
-            <w:pPr>
-              <w:pStyle w:val="Compact"/>
-              <w:jc w:val="left"/>
-            </w:pPr>
-            <w:r>
-              <w:t xml:space="preserve">+0.307***</w:t>
-            </w:r>
-          </w:p>
-        </w:tc>
-        <w:tc>
-          <w:tcPr/>
-          <w:p>
-            <w:pPr>
-              <w:pStyle w:val="Compact"/>
-              <w:jc w:val="left"/>
-            </w:pPr>
-            <w:r>
-              <w:t xml:space="preserve">+0.304***</w:t>
-            </w:r>
-          </w:p>
-        </w:tc>
-        <w:tc>
-          <w:tcPr/>
-          <w:p>
-            <w:pPr>
-              <w:pStyle w:val="Compact"/>
-              <w:jc w:val="left"/>
-            </w:pPr>
-            <w:r>
-              <w:t xml:space="preserve">+0.256***</w:t>
+              <w:t xml:space="preserve">+0.372***</w:t>
+            </w:r>
+          </w:p>
+        </w:tc>
+        <w:tc>
+          <w:tcPr/>
+          <w:p>
+            <w:pPr>
+              <w:pStyle w:val="Compact"/>
+              <w:jc w:val="left"/>
+            </w:pPr>
+            <w:r>
+              <w:t xml:space="preserve">+0.330***</w:t>
+            </w:r>
+          </w:p>
+        </w:tc>
+        <w:tc>
+          <w:tcPr/>
+          <w:p>
+            <w:pPr>
+              <w:pStyle w:val="Compact"/>
+              <w:jc w:val="left"/>
+            </w:pPr>
+            <w:r>
+              <w:t xml:space="preserve">+0.326***</w:t>
+            </w:r>
+          </w:p>
+        </w:tc>
+        <w:tc>
+          <w:tcPr/>
+          <w:p>
+            <w:pPr>
+              <w:pStyle w:val="Compact"/>
+              <w:jc w:val="left"/>
+            </w:pPr>
+            <w:r>
+              <w:t xml:space="preserve">+0.279***</w:t>
             </w:r>
           </w:p>
         </w:tc>
@@ -4819,31 +5020,31 @@
               <w:jc w:val="left"/>
             </w:pPr>
             <w:r>
-              <w:t xml:space="preserve">−0.144</w:t>
-            </w:r>
-          </w:p>
-        </w:tc>
-        <w:tc>
-          <w:tcPr/>
-          <w:p>
-            <w:pPr>
-              <w:pStyle w:val="Compact"/>
-              <w:jc w:val="left"/>
-            </w:pPr>
-            <w:r>
-              <w:t xml:space="preserve">+0.113</w:t>
-            </w:r>
-          </w:p>
-        </w:tc>
-        <w:tc>
-          <w:tcPr/>
-          <w:p>
-            <w:pPr>
-              <w:pStyle w:val="Compact"/>
-              <w:jc w:val="left"/>
-            </w:pPr>
-            <w:r>
-              <w:t xml:space="preserve">+0.134</w:t>
+              <w:t xml:space="preserve">−0.090</w:t>
+            </w:r>
+          </w:p>
+        </w:tc>
+        <w:tc>
+          <w:tcPr/>
+          <w:p>
+            <w:pPr>
+              <w:pStyle w:val="Compact"/>
+              <w:jc w:val="left"/>
+            </w:pPr>
+            <w:r>
+              <w:t xml:space="preserve">+0.159</w:t>
+            </w:r>
+          </w:p>
+        </w:tc>
+        <w:tc>
+          <w:tcPr/>
+          <w:p>
+            <w:pPr>
+              <w:pStyle w:val="Compact"/>
+              <w:jc w:val="left"/>
+            </w:pPr>
+            <w:r>
+              <w:t xml:space="preserve">+0.158</w:t>
             </w:r>
           </w:p>
         </w:tc>
@@ -4893,31 +5094,31 @@
               <w:jc w:val="left"/>
             </w:pPr>
             <w:r>
-              <w:t xml:space="preserve">−0.137</w:t>
-            </w:r>
-          </w:p>
-        </w:tc>
-        <w:tc>
-          <w:tcPr/>
-          <w:p>
-            <w:pPr>
-              <w:pStyle w:val="Compact"/>
-              <w:jc w:val="left"/>
-            </w:pPr>
-            <w:r>
-              <w:t xml:space="preserve">−0.418</w:t>
-            </w:r>
-          </w:p>
-        </w:tc>
-        <w:tc>
-          <w:tcPr/>
-          <w:p>
-            <w:pPr>
-              <w:pStyle w:val="Compact"/>
-              <w:jc w:val="left"/>
-            </w:pPr>
-            <w:r>
-              <w:t xml:space="preserve">−0.398</w:t>
+              <w:t xml:space="preserve">−0.227</w:t>
+            </w:r>
+          </w:p>
+        </w:tc>
+        <w:tc>
+          <w:tcPr/>
+          <w:p>
+            <w:pPr>
+              <w:pStyle w:val="Compact"/>
+              <w:jc w:val="left"/>
+            </w:pPr>
+            <w:r>
+              <w:t xml:space="preserve">−0.493†</w:t>
+            </w:r>
+          </w:p>
+        </w:tc>
+        <w:tc>
+          <w:tcPr/>
+          <w:p>
+            <w:pPr>
+              <w:pStyle w:val="Compact"/>
+              <w:jc w:val="left"/>
+            </w:pPr>
+            <w:r>
+              <w:t xml:space="preserve">−0.433</w:t>
             </w:r>
           </w:p>
         </w:tc>
@@ -4979,31 +5180,31 @@
               <w:jc w:val="left"/>
             </w:pPr>
             <w:r>
-              <w:t xml:space="preserve">+0.155***</w:t>
-            </w:r>
-          </w:p>
-        </w:tc>
-        <w:tc>
-          <w:tcPr/>
-          <w:p>
-            <w:pPr>
-              <w:pStyle w:val="Compact"/>
-              <w:jc w:val="left"/>
-            </w:pPr>
-            <w:r>
-              <w:t xml:space="preserve">+0.145***</w:t>
-            </w:r>
-          </w:p>
-        </w:tc>
-        <w:tc>
-          <w:tcPr/>
-          <w:p>
-            <w:pPr>
-              <w:pStyle w:val="Compact"/>
-              <w:jc w:val="left"/>
-            </w:pPr>
-            <w:r>
-              <w:t xml:space="preserve">+0.181***</w:t>
+              <w:t xml:space="preserve">+0.172***</w:t>
+            </w:r>
+          </w:p>
+        </w:tc>
+        <w:tc>
+          <w:tcPr/>
+          <w:p>
+            <w:pPr>
+              <w:pStyle w:val="Compact"/>
+              <w:jc w:val="left"/>
+            </w:pPr>
+            <w:r>
+              <w:t xml:space="preserve">+0.160***</w:t>
+            </w:r>
+          </w:p>
+        </w:tc>
+        <w:tc>
+          <w:tcPr/>
+          <w:p>
+            <w:pPr>
+              <w:pStyle w:val="Compact"/>
+              <w:jc w:val="left"/>
+            </w:pPr>
+            <w:r>
+              <w:t xml:space="preserve">+0.198***</w:t>
             </w:r>
           </w:p>
         </w:tc>
@@ -5053,19 +5254,19 @@
               <w:jc w:val="left"/>
             </w:pPr>
             <w:r>
-              <w:t xml:space="preserve">−0.614***</w:t>
-            </w:r>
-          </w:p>
-        </w:tc>
-        <w:tc>
-          <w:tcPr/>
-          <w:p>
-            <w:pPr>
-              <w:pStyle w:val="Compact"/>
-              <w:jc w:val="left"/>
-            </w:pPr>
-            <w:r>
-              <w:t xml:space="preserve">−0.780***</w:t>
+              <w:t xml:space="preserve">−0.588***</w:t>
+            </w:r>
+          </w:p>
+        </w:tc>
+        <w:tc>
+          <w:tcPr/>
+          <w:p>
+            <w:pPr>
+              <w:pStyle w:val="Compact"/>
+              <w:jc w:val="left"/>
+            </w:pPr>
+            <w:r>
+              <w:t xml:space="preserve">−0.786***</w:t>
             </w:r>
           </w:p>
         </w:tc>
@@ -5127,19 +5328,19 @@
               <w:jc w:val="left"/>
             </w:pPr>
             <w:r>
-              <w:t xml:space="preserve">+0.766**</w:t>
-            </w:r>
-          </w:p>
-        </w:tc>
-        <w:tc>
-          <w:tcPr/>
-          <w:p>
-            <w:pPr>
-              <w:pStyle w:val="Compact"/>
-              <w:jc w:val="left"/>
-            </w:pPr>
-            <w:r>
-              <w:t xml:space="preserve">+0.994***</w:t>
+              <w:t xml:space="preserve">+0.726**</w:t>
+            </w:r>
+          </w:p>
+        </w:tc>
+        <w:tc>
+          <w:tcPr/>
+          <w:p>
+            <w:pPr>
+              <w:pStyle w:val="Compact"/>
+              <w:jc w:val="left"/>
+            </w:pPr>
+            <w:r>
+              <w:t xml:space="preserve">+0.982***</w:t>
             </w:r>
           </w:p>
         </w:tc>
@@ -5213,7 +5414,7 @@
               <w:jc w:val="left"/>
             </w:pPr>
             <w:r>
-              <w:t xml:space="preserve">+0.007*</w:t>
+              <w:t xml:space="preserve">+0.018***</w:t>
             </w:r>
           </w:p>
         </w:tc>
@@ -5287,7 +5488,7 @@
               <w:jc w:val="left"/>
             </w:pPr>
             <w:r>
-              <w:t xml:space="preserve">+0.185***</w:t>
+              <w:t xml:space="preserve">+0.202***</w:t>
             </w:r>
           </w:p>
         </w:tc>
@@ -5373,7 +5574,7 @@
               <w:jc w:val="left"/>
             </w:pPr>
             <w:r>
-              <w:t xml:space="preserve">+0.729***</w:t>
+              <w:t xml:space="preserve">+0.592***</w:t>
             </w:r>
           </w:p>
         </w:tc>
@@ -5447,7 +5648,7 @@
               <w:jc w:val="left"/>
             </w:pPr>
             <w:r>
-              <w:t xml:space="preserve">+1.636***</w:t>
+              <w:t xml:space="preserve">+1.849***</w:t>
             </w:r>
           </w:p>
         </w:tc>
@@ -5521,7 +5722,7 @@
               <w:jc w:val="left"/>
             </w:pPr>
             <w:r>
-              <w:t xml:space="preserve">−2.501***</w:t>
+              <w:t xml:space="preserve">−2.932***</w:t>
             </w:r>
           </w:p>
         </w:tc>
@@ -5547,55 +5748,55 @@
               <w:jc w:val="left"/>
             </w:pPr>
             <w:r>
-              <w:t xml:space="preserve">84,910</w:t>
-            </w:r>
-          </w:p>
-        </w:tc>
-        <w:tc>
-          <w:tcPr/>
-          <w:p>
-            <w:pPr>
-              <w:pStyle w:val="Compact"/>
-              <w:jc w:val="left"/>
-            </w:pPr>
-            <w:r>
-              <w:t xml:space="preserve">38,051</w:t>
-            </w:r>
-          </w:p>
-        </w:tc>
-        <w:tc>
-          <w:tcPr/>
-          <w:p>
-            <w:pPr>
-              <w:pStyle w:val="Compact"/>
-              <w:jc w:val="left"/>
-            </w:pPr>
-            <w:r>
-              <w:t xml:space="preserve">37,940</w:t>
-            </w:r>
-          </w:p>
-        </w:tc>
-        <w:tc>
-          <w:tcPr/>
-          <w:p>
-            <w:pPr>
-              <w:pStyle w:val="Compact"/>
-              <w:jc w:val="left"/>
-            </w:pPr>
-            <w:r>
-              <w:t xml:space="preserve">35,568</w:t>
-            </w:r>
-          </w:p>
-        </w:tc>
-        <w:tc>
-          <w:tcPr/>
-          <w:p>
-            <w:pPr>
-              <w:pStyle w:val="Compact"/>
-              <w:jc w:val="left"/>
-            </w:pPr>
-            <w:r>
-              <w:t xml:space="preserve">31,928</w:t>
+              <w:t xml:space="preserve">82,302</w:t>
+            </w:r>
+          </w:p>
+        </w:tc>
+        <w:tc>
+          <w:tcPr/>
+          <w:p>
+            <w:pPr>
+              <w:pStyle w:val="Compact"/>
+              <w:jc w:val="left"/>
+            </w:pPr>
+            <w:r>
+              <w:t xml:space="preserve">36,481</w:t>
+            </w:r>
+          </w:p>
+        </w:tc>
+        <w:tc>
+          <w:tcPr/>
+          <w:p>
+            <w:pPr>
+              <w:pStyle w:val="Compact"/>
+              <w:jc w:val="left"/>
+            </w:pPr>
+            <w:r>
+              <w:t xml:space="preserve">36,372</w:t>
+            </w:r>
+          </w:p>
+        </w:tc>
+        <w:tc>
+          <w:tcPr/>
+          <w:p>
+            <w:pPr>
+              <w:pStyle w:val="Compact"/>
+              <w:jc w:val="left"/>
+            </w:pPr>
+            <w:r>
+              <w:t xml:space="preserve">34,228</w:t>
+            </w:r>
+          </w:p>
+        </w:tc>
+        <w:tc>
+          <w:tcPr/>
+          <w:p>
+            <w:pPr>
+              <w:pStyle w:val="Compact"/>
+              <w:jc w:val="left"/>
+            </w:pPr>
+            <w:r>
+              <w:t xml:space="preserve">30,360</w:t>
             </w:r>
           </w:p>
         </w:tc>
@@ -5621,55 +5822,55 @@
               <w:jc w:val="left"/>
             </w:pPr>
             <w:r>
-              <w:t xml:space="preserve">.003</w:t>
-            </w:r>
-          </w:p>
-        </w:tc>
-        <w:tc>
-          <w:tcPr/>
-          <w:p>
-            <w:pPr>
-              <w:pStyle w:val="Compact"/>
-              <w:jc w:val="left"/>
-            </w:pPr>
-            <w:r>
-              <w:t xml:space="preserve">.025</w:t>
-            </w:r>
-          </w:p>
-        </w:tc>
-        <w:tc>
-          <w:tcPr/>
-          <w:p>
-            <w:pPr>
-              <w:pStyle w:val="Compact"/>
-              <w:jc w:val="left"/>
-            </w:pPr>
-            <w:r>
-              <w:t xml:space="preserve">.030</w:t>
-            </w:r>
-          </w:p>
-        </w:tc>
-        <w:tc>
-          <w:tcPr/>
-          <w:p>
-            <w:pPr>
-              <w:pStyle w:val="Compact"/>
-              <w:jc w:val="left"/>
-            </w:pPr>
-            <w:r>
-              <w:t xml:space="preserve">.035</w:t>
-            </w:r>
-          </w:p>
-        </w:tc>
-        <w:tc>
-          <w:tcPr/>
-          <w:p>
-            <w:pPr>
-              <w:pStyle w:val="Compact"/>
-              <w:jc w:val="left"/>
-            </w:pPr>
-            <w:r>
-              <w:t xml:space="preserve">.049</w:t>
+              <w:t xml:space="preserve">.002</w:t>
+            </w:r>
+          </w:p>
+        </w:tc>
+        <w:tc>
+          <w:tcPr/>
+          <w:p>
+            <w:pPr>
+              <w:pStyle w:val="Compact"/>
+              <w:jc w:val="left"/>
+            </w:pPr>
+            <w:r>
+              <w:t xml:space="preserve">.028</w:t>
+            </w:r>
+          </w:p>
+        </w:tc>
+        <w:tc>
+          <w:tcPr/>
+          <w:p>
+            <w:pPr>
+              <w:pStyle w:val="Compact"/>
+              <w:jc w:val="left"/>
+            </w:pPr>
+            <w:r>
+              <w:t xml:space="preserve">.033</w:t>
+            </w:r>
+          </w:p>
+        </w:tc>
+        <w:tc>
+          <w:tcPr/>
+          <w:p>
+            <w:pPr>
+              <w:pStyle w:val="Compact"/>
+              <w:jc w:val="left"/>
+            </w:pPr>
+            <w:r>
+              <w:t xml:space="preserve">.042</w:t>
+            </w:r>
+          </w:p>
+        </w:tc>
+        <w:tc>
+          <w:tcPr/>
+          <w:p>
+            <w:pPr>
+              <w:pStyle w:val="Compact"/>
+              <w:jc w:val="left"/>
+            </w:pPr>
+            <w:r>
+              <w:t xml:space="preserve">.039</w:t>
             </w:r>
           </w:p>
         </w:tc>
@@ -5690,26 +5891,24 @@
         <w:t xml:space="preserve"> </w:t>
       </w:r>
       <w:r>
-        <w:t xml:space="preserve">HC1 robust SEs. *** p &lt; .001, ** p &lt; .01, * p &lt; .05, † p &lt; .10. Controls (female_owner, foreign_own_pct, firm_age, ln_size) included in M7–M10 but not reported for space. M11 (N=29,840, AdjR²=.067, TP=34.6%, LM p=.002): DAI×ICRV=+0.060</w:t>
-      </w:r>
-      <w:r>
-        <w:rPr>
-          <w:iCs/>
-          <w:i/>
-        </w:rPr>
-        <w:t xml:space="preserve">, three-way FSTS×DAI×ICRV=−0.001 (NS), mgr_experience=+0.009</w:t>
+        <w:t xml:space="preserve">HC1 robust SEs. *** p &lt; .001, ** p &lt; .01, * p &lt; .05, † p &lt; .10. Controls (female_owner, foreign_own_pct, firm_age, ln_size) included in M7–M10 but not reported for space. M11 (N=28,500, AdjR²=.057, TP=25.7%, LM p=.026): DAI×ICRV=+0.052</w:t>
+      </w:r>
+      <w:r>
+        <w:rPr>
+          <w:iCs/>
+          <w:i/>
+        </w:rPr>
+        <w:t xml:space="preserve">, three-way FSTS×DAI×ICRV=−0.016 (NS), mgr_experience=+0.022</w:t>
       </w:r>
       <w:r>
         <w:rPr>
           <w:bCs/>
           <w:b/>
-          <w:iCs/>
-          <w:i/>
-        </w:rPr>
-        <w:t xml:space="preserve">, FSTS×mgr=−0.019†, mgr_female=+0.187</w:t>
-      </w:r>
-      <w:r>
-        <w:t xml:space="preserve">, female_owner=+0.128**.</w:t>
+        </w:rPr>
+        <w:t xml:space="preserve">, FSTS×mgr=+0.007 (NS), mgr_female=+0.210</w:t>
+      </w:r>
+      <w:r>
+        <w:t xml:space="preserve">*, female_owner=+0.122**.</w:t>
       </w:r>
     </w:p>
     <w:p>
@@ -5719,8 +5918,8 @@
         </w:pict>
       </w:r>
     </w:p>
-    <w:bookmarkEnd w:id="52"/>
-    <w:bookmarkStart w:id="53" w:name="X09b5d89c7c8f35bf9d25d1bfe47da72b2ba58bf"/>
+    <w:bookmarkEnd w:id="53"/>
+    <w:bookmarkStart w:id="54" w:name="X09b5d89c7c8f35bf9d25d1bfe47da72b2ba58bf"/>
     <w:p>
       <w:pPr>
         <w:pStyle w:val="Heading2"/>
@@ -5778,8 +5977,8 @@
         <w:t xml:space="preserve">First author: Do Thuy Huong, Vinh Long University of Technology Education, huongdt@vlute.edu.vn, ORCID: 0000-0002-7711-2487</w:t>
       </w:r>
     </w:p>
-    <w:bookmarkEnd w:id="53"/>
     <w:bookmarkEnd w:id="54"/>
+    <w:bookmarkEnd w:id="55"/>
     <w:sectPr>
       <w:pgSz w:h="16838" w:w="11906"/>
       <w:pgMar w:bottom="1417" w:left="1417" w:right="1417" w:top="1417"/>

</xml_diff>

<commit_message>
docs(p7): finalize H5 framing to institutionally-conditioned curvature (EN+VI)
Resolves the residual peak-migration overclaim that the G2 sample does not
support. The institutional regime is now framed as governing the inverted-U's
amplitude (pronounced in weaker-institution economies, flat/near-linear in
advanced ones), while digital capability reshapes the curve and relocates its
effective optimum. Updates the thesis statement, §5.1 Contribution 1, the
framework claim, and the conclusion in both manuscripts; rebuilds both DOCX.

https://claude.ai/code/session_01TNqoRFY1vAVQL6GWg8X9M3
</commit_message>
<xml_diff>
--- a/dist/submission/p7_capstone_JIBS.docx
+++ b/dist/submission/p7_capstone_JIBS.docx
@@ -98,23 +98,23 @@
         <w:t xml:space="preserve"> </w:t>
       </w:r>
       <w:r>
-        <w:t xml:space="preserve">its performance-maximising optimum falls. We develop and test an integrated multi-level account in which the inverted-U is universal in form but its turning point is</w:t>
-      </w:r>
-      <w:r>
-        <w:t xml:space="preserve"> </w:t>
-      </w:r>
-      <w:r>
-        <w:rPr>
-          <w:iCs/>
-          <w:i/>
-        </w:rPr>
-        <w:t xml:space="preserve">jointly relocated</w:t>
-      </w:r>
-      <w:r>
-        <w:t xml:space="preserve"> </w:t>
-      </w:r>
-      <w:r>
-        <w:t xml:space="preserve">by the institutional regime in which a firm operates and by the firm’s digital capability — and in which digital capability operates as a partial</w:t>
+        <w:t xml:space="preserve">its performance-maximising optimum falls. We develop and test an integrated multi-level account in which the inverted-U is universal in form but its shape is</w:t>
+      </w:r>
+      <w:r>
+        <w:t xml:space="preserve"> </w:t>
+      </w:r>
+      <w:r>
+        <w:rPr>
+          <w:iCs/>
+          <w:i/>
+        </w:rPr>
+        <w:t xml:space="preserve">jointly conditioned</w:t>
+      </w:r>
+      <w:r>
+        <w:t xml:space="preserve"> </w:t>
+      </w:r>
+      <w:r>
+        <w:t xml:space="preserve">by the institutional regime in which a firm operates and by the firm’s digital capability — with the institutional regime governing the curve’s amplitude and digital capability reshaping it, the latter operating as a partial</w:t>
       </w:r>
       <w:r>
         <w:t xml:space="preserve"> </w:t>
@@ -469,17 +469,17 @@
         <w:t xml:space="preserve"> </w:t>
       </w:r>
       <w:r>
-        <w:t xml:space="preserve">of the I–P relationship is universal (H1), but its performance-maximising turning point is</w:t>
-      </w:r>
-      <w:r>
-        <w:t xml:space="preserve"> </w:t>
-      </w:r>
-      <w:r>
-        <w:rPr>
-          <w:iCs/>
-          <w:i/>
-        </w:rPr>
-        <w:t xml:space="preserve">jointly relocated</w:t>
+        <w:t xml:space="preserve">of the I–P relationship is universal (H1), but its shape and performance-maximising optimum are</w:t>
+      </w:r>
+      <w:r>
+        <w:t xml:space="preserve"> </w:t>
+      </w:r>
+      <w:r>
+        <w:rPr>
+          <w:iCs/>
+          <w:i/>
+        </w:rPr>
+        <w:t xml:space="preserve">jointly conditioned</w:t>
       </w:r>
       <w:r>
         <w:t xml:space="preserve"> </w:t>
@@ -1723,7 +1723,23 @@
         <w:t xml:space="preserve"> </w:t>
       </w:r>
       <w:r>
-        <w:t xml:space="preserve">reframes the two-decade debate over the shape of the I–P curve. The inverted-U holds across all six ICRV regime groups (H1), but the turning point is not a fixed structural parameter: it migrates with institutional quality (H5), from early-peaking in advanced regimes to late-peaking in frontier and vulnerable ones. This dissolves the apparent contradiction between studies reporting positive-linear, inverted-U, and null effects (§5.2): they are observations of a single curve sampled at different institutional locations. The contribution is to relocate the explanatory burden from the</w:t>
+        <w:t xml:space="preserve">reframes the two-decade debate over the shape of the I–P curve. The inverted-U holds across all six ICRV regime groups (H1), but its shape is not a fixed structural parameter: the institutional regime governs the curve’s</w:t>
+      </w:r>
+      <w:r>
+        <w:t xml:space="preserve"> </w:t>
+      </w:r>
+      <w:r>
+        <w:rPr>
+          <w:iCs/>
+          <w:i/>
+        </w:rPr>
+        <w:t xml:space="preserve">amplitude</w:t>
+      </w:r>
+      <w:r>
+        <w:t xml:space="preserve"> </w:t>
+      </w:r>
+      <w:r>
+        <w:t xml:space="preserve">(H5) — a pronounced inverted-U in weaker-institution economies, flattening toward a near-linear profile in advanced ones — while digital capability reshapes the curve and relocates its effective optimum (H3). This dissolves the apparent contradiction between studies reporting positive-linear, inverted-U, and null effects (§5.2): they observe a single underlying curve whose sharpness, and whose payoff at high export intensity, are jointly set by institutional quality and digital capability. The contribution is to relocate the explanatory burden from the</w:t>
       </w:r>
       <w:r>
         <w:t xml:space="preserve"> </w:t>
@@ -1749,7 +1765,7 @@
           <w:iCs/>
           <w:i/>
         </w:rPr>
-        <w:t xml:space="preserve">determinants of its optimum</w:t>
+        <w:t xml:space="preserve">determinants of its shape</w:t>
       </w:r>
       <w:r>
         <w:t xml:space="preserve"> </w:t>
@@ -1985,7 +2001,7 @@
         <w:pStyle w:val="FirstParagraph"/>
       </w:pPr>
       <w:r>
-        <w:t xml:space="preserve">This study set out to explain not whether internationalization pays, but where and for whom. Across a 45-economy, 98-wave WBES sample, the inverted-U I–P relationship is universal in form — peaking at approximately 37% export intensity — yet its optimum is jointly relocated by institutional regime and digital capability, and digital capability operates as a partial substitute for institutional strength. Three implications follow. First, for firms on the ascending limb (FSTS &lt; 36%), intensifying internationalization is productivity-enhancing and the priority is removing barriers to export expansion; beyond the optimum, the binding constraint is coordination capacity rather than market access. Second, technological capability raises the performance level across all export intensities without reliably relocating the optimum, so capability-building is best read as a baseline performance lever rather than a curve-shifting intervention. Third, foundational digital adoption is both a level enhancer and a curve reshaper, and its returns are largest where institutions are weakest (DAI×ICRV, p = .049) — making digitalisation a particularly high-leverage instrument in frontier and vulnerable regimes.</w:t>
+        <w:t xml:space="preserve">This study set out to explain not whether internationalization pays, but where and for whom. Across a 45-economy, 98-wave WBES sample, the inverted-U I–P relationship is universal in form — peaking at approximately 37% export intensity — yet its optimum is jointly conditioned by institutional regime and digital capability — institutions governing the curve’s amplitude and digital capability reshaping it — with digital capability operating as a partial substitute for institutional strength. Three implications follow. First, for firms on the ascending limb (FSTS &lt; 36%), intensifying internationalization is productivity-enhancing and the priority is removing barriers to export expansion; beyond the optimum, the binding constraint is coordination capacity rather than market access. Second, technological capability raises the performance level across all export intensities without reliably relocating the optimum, so capability-building is best read as a baseline performance lever rather than a curve-shifting intervention. Third, foundational digital adoption is both a level enhancer and a curve reshaper, and its returns are largest where institutions are weakest (DAI×ICRV, p = .049) — making digitalisation a particularly high-leverage instrument in frontier and vulnerable regimes.</w:t>
       </w:r>
     </w:p>
     <w:p>

</xml_diff>

<commit_message>
fix(p7): correct stale TCI interaction β in prose; normalize turning point to 37%
Prose reported FSTS×TCI β=−0.111 and FSTS²×TCI β=−0.191 (M7), contradicting
both the regenerated replication CSV (p7_summary_focal/coefs_all_models:
fsts_c_x_tci=−0.0899, fsts_c2_x_tci=−0.2273) and the manuscript's own Table 2
(−0.090 / −0.227). Align prose to the canonical values in EN + VI. The NS
verdicts and M8 p=.077 were already correct and are unchanged.

Also normalize loose "36%" turning-point mentions to "37%" (canonical M2
TP=37.1%) for internal consistency across both languages, and rebuild the
EN (JIBS) and VI (VN) submission DOCX.

https://claude.ai/code/session_011XSdnrryncR5bWJwwXgS4R
</commit_message>
<xml_diff>
--- a/dist/submission/p7_capstone_JIBS.docx
+++ b/dist/submission/p7_capstone_JIBS.docx
@@ -2,7 +2,7 @@
 <file path=word/document.xml><?xml version="1.0" encoding="utf-8"?>
 <w:document xmlns:w="http://schemas.openxmlformats.org/wordprocessingml/2006/main" xmlns:m="http://schemas.openxmlformats.org/officeDocument/2006/math" xmlns:r="http://schemas.openxmlformats.org/officeDocument/2006/relationships" xmlns:o="urn:schemas-microsoft-com:office:office" xmlns:v="urn:schemas-microsoft-com:vml" xmlns:w10="urn:schemas-microsoft-com:office:word" xmlns:a="http://schemas.openxmlformats.org/drawingml/2006/main" xmlns:pic="http://schemas.openxmlformats.org/drawingml/2006/picture" xmlns:wp="http://schemas.openxmlformats.org/drawingml/2006/wordprocessingDrawing">
   <w:body>
-    <w:bookmarkStart w:id="55" w:name="Xdb894c26febb3cc9442dfb5c539bd48c4fb3517"/>
+    <w:bookmarkStart w:id="85" w:name="Xdb894c26febb3cc9442dfb5c539bd48c4fb3517"/>
     <w:p>
       <w:pPr>
         <w:pStyle w:val="Heading1"/>
@@ -114,7 +114,7 @@
         <w:t xml:space="preserve"> </w:t>
       </w:r>
       <w:r>
-        <w:t xml:space="preserve">by the institutional regime in which a firm operates and by the firm’s digital capability — with the institutional regime governing the curve’s amplitude and digital capability reshaping it, the latter operating as a partial</w:t>
+        <w:t xml:space="preserve">by the institutional regime in which a firm operates and by the firm's digital capability — with the institutional regime governing the curve's amplitude and digital capability reshaping it, the latter operating as a partial</w:t>
       </w:r>
       <w:r>
         <w:t xml:space="preserve"> </w:t>
@@ -159,7 +159,7 @@
       </w:r>
     </w:p>
     <w:bookmarkEnd w:id="20"/>
-    <w:bookmarkStart w:id="21" w:name="introduction"/>
+    <w:bookmarkStart w:id="21" w:name="Xe3d0fc0bea9a42ce7605565d0964033d7f6ee47"/>
     <w:p>
       <w:pPr>
         <w:pStyle w:val="Heading2"/>
@@ -205,7 +205,7 @@
         <w:t xml:space="preserve"> </w:t>
       </w:r>
       <w:r>
-        <w:t xml:space="preserve">its performance-maximising turning point falls, and why should that location differ systematically across firms and economies? Absent a unifying account of the optimum’s location, each new country study reads as a refutation of the last rather than as a coordinate on a common curve. Progress requires a framework that specifies the firm- and country-level forces that relocate the optimum and that is testable simultaneously across institutionally diverse economies — conditions that prior single-country and meta-analytic designs have not jointly satisfied.</w:t>
+        <w:t xml:space="preserve">its performance-maximising turning point falls, and why should that location differ systematically across firms and economies? Absent a unifying account of the optimum's location, each new country study reads as a refutation of the last rather than as a coordinate on a common curve. Progress requires a framework that specifies the firm- and country-level forces that relocate the optimum and that is testable simultaneously across institutionally diverse economies — conditions that prior single-country and meta-analytic designs have not jointly satisfied.</w:t>
       </w:r>
     </w:p>
     <w:p>
@@ -237,35 +237,17 @@
         <w:t xml:space="preserve"> </w:t>
       </w:r>
       <w:r>
-        <w:t xml:space="preserve">account of the I–P relationship: the inverted-U is universal in form, but its curvature is endogenous to the institutional regime, deepening as institutional quality declines (confirmed across specifications at N = 82,302–28,500; M11: TP = 25.7%, Lind–Mehlum p = .026). This reframes the long-running</w:t>
-      </w:r>
-      <w:r>
-        <w:t xml:space="preserve"> </w:t>
-      </w:r>
-      <w:r>
-        <w:t xml:space="preserve">“</w:t>
-      </w:r>
-      <w:r>
-        <w:t xml:space="preserve">is it an inverted-U?</w:t>
-      </w:r>
-      <w:r>
-        <w:t xml:space="preserve">”</w:t>
-      </w:r>
-      <w:r>
-        <w:t xml:space="preserve"> </w:t>
-      </w:r>
-      <w:r>
-        <w:t xml:space="preserve">debate as a question about the</w:t>
-      </w:r>
-      <w:r>
-        <w:t xml:space="preserve"> </w:t>
-      </w:r>
-      <w:r>
-        <w:rPr>
-          <w:iCs/>
-          <w:i/>
-        </w:rPr>
-        <w:t xml:space="preserve">determinants of the optimum’s location</w:t>
+        <w:t xml:space="preserve">account of the I–P relationship: the inverted-U is universal in form, but its curvature is endogenous to the institutional regime, deepening as institutional quality declines (confirmed across specifications at N = 82,302–28,500; M11: TP = 25.7%, Lind–Mehlum p = .026). This reframes the long-running "is it an inverted-U?" debate as a question about the</w:t>
+      </w:r>
+      <w:r>
+        <w:t xml:space="preserve"> </w:t>
+      </w:r>
+      <w:r>
+        <w:rPr>
+          <w:iCs/>
+          <w:i/>
+        </w:rPr>
+        <w:t xml:space="preserve">determinants of the optimum's location</w:t>
       </w:r>
       <w:r>
         <w:t xml:space="preserve">, and reconciles otherwise conflicting country evidence within a single curve. Second, we theorise and test</w:t>
@@ -326,7 +308,7 @@
       </w:r>
     </w:p>
     <w:bookmarkEnd w:id="21"/>
-    <w:bookmarkStart w:id="29" w:name="theoretical-framework-and-hypotheses"/>
+    <w:bookmarkStart w:id="29" w:name="Xce0b9068aa677089fdc23e66f61b75516af2bf7"/>
     <w:p>
       <w:pPr>
         <w:pStyle w:val="Heading2"/>
@@ -335,7 +317,7 @@
         <w:t xml:space="preserve">2. Theoretical Framework and Hypotheses</w:t>
       </w:r>
     </w:p>
-    <w:bookmarkStart w:id="22" w:name="theoretical-foundations"/>
+    <w:bookmarkStart w:id="22" w:name="X61eb865d3ba9c18e1eda9971096f2566a95b0ec"/>
     <w:p>
       <w:pPr>
         <w:pStyle w:val="Heading3"/>
@@ -381,7 +363,7 @@
         <w:t xml:space="preserve"> </w:t>
       </w:r>
       <w:r>
-        <w:t xml:space="preserve">on which the I–P optimum sits. Institutional Theory supplies the filter itself; RBV capabilities (TCI, DAI) are the firm-level shields that move a firm’s position on that topography; the Uppsala model describes movement along it; and Upper Echelons attributes enter as an endogenous control on managerial quality rather than as a structural moderator of the curve’s shape.</w:t>
+        <w:t xml:space="preserve">on which the I–P optimum sits. Institutional Theory supplies the filter itself; RBV capabilities (TCI, DAI) are the firm-level shields that move a firm's position on that topography; the Uppsala model describes movement along it; and Upper Echelons attributes enter as an endogenous control on managerial quality rather than as a structural moderator of the curve's shape.</w:t>
       </w:r>
     </w:p>
     <w:p>
@@ -421,7 +403,7 @@
         <w:t xml:space="preserve"> </w:t>
       </w:r>
       <w:r>
-        <w:t xml:space="preserve">on the I–P curve a firm’s environment places it. ICRV orders economies along two theoretically distinct dimensions that prior typologies treat separately:</w:t>
+        <w:t xml:space="preserve">on the I–P curve a firm's environment places it. ICRV orders economies along two theoretically distinct dimensions that prior typologies treat separately:</w:t>
       </w:r>
       <w:r>
         <w:t xml:space="preserve"> </w:t>
@@ -485,7 +467,7 @@
         <w:t xml:space="preserve"> </w:t>
       </w:r>
       <w:r>
-        <w:t xml:space="preserve">by the institutional regime (H5) and by the firm’s digital capability (H3), with digital capability acting as a partial substitute for institutional strength where the latter is weak (H6). Firm capabilities enter on a second axis: technological capability is hypothesised to</w:t>
+        <w:t xml:space="preserve">by the institutional regime (H5) and by the firm's digital capability (H3), with digital capability acting as a partial substitute for institutional strength where the latter is weak (H6). Firm capabilities enter on a second axis: technological capability is hypothesised to</w:t>
       </w:r>
       <w:r>
         <w:t xml:space="preserve"> </w:t>
@@ -547,7 +529,7 @@
       </w:r>
     </w:p>
     <w:bookmarkEnd w:id="22"/>
-    <w:bookmarkStart w:id="23" w:name="the-non-linear-ip-relationship-h1"/>
+    <w:bookmarkStart w:id="23" w:name="Xf68c2510db72354551e5b442c06e6149a212286"/>
     <w:p>
       <w:pPr>
         <w:pStyle w:val="Heading3"/>
@@ -561,7 +543,7 @@
         <w:pStyle w:val="FirstParagraph"/>
       </w:pPr>
       <w:r>
-        <w:t xml:space="preserve">Contractor et al. (2003) formalised the three-stage S-curve hypothesis: early internationalization carries fixed entry costs that depress performance; intermediate internationalization yields learning and scale economies; high internationalization may again impose coordination and agency costs. Empirically, however, the data more consistently support the inverted-U — a special case in which the third stage does not emerge at the export intensities typically observed in developing-economy WBES data (Gomes &amp; Ramaswamy, 1999; Lu &amp; Beamish, 2004).</w:t>
+        <w:t xml:space="preserve">Contractor et al. (2003) formalised the three-stage S-curve hypothesis: early internationalization carries fixed entry costs that depress performance; intermediate internationalization yields learning and scale economies; high internationalization may again impose coordination and agency costs. Empirically, however, the data more consistently support the inverted-U — a special case in which the third stage does not emerge at the export intensities typically observed in developing-economy WBES data (Gomes &amp; Ramaswamy, 1999; Lu &amp; Beamish, 2004).</w:t>
       </w:r>
     </w:p>
     <w:p>
@@ -591,7 +573,7 @@
       </w:r>
     </w:p>
     <w:bookmarkEnd w:id="23"/>
-    <w:bookmarkStart w:id="24" w:name="Xe2f9215226203df0d35a74fbc3991b825156e23"/>
+    <w:bookmarkStart w:id="24" w:name="X804c25e8bdbf8eade8cd93fdb8dbf851f3c8515"/>
     <w:p>
       <w:pPr>
         <w:pStyle w:val="Heading3"/>
@@ -648,7 +630,7 @@
       </w:r>
     </w:p>
     <w:bookmarkEnd w:id="24"/>
-    <w:bookmarkStart w:id="25" w:name="digital-adoption-as-a-level-enhancer-h3"/>
+    <w:bookmarkStart w:id="25" w:name="Xf9645264d48ebb644ff7e280396113254c384c7"/>
     <w:p>
       <w:pPr>
         <w:pStyle w:val="Heading3"/>
@@ -662,7 +644,7 @@
         <w:pStyle w:val="FirstParagraph"/>
       </w:pPr>
       <w:r>
-        <w:t xml:space="preserve">Digital adoption — measured through website presence and electronic-payment share — has been associated with reduced communication and transaction costs (Verhoef et al., 2021). In the CDCM (Context-Contingent Digital Capability Model) developed in the dissertation, DAI’s effect depends on the interaction of regime quality, FSTS level, and digital market saturation (Đỗ &amp; Phan, 2024). Specifically, in institutionally advanced economies where digital infrastructure is mature, DAI provides universal performance lifts (as in P4 Singapore: β(DAI) positive and significant). In emerging-economy contexts with substantial selection into digital adoption (P3 Vietnam: IV-estimated β(DAI) ≈ 0, consistent with selection bias in OLS), DAI’s curve-shaping role is attenuated. Across the pooled multi-economy sample, we expect DAI to raise performance levels broadly across the sample (level effect). In a fully specified model that also accounts for managerial quality — which correlates with digital adoption — the residual DAI variation may reveal a capability-complementarity curve effect: digitally equipped firms at low FSTS face sunk adoption costs that compress near-term productivity, while digital infrastructure supports coordination efficiency at high FSTS where cross-border management demands are greatest.</w:t>
+        <w:t xml:space="preserve">Digital adoption — measured through website presence and electronic-payment share — has been associated with reduced communication and transaction costs (Verhoef et al., 2021). In the CDCM (Context-Contingent Digital Capability Model) developed in the dissertation, DAI's effect depends on the interaction of regime quality, FSTS level, and digital market saturation (Đỗ &amp; Phan, 2024). Specifically, in institutionally advanced economies where digital infrastructure is mature, DAI provides universal performance lifts (as in P4 Singapore: β(DAI) positive and significant). In emerging-economy contexts with substantial selection into digital adoption (P3 Vietnam: IV-estimated β(DAI) ≈ 0, consistent with selection bias in OLS), DAI's curve-shaping role is attenuated. Across the pooled multi-economy sample, we expect DAI to raise performance levels broadly across the sample (level effect). In a fully specified model that also accounts for managerial quality — which correlates with digital adoption — the residual DAI variation may reveal a capability-complementarity curve effect: digitally equipped firms at low FSTS face sunk adoption costs that compress near-term productivity, while digital infrastructure supports coordination efficiency at high FSTS where cross-border management demands are greatest.</w:t>
       </w:r>
     </w:p>
     <w:p>
@@ -684,7 +666,7 @@
       </w:r>
     </w:p>
     <w:bookmarkEnd w:id="25"/>
-    <w:bookmarkStart w:id="26" w:name="managerial-characteristics-h4"/>
+    <w:bookmarkStart w:id="26" w:name="Xfde2382d547d6bd016a370b8abd9bb51c6ab875"/>
     <w:p>
       <w:pPr>
         <w:pStyle w:val="Heading3"/>
@@ -720,7 +702,7 @@
       </w:r>
     </w:p>
     <w:bookmarkEnd w:id="26"/>
-    <w:bookmarkStart w:id="27" w:name="X0b3fdaf9bb49b1730bc3a0521f76f654a8096ae"/>
+    <w:bookmarkStart w:id="27" w:name="Xc04b0d08a7461e173e211ec4b938149d2f7c8bf"/>
     <w:p>
       <w:pPr>
         <w:pStyle w:val="Heading3"/>
@@ -764,7 +746,7 @@
       </w:r>
     </w:p>
     <w:bookmarkEnd w:id="27"/>
-    <w:bookmarkStart w:id="28" w:name="regime-contingent-digital-effects-h6"/>
+    <w:bookmarkStart w:id="28" w:name="X0acb0ebe9609c9b4cd27b2f0dbe81194406b82a"/>
     <w:p>
       <w:pPr>
         <w:pStyle w:val="Heading3"/>
@@ -778,7 +760,7 @@
         <w:pStyle w:val="FirstParagraph"/>
       </w:pPr>
       <w:r>
-        <w:t xml:space="preserve">The Context-Contingent Digital Capability Model (CDCM) developed in this dissertation programme predicts that the I–P curve-reshaping role of digital adoption is not uniform across institutional environments. In institutionally advanced economies (ICRV Group I–II), digital infrastructure is near-universal and close to the competitive baseline — the marginal performance differentiation from website and e-payment adoption is accordingly lower. In institutionally weaker economies (ICRV Group IV–VI), digital adoption remains differentiating: digital market access tools lower the liability-of-foreignness cost and provide cross-border coordination support that institutional voids cannot substitute. The DAI×ICRV interaction therefore tests whether digital capabilities’ curve-reshaping potency (established in H3) varies systematically across the institutional spectrum — specifically, whether compressing the ascending limb and buffering performance decline at high FSTS are more pronounced in weaker-institution economies.</w:t>
+        <w:t xml:space="preserve">The Context-Contingent Digital Capability Model (CDCM) developed in this dissertation programme predicts that the I–P curve-reshaping role of digital adoption is not uniform across institutional environments. In institutionally advanced economies (ICRV Group I–II), digital infrastructure is near-universal and close to the competitive baseline — the marginal performance differentiation from website and e-payment adoption is accordingly lower. In institutionally weaker economies (ICRV Group IV–VI), digital adoption remains differentiating: digital market access tools lower the liability-of-foreignness cost and provide cross-border coordination support that institutional voids cannot substitute. The DAI×ICRV interaction therefore tests whether digital capabilities' curve-reshaping potency (established in H3) varies systematically across the institutional spectrum — specifically, whether compressing the ascending limb and buffering performance decline at high FSTS are more pronounced in weaker-institution economies.</w:t>
       </w:r>
     </w:p>
     <w:p>
@@ -836,7 +818,7 @@
         <w:t xml:space="preserve"> </w:t>
       </w:r>
       <w:r>
-        <w:t xml:space="preserve">The ICRV institutional regime moderates the digital-adoption curve-reshaping effect: digital adoption’s compressive effect on the I–P ascending limb and its buffering effect at high FSTS (H3) are stronger in weaker institutional environments (higher ICRV group number), where digital infrastructure provides greater competitive differentiation in cross-border market access.</w:t>
+        <w:t xml:space="preserve">The ICRV institutional regime moderates the digital-adoption curve-reshaping effect: digital adoption's compressive effect on the I–P ascending limb and its buffering effect at high FSTS (H3) are stronger in weaker institutional environments (higher ICRV group number), where digital infrastructure provides greater competitive differentiation in cross-border market access.</w:t>
       </w:r>
     </w:p>
     <w:p>
@@ -848,7 +830,7 @@
     </w:p>
     <w:bookmarkEnd w:id="28"/>
     <w:bookmarkEnd w:id="29"/>
-    <w:bookmarkStart w:id="34" w:name="data-and-methods"/>
+    <w:bookmarkStart w:id="34" w:name="X5eb800a903106e48a684e9ea9de39ed619b9df8"/>
     <w:p>
       <w:pPr>
         <w:pStyle w:val="Heading2"/>
@@ -857,7 +839,7 @@
         <w:t xml:space="preserve">3. Data and Methods</w:t>
       </w:r>
     </w:p>
-    <w:bookmarkStart w:id="30" w:name="data-source"/>
+    <w:bookmarkStart w:id="30" w:name="X180323993af082d7b264d69830cacecf330a102"/>
     <w:p>
       <w:pPr>
         <w:pStyle w:val="Heading3"/>
@@ -871,19 +853,19 @@
         <w:pStyle w:val="FirstParagraph"/>
       </w:pPr>
       <w:r>
-        <w:t xml:space="preserve">Data derive from the World Bank Enterprise Surveys (WBES), a stratified random-sample survey of formal private-sector enterprises conducted periodically across over 130 countries. The WBES universe of inference comprises non-agricultural, non-extractive formal firms with five or more employees (ISIC Rev. 3.1/4 manufacturing, construction, retail, and other services), stratified by sector, firm size (small 5–19, medium 20–99, large 100+ employees), and sub-national location; sample sizes are set to achieve 7.5% precision at 90% confidence (a minimum of 120 firms per stratum), and design weights are applied for population-representative estimates (World Bank, 2022). We use microdata from 45 Asian and Pacific economies across 98 country-year waves spanning 2003–2025. This coverage encompasses six UN M.49 Asian sub-regions: East Asia (China, HongKong, Korea, Mongolia, Taiwan), Southeast Asia (Brunei, Cambodia, Indonesia, Laos, Malaysia, Myanmar, Philippines, Singapore, Thailand, Timor-Leste, Vietnam), South Asia (Afghanistan, Bangladesh, Bhutan, India, Maldives, Nepal, Pakistan, Sri Lanka), Central Asia (Kazakhstan, Kyrgyz Republic, Tajikistan, Turkmenistan, Uzbekistan), West Asia (Bahrain, Iraq, Israel, Jordan, Kuwait, Lebanon, Qatar, Saudi Arabia, Yemen), and Pacific/SIDS (Fiji, Kiribati, Papua New Guinea, Samoa, Solomon Islands, Tonga, Vanuatu).</w:t>
-      </w:r>
-    </w:p>
-    <w:p>
-      <w:pPr>
-        <w:pStyle w:val="BodyText"/>
-      </w:pPr>
-      <w:r>
-        <w:t xml:space="preserve">The final analytical dataset contains 98,658 firm-observations (before applying outcome and FSTS non-missing requirements); imposing those requirements yields the M2 baseline estimation sample of 82,302 firm-observations, falling to 28,500 in M11 as digital-capability and managerial controls are added. We adopt a geographical definition of Asia following the United Nations Statistics Division M49 standard (United Nations Statistics Division, 2024), under which Asia comprises the Eastern, South-eastern, Southern, Central, and Western Asian sub-regions; the Pacific is added because the study frame is explicitly Asia-Pacific. To keep this geographical frame internally consistent, we exclude economies that straddle the Europe–Asia boundary and are conventionally treated as transcontinental: Türkiye and Cyprus, and the three South Caucasus economies (Armenia, Azerbaijan, Georgia) — all of which the World Bank operationally files under Europe &amp; Central Asia rather than Asia (World Bank, 2025). Comoros (Sub-Saharan Africa) is likewise excluded. Central Asia and the West-Asian Gulf and Levant are retained as undisputed parts of the Asian landmass. (A strict UN-M49 specification that re-includes Türkiye and Azerbaijan was examined and fails to identify the inverted-U, reinforcing the transcontinental exclusion.) Oman’s single available vintage (2003) lacks the productivity, export-intensity and digital-capability items and therefore does not enter the estimation sample. WBES designs are cross-sectional within each wave, with standardised instruments ensuring common variable definitions across economies and years. We apply three harmonisation steps: (1) variable-priority mapping for candidate items across PICS3 (2009–2013), Standardised (2014–2018), and BREADY/BEE (2019–2025) questionnaire generations; (2) encoding-robust reading (primary UTF-8 with Latin-1/CP1252 fallback); (3) deduplication — selecting the largest file per (country, year) pair when multiple uploads exist.</w:t>
+        <w:t xml:space="preserve">Data derive from the World Bank Enterprise Surveys (WBES), a stratified random-sample survey of formal private-sector enterprises conducted periodically across over 130 countries. The WBES universe of inference comprises non-agricultural, non-extractive formal firms with five or more employees (ISIC Rev. 3.1/4 manufacturing, construction, retail, and other services), stratified by sector, firm size (small 5–19, medium 20–99, large 100+ employees), and sub-national location; sample sizes are set to achieve 7.5% precision at 90% confidence (a minimum of 120 firms per stratum), and design weights are applied for population-representative estimates (World Bank, 2022). We use microdata from 45 Asian and Pacific economies across 98 country-year waves spanning 2003–2025. This coverage encompasses six UN M.49 Asian sub-regions: East Asia (China, HongKong, Korea, Mongolia, Taiwan), Southeast Asia (Brunei, Cambodia, Indonesia, Laos, Malaysia, Myanmar, Philippines, Singapore, Thailand, Timor-Leste, Vietnam), South Asia (Afghanistan, Bangladesh, Bhutan, India, Maldives, Nepal, Pakistan, Sri Lanka), Central Asia (Kazakhstan, Kyrgyz Republic, Tajikistan, Turkmenistan, Uzbekistan), West Asia (Bahrain, Iraq, Israel, Jordan, Kuwait, Lebanon, Qatar, Saudi Arabia, Yemen), and Pacific/SIDS (Fiji, Kiribati, Papua New Guinea, Samoa, Solomon Islands, Tonga, Vanuatu).</w:t>
+      </w:r>
+    </w:p>
+    <w:p>
+      <w:pPr>
+        <w:pStyle w:val="BodyText"/>
+      </w:pPr>
+      <w:r>
+        <w:t xml:space="preserve">The final analytical dataset contains 98,658 firm-observations (before applying outcome and FSTS non-missing requirements); imposing those requirements yields the M2 baseline estimation sample of 82,302 firm-observations, falling to 28,500 in M11 as digital-capability and managerial controls are added. We adopt a geographical definition of Asia following the United Nations Statistics Division M49 standard (United Nations Statistics Division, 2024), under which Asia comprises the Eastern, South-eastern, Southern, Central, and Western Asian sub-regions; the Pacific is added because the study frame is explicitly Asia-Pacific. To keep this geographical frame internally consistent, we exclude economies that straddle the Europe–Asia boundary and are conventionally treated as transcontinental: Türkiye and Cyprus, and the three South Caucasus economies (Armenia, Azerbaijan, Georgia) — all of which the World Bank operationally files under Europe &amp; Central Asia rather than Asia (World Bank, 2025). Comoros (Sub-Saharan Africa) is likewise excluded. Central Asia and the West-Asian Gulf and Levant are retained as undisputed parts of the Asian landmass. (A strict UN-M49 specification that re-includes Türkiye and Azerbaijan was examined and fails to identify the inverted-U, reinforcing the transcontinental exclusion.) Oman's single available vintage (2003) lacks the productivity, export-intensity and digital-capability items and therefore does not enter the estimation sample. WBES designs are cross-sectional within each wave, with standardised instruments ensuring common variable definitions across economies and years. We apply three harmonisation steps: (1) variable-priority mapping for candidate items across PICS3 (2009–2013), Standardised (2014–2018), and BREADY/BEE (2019–2025) questionnaire generations; (2) encoding-robust reading (primary UTF-8 with Latin-1/CP1252 fallback); (3) deduplication — selecting the largest file per (country, year) pair when multiple uploads exist.</w:t>
       </w:r>
     </w:p>
     <w:bookmarkEnd w:id="30"/>
-    <w:bookmarkStart w:id="31" w:name="variables"/>
+    <w:bookmarkStart w:id="31" w:name="Xbcf9f12e79107fa2c089aaf13fc6c4fb773f1c2"/>
     <w:p>
       <w:pPr>
         <w:pStyle w:val="Heading3"/>
@@ -1019,7 +1001,7 @@
       </w:r>
     </w:p>
     <w:bookmarkEnd w:id="31"/>
-    <w:bookmarkStart w:id="32" w:name="estimation-strategy"/>
+    <w:bookmarkStart w:id="32" w:name="X88d3b635b18ee197bee6ec760e4576787847be1"/>
     <w:p>
       <w:pPr>
         <w:pStyle w:val="Heading3"/>
@@ -1053,7 +1035,7 @@
       </w:r>
     </w:p>
     <w:bookmarkEnd w:id="32"/>
-    <w:bookmarkStart w:id="33" w:name="sample-sizes"/>
+    <w:bookmarkStart w:id="33" w:name="X7306ee6cc650c2a8c74023d786fd3b6ffa0ad4b"/>
     <w:p>
       <w:pPr>
         <w:pStyle w:val="Heading3"/>
@@ -1079,7 +1061,7 @@
     </w:p>
     <w:bookmarkEnd w:id="33"/>
     <w:bookmarkEnd w:id="34"/>
-    <w:bookmarkStart w:id="43" w:name="results"/>
+    <w:bookmarkStart w:id="43" w:name="X121719332867ee227f0a04b486098cee978c6e6"/>
     <w:p>
       <w:pPr>
         <w:pStyle w:val="Heading2"/>
@@ -1088,7 +1070,7 @@
         <w:t xml:space="preserve">4. Results</w:t>
       </w:r>
     </w:p>
-    <w:bookmarkStart w:id="35" w:name="descriptive-statistics-and-correlations"/>
+    <w:bookmarkStart w:id="35" w:name="X1a3b7383b8b125b3d271986dbdfbc78bb7f954a"/>
     <w:p>
       <w:pPr>
         <w:pStyle w:val="Heading3"/>
@@ -1106,7 +1088,7 @@
       </w:r>
     </w:p>
     <w:bookmarkEnd w:id="35"/>
-    <w:bookmarkStart w:id="36" w:name="main-effect-inverted-u-h1"/>
+    <w:bookmarkStart w:id="36" w:name="Xdbf83b4a83d0a9c63e43fc4d25cefed1772f7cd"/>
     <w:p>
       <w:pPr>
         <w:pStyle w:val="Heading3"/>
@@ -1154,7 +1136,7 @@
       </w:r>
     </w:p>
     <w:bookmarkEnd w:id="36"/>
-    <w:bookmarkStart w:id="37" w:name="technological-capability-moderation-h2"/>
+    <w:bookmarkStart w:id="37" w:name="X9595a9bb339e08d65399a059096afa9ae72a457"/>
     <w:p>
       <w:pPr>
         <w:pStyle w:val="Heading3"/>
@@ -1204,7 +1186,7 @@
         <w:pStyle w:val="Compact"/>
       </w:pPr>
       <w:r>
-        <w:t xml:space="preserve">FSTS×TCI: β = −0.111 (NS) — the ascending limb interaction is not significant</w:t>
+        <w:t xml:space="preserve">FSTS×TCI: β = −0.090 (NS) — the ascending limb interaction is not significant</w:t>
       </w:r>
     </w:p>
     <w:p>
@@ -1216,7 +1198,7 @@
         <w:pStyle w:val="Compact"/>
       </w:pPr>
       <w:r>
-        <w:t xml:space="preserve">FSTS²×TCI: β = −0.191 (NS in M7; remains NS in M8, p = .077)</w:t>
+        <w:t xml:space="preserve">FSTS²×TCI: β = −0.227 (NS in M7; remains NS in M8, p = .077)</w:t>
       </w:r>
     </w:p>
     <w:p>
@@ -1246,7 +1228,7 @@
       </w:r>
     </w:p>
     <w:bookmarkEnd w:id="37"/>
-    <w:bookmarkStart w:id="38" w:name="digital-adoption-moderation-h3"/>
+    <w:bookmarkStart w:id="38" w:name="X151158cb9bb4ce58412a9381bb2aaa4f708d4d3"/>
     <w:p>
       <w:pPr>
         <w:pStyle w:val="Heading3"/>
@@ -1272,289 +1254,237 @@
         <w:pStyle w:val="BodyText"/>
       </w:pPr>
       <w:r>
-        <w:t xml:space="preserve">When DAI is added to M7, the DAI main effect is positive and statistically significant (β = +0.172, p &lt; .001), consistent with approximately a 19% performance premium for digitally active firms (exp(0.172) − 1 ≈ 19%). Strikingly, both DAI interaction terms are statistically significant in M8: FSTS×DAI = −0.588 (p &lt; .001,</w:t>
-      </w:r>
-      <w:r>
-        <w:t xml:space="preserve"> </w:t>
-      </w:r>
+        <w:t xml:space="preserve">When DAI is added to M7, the DAI main effect is positive and statistically significant (β = +0.172, p &lt; .001), consistent with approximately a 19% performance premium for digitally active firms (exp(0.172) − 1 ≈ 19%). Strikingly, both DAI interaction terms are statistically significant in M8: FSTS×DAI = −0.588 (p &lt; .001, ***) and FSTS²×DAI = +0.726 (p = .002, **). The interaction pattern — negative FSTS×DAI and positive FSTS²×DAI — means that high-DAI firms experience a flatter, shifted I–P curve: lower productivity gains per unit of FSTS at low export intensities (sunk adoption costs, or selection of productivity-constrained firms into digital adoption), but significantly smaller performance declines at high FSTS (digital infrastructure supporting cross-border coordination at scale). This result strengthens further in M9 with manager controls: FSTS×DAI = −0.786 (p &lt; .001, ***) and FSTS²×DAI = +0.982 (p &lt; .001, ***). The inverted-U is maintained in both specifications (M8: TP = 34.2%; M9: TP = 32.2%).</w:t>
+      </w:r>
+    </w:p>
+    <w:p>
+      <w:pPr>
+        <w:pStyle w:val="BodyText"/>
+      </w:pPr>
       <w:r>
         <w:rPr>
           <w:bCs/>
           <w:b/>
-          <w:iCs/>
-          <w:i/>
-        </w:rPr>
-        <w:t xml:space="preserve">) and FSTS²×DAI = +0.726 (p = .002,</w:t>
-      </w:r>
+        </w:rPr>
+        <w:t xml:space="preserve">H3 is supported.</w:t>
+      </w:r>
+      <w:r>
+        <w:t xml:space="preserve"> </w:t>
+      </w:r>
+      <w:r>
+        <w:t xml:space="preserve">DAI raises firm performance by approximately 19% and significantly reshapes the I–P curve — compressing the ascending limb and attenuating the performance decline at high FSTS — even before controlling for managerial characteristics. This is the primary capability-moderating finding of the study.</w:t>
+      </w:r>
+    </w:p>
+    <w:bookmarkEnd w:id="38"/>
+    <w:bookmarkStart w:id="39" w:name="X8c2848f12d916aaecc7d070f2d4e848d015e61e"/>
+    <w:p>
+      <w:pPr>
+        <w:pStyle w:val="Heading3"/>
+      </w:pPr>
+      <w:r>
+        <w:t xml:space="preserve">4.5 Managerial Characteristics (H4)</w:t>
+      </w:r>
+    </w:p>
+    <w:p>
+      <w:pPr>
+        <w:pStyle w:val="FirstParagraph"/>
+      </w:pPr>
+      <w:r>
+        <w:rPr>
+          <w:iCs/>
+          <w:i/>
+        </w:rPr>
+        <w:t xml:space="preserve">Table 2, Model M9.</w:t>
+      </w:r>
+    </w:p>
+    <w:p>
+      <w:pPr>
+        <w:pStyle w:val="BodyText"/>
+      </w:pPr>
+      <w:r>
+        <w:t xml:space="preserve">Manager experience (β = +0.018, p &lt; .001) and female top manager (β = +0.202, p &lt; .001) both raise firm performance independently of FSTS in M9. The experience effect implies approximately 2% higher labour productivity per additional year of sectoral experience; the female top manager effect implies approximately a 22% performance premium (exp(0.202) − 1 ≈ 22%). The FSTS×manager_experience interaction is not significant in either M9 (β = +0.005, p = .29) or M11 (β = +0.007, p = .26), indicating that managerial experience operates as a level shifter rather than a moderator of the I–P curve.</w:t>
+      </w:r>
+    </w:p>
+    <w:p>
+      <w:pPr>
+        <w:pStyle w:val="BodyText"/>
+      </w:pPr>
       <w:r>
         <w:rPr>
           <w:bCs/>
           <w:b/>
-          <w:iCs/>
-          <w:i/>
-        </w:rPr>
-        <w:t xml:space="preserve"> </w:t>
-      </w:r>
-      <w:r>
-        <w:rPr>
-          <w:iCs/>
-          <w:i/>
-        </w:rPr>
-        <w:t xml:space="preserve">). The interaction pattern — negative FSTS×DAI and positive FSTS²×DAI — means that high-DAI firms experience a flatter, shifted I–P curve: lower productivity gains per unit of FSTS at low export intensities (sunk adoption costs, or selection of productivity-constrained firms into digital adoption), but significantly smaller performance declines at high FSTS (digital infrastructure supporting cross-border coordination at scale). This result strengthens further in M9 with manager controls: FSTS×DAI = −0.786 (p &lt; .001,</w:t>
-      </w:r>
-      <w:r>
-        <w:rPr>
-          <w:iCs/>
-          <w:i/>
-        </w:rPr>
-        <w:t xml:space="preserve"> </w:t>
-      </w:r>
+        </w:rPr>
+        <w:t xml:space="preserve">H4 is partially supported.</w:t>
+      </w:r>
+      <w:r>
+        <w:t xml:space="preserve"> </w:t>
+      </w:r>
+      <w:r>
+        <w:t xml:space="preserve">Top manager experience and female management improve firm performance (level effects confirmed). The curve-moderating effect of manager experience is absent in both M9 and M11; managerial characteristics shift the performance level without reshaping the I–P curve.</w:t>
+      </w:r>
+    </w:p>
+    <w:bookmarkEnd w:id="39"/>
+    <w:bookmarkStart w:id="40" w:name="Xa3f0408b049fb96786efb222e5b901022bb2da2"/>
+    <w:p>
+      <w:pPr>
+        <w:pStyle w:val="Heading3"/>
+      </w:pPr>
+      <w:r>
+        <w:t xml:space="preserve">4.6 Institutional Regime Moderation (H5)</w:t>
+      </w:r>
+    </w:p>
+    <w:p>
+      <w:pPr>
+        <w:pStyle w:val="FirstParagraph"/>
+      </w:pPr>
+      <w:r>
+        <w:rPr>
+          <w:iCs/>
+          <w:i/>
+        </w:rPr>
+        <w:t xml:space="preserve">Table 2, Model M10.</w:t>
+      </w:r>
+    </w:p>
+    <w:p>
+      <w:pPr>
+        <w:pStyle w:val="BodyText"/>
+      </w:pPr>
+      <w:r>
+        <w:t xml:space="preserve">The ICRV group main effect (β = +0.592, p &lt; .001) indicates that — controlling for TCI, DAI, and firm characteristics — each step up the ICRV scale (from Group I to VI, i.e., from stronger to weaker institutions) is associated with approximately an 81% higher labour productivity level (exp(0.592) − 1 ≈ 81%). This counter-intuitive</w:t>
+      </w:r>
+      <w:r>
+        <w:t xml:space="preserve"> </w:t>
+      </w:r>
+      <w:r>
+        <w:rPr>
+          <w:iCs/>
+          <w:i/>
+        </w:rPr>
+        <w:t xml:space="preserve">positive</w:t>
+      </w:r>
+      <w:r>
+        <w:t xml:space="preserve"> </w:t>
+      </w:r>
+      <w:r>
+        <w:t xml:space="preserve">ICRV coefficient reflects that nominal sales-per-worker is higher in economies with lower price levels (typical of frontier/emerging economies), and country-year fixed effects were not included in M10 to preserve the institutional regime as the key moderator of interest.</w:t>
+      </w:r>
+    </w:p>
+    <w:p>
+      <w:pPr>
+        <w:pStyle w:val="BodyText"/>
+      </w:pPr>
+      <w:r>
+        <w:t xml:space="preserve">More relevant for H5 are the interaction terms: FSTS×ICRV (β = +1.849, p &lt; .001) and FSTS²×ICRV (β = −2.932, p &lt; .001). The negative FSTS²×ICRV term indicates that the</w:t>
+      </w:r>
+      <w:r>
+        <w:t xml:space="preserve"> </w:t>
+      </w:r>
+      <w:r>
+        <w:rPr>
+          <w:iCs/>
+          <w:i/>
+        </w:rPr>
+        <w:t xml:space="preserve">concavity</w:t>
+      </w:r>
+      <w:r>
+        <w:t xml:space="preserve"> </w:t>
+      </w:r>
+      <w:r>
+        <w:t xml:space="preserve">of the I–P curve deepens as institutions weaken (higher ICRV group): the inverted-U is sharpest in frontier and vulnerable regimes and flattest — even mildly convex within the observed range — in the strongest-institution group. Decomposing by ICRV group, the estimated turning points cluster near 40% FSTS rather than migrating monotonically; the institutional regime governs the</w:t>
+      </w:r>
+      <w:r>
+        <w:t xml:space="preserve"> </w:t>
+      </w:r>
+      <w:r>
+        <w:rPr>
+          <w:iCs/>
+          <w:i/>
+        </w:rPr>
+        <w:t xml:space="preserve">strength of the concavity</w:t>
+      </w:r>
+      <w:r>
+        <w:t xml:space="preserve"> </w:t>
+      </w:r>
+      <w:r>
+        <w:t xml:space="preserve">more than the exact location of the peak. This pattern is consistent with firms in institutionally weaker environments facing steeper diminishing returns to deep export commitment, while firms in advanced regimes exhibit a flatter, more linear I–P profile across the observed range.</w:t>
+      </w:r>
+    </w:p>
+    <w:p>
+      <w:pPr>
+        <w:pStyle w:val="BodyText"/>
+      </w:pPr>
       <w:r>
         <w:rPr>
           <w:bCs/>
           <w:b/>
         </w:rPr>
-        <w:t xml:space="preserve">) and FSTS²×DAI = +0.982 (p &lt; .001,</w:t>
-      </w:r>
+        <w:t xml:space="preserve">H5 is supported.</w:t>
+      </w:r>
+      <w:r>
+        <w:t xml:space="preserve"> </w:t>
+      </w:r>
+      <w:r>
+        <w:t xml:space="preserve">The ICRV institutional regime systematically moderates the slope and curvature of the I–P function, with the concavity of the inverted-U deepening as institutional quality declines.</w:t>
+      </w:r>
+    </w:p>
+    <w:bookmarkEnd w:id="40"/>
+    <w:bookmarkStart w:id="41" w:name="Xa51c5497f5122fc9a49f126906c933c8949a1b3"/>
+    <w:p>
+      <w:pPr>
+        <w:pStyle w:val="Heading3"/>
+      </w:pPr>
+      <w:r>
+        <w:t xml:space="preserve">4.7 Full Three-Way Moderation (H6)</w:t>
+      </w:r>
+    </w:p>
+    <w:p>
+      <w:pPr>
+        <w:pStyle w:val="FirstParagraph"/>
+      </w:pPr>
+      <w:r>
+        <w:rPr>
+          <w:iCs/>
+          <w:i/>
+        </w:rPr>
+        <w:t xml:space="preserve">Table 2, Model M11.</w:t>
+      </w:r>
+    </w:p>
+    <w:p>
+      <w:pPr>
+        <w:pStyle w:val="BodyText"/>
+      </w:pPr>
+      <w:r>
+        <w:t xml:space="preserve">The capstone model adds all three-way interactions (FSTS×DAI×ICRV, plus constituent lower-order interactions). The Lind–Mehlum test in M11 confirms the inverted-U (TP = 25.7%, LM p = .026), establishing that the inverted-U shape holds even in the most demanding specification. The DAI×ICRV interaction (β = +0.052, p = .049, *) is statistically significant, consistent with the CDCM prediction that digital capabilities provide stronger per-unit performance effects in weaker institutional environments. The three-way FSTS×DAI×ICRV term (β = −0.016, NS) is not significant, indicating that the DAI curve-reshaping effect documented in M8/M9 does not systematically vary across the ICRV regime gradient in this specification.</w:t>
+      </w:r>
+    </w:p>
+    <w:p>
+      <w:pPr>
+        <w:pStyle w:val="BodyText"/>
+      </w:pPr>
+      <w:r>
+        <w:t xml:space="preserve">AdjR² = .057 in M11 (vs. .039 in M10) indicates meaningful incremental fit from adding the three-way moderation structure.</w:t>
+      </w:r>
+    </w:p>
+    <w:p>
+      <w:pPr>
+        <w:pStyle w:val="BodyText"/>
+      </w:pPr>
       <w:r>
         <w:rPr>
           <w:bCs/>
           <w:b/>
         </w:rPr>
-        <w:t xml:space="preserve"> </w:t>
-      </w:r>
-      <w:r>
-        <w:t xml:space="preserve">*). The inverted-U is maintained in both specifications (M8: TP = 34.2%; M9: TP = 32.2%).</w:t>
-      </w:r>
-    </w:p>
-    <w:p>
-      <w:pPr>
-        <w:pStyle w:val="BodyText"/>
-      </w:pPr>
-      <w:r>
-        <w:rPr>
-          <w:bCs/>
-          <w:b/>
-        </w:rPr>
-        <w:t xml:space="preserve">H3 is supported.</w:t>
-      </w:r>
-      <w:r>
-        <w:t xml:space="preserve"> </w:t>
-      </w:r>
-      <w:r>
-        <w:t xml:space="preserve">DAI raises firm performance by approximately 19% and significantly reshapes the I–P curve — compressing the ascending limb and attenuating the performance decline at high FSTS — even before controlling for managerial characteristics. This is the primary capability-moderating finding of the study.</w:t>
-      </w:r>
-    </w:p>
-    <w:bookmarkEnd w:id="38"/>
-    <w:bookmarkStart w:id="39" w:name="managerial-characteristics-h4-1"/>
-    <w:p>
-      <w:pPr>
-        <w:pStyle w:val="Heading3"/>
-      </w:pPr>
-      <w:r>
-        <w:t xml:space="preserve">4.5 Managerial Characteristics (H4)</w:t>
-      </w:r>
-    </w:p>
-    <w:p>
-      <w:pPr>
-        <w:pStyle w:val="FirstParagraph"/>
-      </w:pPr>
-      <w:r>
-        <w:rPr>
-          <w:iCs/>
-          <w:i/>
-        </w:rPr>
-        <w:t xml:space="preserve">Table 2, Model M9.</w:t>
-      </w:r>
-    </w:p>
-    <w:p>
-      <w:pPr>
-        <w:pStyle w:val="BodyText"/>
-      </w:pPr>
-      <w:r>
-        <w:t xml:space="preserve">Manager experience (β = +0.018, p &lt; .001) and female top manager (β = +0.202, p &lt; .001) both raise firm performance independently of FSTS in M9. The experience effect implies approximately 2% higher labour productivity per additional year of sectoral experience; the female top manager effect implies approximately a 22% performance premium (exp(0.202) − 1 ≈ 22%). The FSTS×manager_experience interaction is not significant in either M9 (β = +0.005, p = .29) or M11 (β = +0.007, p = .26), indicating that managerial experience operates as a level shifter rather than a moderator of the I–P curve.</w:t>
-      </w:r>
-    </w:p>
-    <w:p>
-      <w:pPr>
-        <w:pStyle w:val="BodyText"/>
-      </w:pPr>
-      <w:r>
-        <w:rPr>
-          <w:bCs/>
-          <w:b/>
-        </w:rPr>
-        <w:t xml:space="preserve">H4 is partially supported.</w:t>
-      </w:r>
-      <w:r>
-        <w:t xml:space="preserve"> </w:t>
-      </w:r>
-      <w:r>
-        <w:t xml:space="preserve">Top manager experience and female management improve firm performance (level effects confirmed). The curve-moderating effect of manager experience is absent in both M9 and M11; managerial characteristics shift the performance level without reshaping the I–P curve.</w:t>
-      </w:r>
-    </w:p>
-    <w:bookmarkEnd w:id="39"/>
-    <w:bookmarkStart w:id="40" w:name="institutional-regime-moderation-h5"/>
-    <w:p>
-      <w:pPr>
-        <w:pStyle w:val="Heading3"/>
-      </w:pPr>
-      <w:r>
-        <w:t xml:space="preserve">4.6 Institutional Regime Moderation (H5)</w:t>
-      </w:r>
-    </w:p>
-    <w:p>
-      <w:pPr>
-        <w:pStyle w:val="FirstParagraph"/>
-      </w:pPr>
-      <w:r>
-        <w:rPr>
-          <w:iCs/>
-          <w:i/>
-        </w:rPr>
-        <w:t xml:space="preserve">Table 2, Model M10.</w:t>
-      </w:r>
-    </w:p>
-    <w:p>
-      <w:pPr>
-        <w:pStyle w:val="BodyText"/>
-      </w:pPr>
-      <w:r>
-        <w:t xml:space="preserve">The ICRV group main effect (β = +0.592, p &lt; .001) indicates that — controlling for TCI, DAI, and firm characteristics — each step up the ICRV scale (from Group I to VI, i.e., from stronger to weaker institutions) is associated with approximately an 81% higher labour productivity level (exp(0.592) − 1 ≈ 81%). This counter-intuitive</w:t>
-      </w:r>
-      <w:r>
-        <w:t xml:space="preserve"> </w:t>
-      </w:r>
-      <w:r>
-        <w:rPr>
-          <w:iCs/>
-          <w:i/>
-        </w:rPr>
-        <w:t xml:space="preserve">positive</w:t>
-      </w:r>
-      <w:r>
-        <w:t xml:space="preserve"> </w:t>
-      </w:r>
-      <w:r>
-        <w:t xml:space="preserve">ICRV coefficient reflects that nominal sales-per-worker is higher in economies with lower price levels (typical of frontier/emerging economies), and country-year fixed effects were not included in M10 to preserve the institutional regime as the key moderator of interest.</w:t>
-      </w:r>
-    </w:p>
-    <w:p>
-      <w:pPr>
-        <w:pStyle w:val="BodyText"/>
-      </w:pPr>
-      <w:r>
-        <w:t xml:space="preserve">More relevant for H5 are the interaction terms: FSTS×ICRV (β = +1.849, p &lt; .001) and FSTS²×ICRV (β = −2.932, p &lt; .001). The negative FSTS²×ICRV term indicates that the</w:t>
-      </w:r>
-      <w:r>
-        <w:t xml:space="preserve"> </w:t>
-      </w:r>
-      <w:r>
-        <w:rPr>
-          <w:iCs/>
-          <w:i/>
-        </w:rPr>
-        <w:t xml:space="preserve">concavity</w:t>
-      </w:r>
-      <w:r>
-        <w:t xml:space="preserve"> </w:t>
-      </w:r>
-      <w:r>
-        <w:t xml:space="preserve">of the I–P curve deepens as institutions weaken (higher ICRV group): the inverted-U is sharpest in frontier and vulnerable regimes and flattest — even mildly convex within the observed range — in the strongest-institution group. Decomposing by ICRV group, the estimated turning points cluster near 40% FSTS rather than migrating monotonically; the institutional regime governs the</w:t>
-      </w:r>
-      <w:r>
-        <w:t xml:space="preserve"> </w:t>
-      </w:r>
-      <w:r>
-        <w:rPr>
-          <w:iCs/>
-          <w:i/>
-        </w:rPr>
-        <w:t xml:space="preserve">strength of the concavity</w:t>
-      </w:r>
-      <w:r>
-        <w:t xml:space="preserve"> </w:t>
-      </w:r>
-      <w:r>
-        <w:t xml:space="preserve">more than the exact location of the peak. This pattern is consistent with firms in institutionally weaker environments facing steeper diminishing returns to deep export commitment, while firms in advanced regimes exhibit a flatter, more linear I–P profile across the observed range.</w:t>
-      </w:r>
-    </w:p>
-    <w:p>
-      <w:pPr>
-        <w:pStyle w:val="BodyText"/>
-      </w:pPr>
-      <w:r>
-        <w:rPr>
-          <w:bCs/>
-          <w:b/>
-        </w:rPr>
-        <w:t xml:space="preserve">H5 is supported.</w:t>
-      </w:r>
-      <w:r>
-        <w:t xml:space="preserve"> </w:t>
-      </w:r>
-      <w:r>
-        <w:t xml:space="preserve">The ICRV institutional regime systematically moderates the slope and curvature of the I–P function, with the concavity of the inverted-U deepening as institutional quality declines.</w:t>
-      </w:r>
-    </w:p>
-    <w:bookmarkEnd w:id="40"/>
-    <w:bookmarkStart w:id="41" w:name="full-three-way-moderation-h6"/>
-    <w:p>
-      <w:pPr>
-        <w:pStyle w:val="Heading3"/>
-      </w:pPr>
-      <w:r>
-        <w:t xml:space="preserve">4.7 Full Three-Way Moderation (H6)</w:t>
-      </w:r>
-    </w:p>
-    <w:p>
-      <w:pPr>
-        <w:pStyle w:val="FirstParagraph"/>
-      </w:pPr>
-      <w:r>
-        <w:rPr>
-          <w:iCs/>
-          <w:i/>
-        </w:rPr>
-        <w:t xml:space="preserve">Table 2, Model M11.</w:t>
-      </w:r>
-    </w:p>
-    <w:p>
-      <w:pPr>
-        <w:pStyle w:val="BodyText"/>
-      </w:pPr>
-      <w:r>
-        <w:t xml:space="preserve">The capstone model adds all three-way interactions (FSTS×DAI×ICRV, plus constituent lower-order interactions). The Lind–Mehlum test in M11 confirms the inverted-U (TP = 25.7%, LM p = .026), establishing that the inverted-U shape holds even in the most demanding specification. The DAI×ICRV interaction (β = +0.052, p = .049, *) is statistically significant, consistent with the CDCM prediction that digital capabilities provide stronger per-unit performance effects in weaker institutional environments. The three-way FSTS×DAI×ICRV term (β = −0.016, NS) is not significant, indicating that the DAI curve-reshaping effect documented in M8/M9 does not systematically vary across the ICRV regime gradient in this specification.</w:t>
-      </w:r>
-    </w:p>
-    <w:p>
-      <w:pPr>
-        <w:pStyle w:val="BodyText"/>
-      </w:pPr>
-      <w:r>
-        <w:t xml:space="preserve">AdjR² = .057 in M11 (vs. .039 in M10) indicates meaningful incremental fit from adding the three-way moderation structure.</w:t>
-      </w:r>
-    </w:p>
-    <w:p>
-      <w:pPr>
-        <w:pStyle w:val="BodyText"/>
-      </w:pPr>
-      <w:r>
-        <w:rPr>
-          <w:bCs/>
-          <w:b/>
-        </w:rPr>
         <w:t xml:space="preserve">H6 (three-way interaction) partially supported; M11 inverted-U is confirmed.</w:t>
       </w:r>
       <w:r>
         <w:t xml:space="preserve"> </w:t>
       </w:r>
       <w:r>
-        <w:t xml:space="preserve">The DAI×ICRV main interaction is statistically significant (p = .049), supporting regime-contingent digital effects. The three-way FSTS curve-reshaping via DAI×ICRV does not reach statistical significance — the WBES DAI measure’s limited dimensionality (Tier 1–2 only) likely constrains detection of the full CDCM-predicted interaction.</w:t>
+        <w:t xml:space="preserve">The DAI×ICRV main interaction is statistically significant (p = .049), supporting regime-contingent digital effects. The three-way FSTS curve-reshaping via DAI×ICRV does not reach statistical significance — the WBES DAI measure's limited dimensionality (Tier 1–2 only) likely constrains detection of the full CDCM-predicted interaction.</w:t>
       </w:r>
     </w:p>
     <w:bookmarkEnd w:id="41"/>
-    <w:bookmarkStart w:id="42" w:name="multidimensional-performance-robustness"/>
+    <w:bookmarkStart w:id="42" w:name="X9026e2d91d64d9a264150c07f326e7e8bdce6ed"/>
     <w:p>
       <w:pPr>
         <w:pStyle w:val="Heading3"/>
@@ -1644,7 +1574,7 @@
     </w:p>
     <w:bookmarkEnd w:id="42"/>
     <w:bookmarkEnd w:id="43"/>
-    <w:bookmarkStart w:id="50" w:name="discussion"/>
+    <w:bookmarkStart w:id="50" w:name="X735612638e4e736e4693e459c258977262c0dfc"/>
     <w:p>
       <w:pPr>
         <w:pStyle w:val="Heading2"/>
@@ -1653,7 +1583,7 @@
         <w:t xml:space="preserve">5. Discussion</w:t>
       </w:r>
     </w:p>
-    <w:bookmarkStart w:id="44" w:name="X578d84a21b3accaf1a7ada71f01c76c882cdaa8"/>
+    <w:bookmarkStart w:id="44" w:name="Xa5e458aa0b11713615a3f2356b399357e6a6289"/>
     <w:p>
       <w:pPr>
         <w:pStyle w:val="Heading3"/>
@@ -1723,7 +1653,7 @@
         <w:t xml:space="preserve"> </w:t>
       </w:r>
       <w:r>
-        <w:t xml:space="preserve">reframes the two-decade debate over the shape of the I–P curve. The inverted-U holds across all six ICRV regime groups (H1), but its shape is not a fixed structural parameter: the institutional regime governs the curve’s</w:t>
+        <w:t xml:space="preserve">reframes the two-decade debate over the shape of the I–P curve. The inverted-U holds across all six ICRV regime groups (H1), but its shape is not a fixed structural parameter: the institutional regime governs the curve's</w:t>
       </w:r>
       <w:r>
         <w:t xml:space="preserve"> </w:t>
@@ -1847,7 +1777,7 @@
       </w:r>
     </w:p>
     <w:bookmarkEnd w:id="44"/>
-    <w:bookmarkStart w:id="45" w:name="resolution-of-cross-study-heterogeneity"/>
+    <w:bookmarkStart w:id="45" w:name="X381ae9f4c7122165334ae4257eca14a0f447839"/>
     <w:p>
       <w:pPr>
         <w:pStyle w:val="Heading3"/>
@@ -1861,11 +1791,11 @@
         <w:pStyle w:val="FirstParagraph"/>
       </w:pPr>
       <w:r>
-        <w:t xml:space="preserve">The central finding — an inverted-U with a turning point at approximately 37% foreign sales intensity, robust across 45 economies and six ICRV groups — offers a parsimonious resolution to apparent inconsistencies in the Asian I–P literature. Studies finding positive linear effects (Pangarkar, 2008: Singapore; Cho et al., 2023: Korea) are working with samples centred well below the 36% turning point; their firms are on the ascending limb. Studies finding null or negative results (Mondal et al., 2022: India family firms) may be capturing firms above the turning point in a high-WBES-wave year. Our ICRV moderation result provides a further refinement: the concavity of the curve deepens as institutions weaken, so studies in frontier economies are likely to detect a sharper inverted-U, while studies in institutionally advanced economies tend to observe a flatter, more linear ascending profile across the observed export-intensity range.</w:t>
+        <w:t xml:space="preserve">The central finding — an inverted-U with a turning point at approximately 37% foreign sales intensity, robust across 45 economies and six ICRV groups — offers a parsimonious resolution to apparent inconsistencies in the Asian I–P literature. Studies finding positive linear effects (Pangarkar, 2008: Singapore; Cho et al., 2023: Korea) are working with samples centred well below the 37% turning point; their firms are on the ascending limb. Studies finding null or negative results (Mondal et al., 2022: India family firms) may be capturing firms above the turning point in a high-WBES-wave year. Our ICRV moderation result provides a further refinement: the concavity of the curve deepens as institutions weaken, so studies in frontier economies are likely to detect a sharper inverted-U, while studies in institutionally advanced economies tend to observe a flatter, more linear ascending profile across the observed export-intensity range.</w:t>
       </w:r>
     </w:p>
     <w:bookmarkEnd w:id="45"/>
-    <w:bookmarkStart w:id="46" w:name="technology-as-amplifier-not-moderator"/>
+    <w:bookmarkStart w:id="46" w:name="Xaae4211195cfb5cc72c709e3e6b6982f655cd35"/>
     <w:p>
       <w:pPr>
         <w:pStyle w:val="Heading3"/>
@@ -1883,7 +1813,7 @@
       </w:r>
     </w:p>
     <w:bookmarkEnd w:id="46"/>
-    <w:bookmarkStart w:id="47" w:name="Xf6197b5ae9fc313cd14220a896ca012fd7330cf"/>
+    <w:bookmarkStart w:id="47" w:name="Xafc58fd22326ac90adecd20d47a61dc10c32f54"/>
     <w:p>
       <w:pPr>
         <w:pStyle w:val="Heading3"/>
@@ -1897,11 +1827,11 @@
         <w:pStyle w:val="FirstParagraph"/>
       </w:pPr>
       <w:r>
-        <w:t xml:space="preserve">The capability-complementarity curve reshaping found for DAI in M9 — and the significant DAI×ICRV interaction (β = +0.052, p = .049) in M11 — provides the first multi-economy evidence for the CDCM prediction that digital capabilities’ performance effects are context-contingent. In institutionally stronger economies (Group I–II), digital infrastructure is near-universal and therefore provides competitive advantage only to early adopters at the margin; in weaker institutional environments (Group IV–VI), digital adoption remains differentiating. The implication is that policies promoting digitalisation in frontier economies are likely to generate stronger firm-level returns per unit of adoption than equivalent policies in advanced economies.</w:t>
+        <w:t xml:space="preserve">The capability-complementarity curve reshaping found for DAI in M9 — and the significant DAI×ICRV interaction (β = +0.052, p = .049) in M11 — provides the first multi-economy evidence for the CDCM prediction that digital capabilities' performance effects are context-contingent. In institutionally stronger economies (Group I–II), digital infrastructure is near-universal and therefore provides competitive advantage only to early adopters at the margin; in weaker institutional environments (Group IV–VI), digital adoption remains differentiating. The implication is that policies promoting digitalisation in frontier economies are likely to generate stronger firm-level returns per unit of adoption than equivalent policies in advanced economies.</w:t>
       </w:r>
     </w:p>
     <w:bookmarkEnd w:id="47"/>
-    <w:bookmarkStart w:id="48" w:name="managerial-heterogeneity"/>
+    <w:bookmarkStart w:id="48" w:name="Xa40539f42ceb0265beaf64c7d98f70ca0ae101a"/>
     <w:p>
       <w:pPr>
         <w:pStyle w:val="Heading3"/>
@@ -1939,11 +1869,11 @@
         <w:t xml:space="preserve"> </w:t>
       </w:r>
       <w:r>
-        <w:t xml:space="preserve">policy note (Buchhave et al., 2026) documents that women who hold management positions have cleared exceptional retention barriers: childbirth reduces women’s wage employment probability by 8.1 percentage points and urban household income by 27%, with no significant effect on fathers. Women who reach managerial rank therefore represent a highly selected and committed workforce stratum, consistent with the productivity premium we estimate. At the sector level, IFC (2022) similarly documents that female leadership in Vietnamese banking is associated with superior risk management and stakeholder orientation — the relational-capital mechanisms posited by Upper Echelons Theory (Hambrick &amp; Mason, 1984). These convergent pieces of evidence strengthen the interpretation that the WBES-estimated premium reflects genuine managerial capability rather than endogenous selection into high-productivity firms.</w:t>
+        <w:t xml:space="preserve">policy note (Buchhave et al., 2026) documents that women who hold management positions have cleared exceptional retention barriers: childbirth reduces women's wage employment probability by 8.1 percentage points and urban household income by 27%, with no significant effect on fathers. Women who reach managerial rank therefore represent a highly selected and committed workforce stratum, consistent with the productivity premium we estimate. At the sector level, IFC (2022) similarly documents that female leadership in Vietnamese banking is associated with superior risk management and stakeholder orientation — the relational-capital mechanisms posited by Upper Echelons Theory (Hambrick &amp; Mason, 1984). These convergent pieces of evidence strengthen the interpretation that the WBES-estimated premium reflects genuine managerial capability rather than endogenous selection into high-productivity firms.</w:t>
       </w:r>
     </w:p>
     <w:bookmarkEnd w:id="48"/>
-    <w:bookmarkStart w:id="49" w:name="limitations"/>
+    <w:bookmarkStart w:id="49" w:name="X268c916b26bbeb1e0111743927fd75743ff83ab"/>
     <w:p>
       <w:pPr>
         <w:pStyle w:val="Heading3"/>
@@ -1957,25 +1887,7 @@
         <w:pStyle w:val="FirstParagraph"/>
       </w:pPr>
       <w:r>
-        <w:t xml:space="preserve">Three inferential constraints bound these findings. First, WBES is a cross-sectional design: the term</w:t>
-      </w:r>
-      <w:r>
-        <w:t xml:space="preserve"> </w:t>
-      </w:r>
-      <w:r>
-        <w:t xml:space="preserve">“</w:t>
-      </w:r>
-      <w:r>
-        <w:t xml:space="preserve">performance</w:t>
-      </w:r>
-      <w:r>
-        <w:t xml:space="preserve">”</w:t>
-      </w:r>
-      <w:r>
-        <w:t xml:space="preserve"> </w:t>
-      </w:r>
-      <w:r>
-        <w:t xml:space="preserve">throughout refers to a contemporaneous association between FSTS and labour productivity in a given survey year, not a panel-tracked causal effect. The IV strategy used in P3 Vietnam to address selection into exporting is not available at scale across 34 economies. Second, the DAI measure is limited to Tier 1 (website) and Tier 2 (e-payment) capabilities in most WBES waves; the richer digital capability dimensions captured in more recent BEE-schema waves are not yet available for the majority of economies. Third, the dataset covers 45 ICRV-mapped economies across six regime groups; Oman’s only available wave (2003) lacks the core productivity and export-intensity items and so does not enter the estimation sample. Future waves of the Oman WBES would sharpen Group II estimates.</w:t>
+        <w:t xml:space="preserve">Three inferential constraints bound these findings. First, WBES is a cross-sectional design: the term "performance" throughout refers to a contemporaneous association between FSTS and labour productivity in a given survey year, not a panel-tracked causal effect. The IV strategy used in P3 Vietnam to address selection into exporting is not available at scale across 34 economies. Second, the DAI measure is limited to Tier 1 (website) and Tier 2 (e-payment) capabilities in most WBES waves; the richer digital capability dimensions captured in more recent BEE-schema waves are not yet available for the majority of economies. Third, the dataset covers 45 ICRV-mapped economies across six regime groups; Oman's only available wave (2003) lacks the core productivity and export-intensity items and so does not enter the estimation sample. Future waves of the Oman WBES would sharpen Group II estimates.</w:t>
       </w:r>
     </w:p>
     <w:p>
@@ -1987,7 +1899,7 @@
     </w:p>
     <w:bookmarkEnd w:id="49"/>
     <w:bookmarkEnd w:id="50"/>
-    <w:bookmarkStart w:id="51" w:name="conclusions"/>
+    <w:bookmarkStart w:id="51" w:name="X56025c6d9dbf7520f7a7df11f905cdd09f46e4a"/>
     <w:p>
       <w:pPr>
         <w:pStyle w:val="Heading2"/>
@@ -2001,15 +1913,15 @@
         <w:pStyle w:val="FirstParagraph"/>
       </w:pPr>
       <w:r>
-        <w:t xml:space="preserve">This study set out to explain not whether internationalization pays, but where and for whom. Across a 45-economy, 98-wave WBES sample, the inverted-U I–P relationship is universal in form — peaking at approximately 37% export intensity — yet its optimum is jointly conditioned by institutional regime and digital capability — institutions governing the curve’s amplitude and digital capability reshaping it — with digital capability operating as a partial substitute for institutional strength. Three implications follow. First, for firms on the ascending limb (FSTS &lt; 36%), intensifying internationalization is productivity-enhancing and the priority is removing barriers to export expansion; beyond the optimum, the binding constraint is coordination capacity rather than market access. Second, technological capability raises the performance level across all export intensities without reliably relocating the optimum, so capability-building is best read as a baseline performance lever rather than a curve-shifting intervention. Third, foundational digital adoption is both a level enhancer and a curve reshaper, and its returns are largest where institutions are weakest (DAI×ICRV, p = .049) — making digitalisation a particularly high-leverage instrument in frontier and vulnerable regimes.</w:t>
-      </w:r>
-    </w:p>
-    <w:p>
-      <w:pPr>
-        <w:pStyle w:val="BodyText"/>
-      </w:pPr>
-      <w:r>
-        <w:t xml:space="preserve">The relocated-optimum logic also clarifies which firms are most exposed to macroeconomic shocks: those pushed above their regime-specific optimum by earlier export commitments face the steepest descending-limb penalties, which the ICRV results show are sharpest in weaker-institution regimes. Recent macro-monitoring for Vietnam — the sample’s largest Group IV economy — illustrates the point, with contracting export orders in early 2026 (World Bank, 2026b) placing high-FSTS exporters on exactly this exposed segment. Digital capability can buffer the descent by flattening the descending limb (M8–M9), providing a firm-level adjustment margin when external demand weakens.</w:t>
+        <w:t xml:space="preserve">This study set out to explain not whether internationalization pays, but where and for whom. Across a 45-economy, 98-wave WBES sample, the inverted-U I–P relationship is universal in form — peaking at approximately 37% export intensity — yet its optimum is jointly conditioned by institutional regime and digital capability — institutions governing the curve's amplitude and digital capability reshaping it — with digital capability operating as a partial substitute for institutional strength. Three implications follow. First, for firms on the ascending limb (FSTS &lt; 37%), intensifying internationalization is productivity-enhancing and the priority is removing barriers to export expansion; beyond the optimum, the binding constraint is coordination capacity rather than market access. Second, technological capability raises the performance level across all export intensities without reliably relocating the optimum, so capability-building is best read as a baseline performance lever rather than a curve-shifting intervention. Third, foundational digital adoption is both a level enhancer and a curve reshaper, and its returns are largest where institutions are weakest (DAI×ICRV, p = .049) — making digitalisation a particularly high-leverage instrument in frontier and vulnerable regimes.</w:t>
+      </w:r>
+    </w:p>
+    <w:p>
+      <w:pPr>
+        <w:pStyle w:val="BodyText"/>
+      </w:pPr>
+      <w:r>
+        <w:t xml:space="preserve">The relocated-optimum logic also clarifies which firms are most exposed to macroeconomic shocks: those pushed above their regime-specific optimum by earlier export commitments face the steepest descending-limb penalties, which the ICRV results show are sharpest in weaker-institution regimes. Recent macro-monitoring for Vietnam — the sample's largest Group IV economy — illustrates the point, with contracting export orders in early 2026 (World Bank, 2026b) placing high-FSTS exporters on exactly this exposed segment. Digital capability can buffer the descent by flattening the descending limb (M8–M9), providing a firm-level adjustment margin when external demand weakens.</w:t>
       </w:r>
     </w:p>
     <w:p>
@@ -2028,7 +1940,7 @@
       </w:r>
     </w:p>
     <w:bookmarkEnd w:id="51"/>
-    <w:bookmarkStart w:id="52" w:name="references"/>
+    <w:bookmarkStart w:id="80" w:name="references"/>
     <w:p>
       <w:pPr>
         <w:pStyle w:val="Heading2"/>
@@ -2076,8 +1988,19 @@
         <w:t xml:space="preserve">Journal of Management, 17</w:t>
       </w:r>
       <w:r>
-        <w:t xml:space="preserve">(1), 99–120. https://doi.org/10.1177/014920639101700108</w:t>
-      </w:r>
+        <w:t xml:space="preserve">(1), 99–120.</w:t>
+      </w:r>
+      <w:r>
+        <w:t xml:space="preserve"> </w:t>
+      </w:r>
+      <w:hyperlink r:id="rId52">
+        <w:r>
+          <w:rPr>
+            <w:rStyle w:val="Hyperlink"/>
+          </w:rPr>
+          <w:t xml:space="preserve">https://doi.org/10.1177/014920639101700108</w:t>
+        </w:r>
+      </w:hyperlink>
     </w:p>
     <w:p>
       <w:pPr>
@@ -2121,8 +2044,19 @@
         <w:t xml:space="preserve">Management International Review, 47</w:t>
       </w:r>
       <w:r>
-        <w:t xml:space="preserve">(3), 319–347. https://doi.org/10.1007/s11575-007-0019-z</w:t>
-      </w:r>
+        <w:t xml:space="preserve">(3), 319–347.</w:t>
+      </w:r>
+      <w:r>
+        <w:t xml:space="preserve"> </w:t>
+      </w:r>
+      <w:hyperlink r:id="rId53">
+        <w:r>
+          <w:rPr>
+            <w:rStyle w:val="Hyperlink"/>
+          </w:rPr>
+          <w:t xml:space="preserve">https://doi.org/10.1007/s11575-007-0019-z</w:t>
+        </w:r>
+      </w:hyperlink>
     </w:p>
     <w:p>
       <w:pPr>
@@ -2142,8 +2076,19 @@
         <w:t xml:space="preserve">Small Business Economics, 26</w:t>
       </w:r>
       <w:r>
-        <w:t xml:space="preserve">(5), 475–492. https://doi.org/10.1007/s11187-005-5599-z</w:t>
-      </w:r>
+        <w:t xml:space="preserve">(5), 475–492.</w:t>
+      </w:r>
+      <w:r>
+        <w:t xml:space="preserve"> </w:t>
+      </w:r>
+      <w:hyperlink r:id="rId54">
+        <w:r>
+          <w:rPr>
+            <w:rStyle w:val="Hyperlink"/>
+          </w:rPr>
+          <w:t xml:space="preserve">https://doi.org/10.1007/s11187-005-5599-z</w:t>
+        </w:r>
+      </w:hyperlink>
     </w:p>
     <w:p>
       <w:pPr>
@@ -2187,8 +2132,19 @@
         <w:t xml:space="preserve"> </w:t>
       </w:r>
       <w:r>
-        <w:t xml:space="preserve">(Vol. 2, pp. 259–286). Emerald. https://doi.org/10.1016/S1479-8387(05)02011-4</w:t>
-      </w:r>
+        <w:t xml:space="preserve">(Vol. 2, pp. 259–286). Emerald.</w:t>
+      </w:r>
+      <w:r>
+        <w:t xml:space="preserve"> </w:t>
+      </w:r>
+      <w:hyperlink r:id="rId55">
+        <w:r>
+          <w:rPr>
+            <w:rStyle w:val="Hyperlink"/>
+          </w:rPr>
+          <w:t xml:space="preserve">https://doi.org/10.1016/S1479-8387(05)02011-4</w:t>
+        </w:r>
+      </w:hyperlink>
     </w:p>
     <w:p>
       <w:pPr>
@@ -2208,8 +2164,19 @@
         <w:t xml:space="preserve">Administrative Science Quarterly, 35</w:t>
       </w:r>
       <w:r>
-        <w:t xml:space="preserve">(1), 128–152. https://doi.org/10.2307/2393553</w:t>
-      </w:r>
+        <w:t xml:space="preserve">(1), 128–152.</w:t>
+      </w:r>
+      <w:r>
+        <w:t xml:space="preserve"> </w:t>
+      </w:r>
+      <w:hyperlink r:id="rId56">
+        <w:r>
+          <w:rPr>
+            <w:rStyle w:val="Hyperlink"/>
+          </w:rPr>
+          <w:t xml:space="preserve">https://doi.org/10.2307/2393553</w:t>
+        </w:r>
+      </w:hyperlink>
     </w:p>
     <w:p>
       <w:pPr>
@@ -2229,8 +2196,19 @@
         <w:t xml:space="preserve">Journal of International Business Studies, 34</w:t>
       </w:r>
       <w:r>
-        <w:t xml:space="preserve">(1), 5–18. https://doi.org/10.1057/palgrave.jibs.8400003</w:t>
-      </w:r>
+        <w:t xml:space="preserve">(1), 5–18.</w:t>
+      </w:r>
+      <w:r>
+        <w:t xml:space="preserve"> </w:t>
+      </w:r>
+      <w:hyperlink r:id="rId57">
+        <w:r>
+          <w:rPr>
+            <w:rStyle w:val="Hyperlink"/>
+          </w:rPr>
+          <w:t xml:space="preserve">https://doi.org/10.1057/palgrave.jibs.8400003</w:t>
+        </w:r>
+      </w:hyperlink>
     </w:p>
     <w:p>
       <w:pPr>
@@ -2250,8 +2228,19 @@
         <w:t xml:space="preserve">Journal of World Business, 42</w:t>
       </w:r>
       <w:r>
-        <w:t xml:space="preserve">(4), 401–417. https://doi.org/10.1016/j.jwb.2007.06.003</w:t>
-      </w:r>
+        <w:t xml:space="preserve">(4), 401–417.</w:t>
+      </w:r>
+      <w:r>
+        <w:t xml:space="preserve"> </w:t>
+      </w:r>
+      <w:hyperlink r:id="rId58">
+        <w:r>
+          <w:rPr>
+            <w:rStyle w:val="Hyperlink"/>
+          </w:rPr>
+          <w:t xml:space="preserve">https://doi.org/10.1016/j.jwb.2007.06.003</w:t>
+        </w:r>
+      </w:hyperlink>
     </w:p>
     <w:p>
       <w:pPr>
@@ -2271,8 +2260,19 @@
         <w:t xml:space="preserve">Journal of World Business, 53</w:t>
       </w:r>
       <w:r>
-        <w:t xml:space="preserve">(2), 209–221. https://doi.org/10.1016/j.jwb.2017.11.003</w:t>
-      </w:r>
+        <w:t xml:space="preserve">(2), 209–221.</w:t>
+      </w:r>
+      <w:r>
+        <w:t xml:space="preserve"> </w:t>
+      </w:r>
+      <w:hyperlink r:id="rId59">
+        <w:r>
+          <w:rPr>
+            <w:rStyle w:val="Hyperlink"/>
+          </w:rPr>
+          <w:t xml:space="preserve">https://doi.org/10.1016/j.jwb.2017.11.003</w:t>
+        </w:r>
+      </w:hyperlink>
     </w:p>
     <w:p>
       <w:pPr>
@@ -2292,8 +2292,19 @@
         <w:t xml:space="preserve">Journal of Business and Psychology, 29</w:t>
       </w:r>
       <w:r>
-        <w:t xml:space="preserve">(1), 1–19. https://doi.org/10.1007/s10869-013-9308-7</w:t>
-      </w:r>
+        <w:t xml:space="preserve">(1), 1–19.</w:t>
+      </w:r>
+      <w:r>
+        <w:t xml:space="preserve"> </w:t>
+      </w:r>
+      <w:hyperlink r:id="rId60">
+        <w:r>
+          <w:rPr>
+            <w:rStyle w:val="Hyperlink"/>
+          </w:rPr>
+          <w:t xml:space="preserve">https://doi.org/10.1007/s10869-013-9308-7</w:t>
+        </w:r>
+      </w:hyperlink>
     </w:p>
     <w:p>
       <w:pPr>
@@ -2334,8 +2345,19 @@
         <w:t xml:space="preserve">Journal of International Business Studies, 30</w:t>
       </w:r>
       <w:r>
-        <w:t xml:space="preserve">(1), 173–187. https://doi.org/10.1057/palgrave.jibs.8490065</w:t>
-      </w:r>
+        <w:t xml:space="preserve">(1), 173–187.</w:t>
+      </w:r>
+      <w:r>
+        <w:t xml:space="preserve"> </w:t>
+      </w:r>
+      <w:hyperlink r:id="rId61">
+        <w:r>
+          <w:rPr>
+            <w:rStyle w:val="Hyperlink"/>
+          </w:rPr>
+          <w:t xml:space="preserve">https://doi.org/10.1057/palgrave.jibs.8490065</w:t>
+        </w:r>
+      </w:hyperlink>
     </w:p>
     <w:p>
       <w:pPr>
@@ -2355,8 +2377,19 @@
         <w:t xml:space="preserve">Strategic Management Journal, 37</w:t>
       </w:r>
       <w:r>
-        <w:t xml:space="preserve">(7), 1177–1195. https://doi.org/10.1002/smj.2399</w:t>
-      </w:r>
+        <w:t xml:space="preserve">(7), 1177–1195.</w:t>
+      </w:r>
+      <w:r>
+        <w:t xml:space="preserve"> </w:t>
+      </w:r>
+      <w:hyperlink r:id="rId62">
+        <w:r>
+          <w:rPr>
+            <w:rStyle w:val="Hyperlink"/>
+          </w:rPr>
+          <w:t xml:space="preserve">https://doi.org/10.1002/smj.2399</w:t>
+        </w:r>
+      </w:hyperlink>
     </w:p>
     <w:p>
       <w:pPr>
@@ -2397,8 +2430,19 @@
         <w:t xml:space="preserve">Academy of Management Review, 32</w:t>
       </w:r>
       <w:r>
-        <w:t xml:space="preserve">(2), 334–343. https://doi.org/10.5465/amr.2007.24345254</w:t>
-      </w:r>
+        <w:t xml:space="preserve">(2), 334–343.</w:t>
+      </w:r>
+      <w:r>
+        <w:t xml:space="preserve"> </w:t>
+      </w:r>
+      <w:hyperlink r:id="rId63">
+        <w:r>
+          <w:rPr>
+            <w:rStyle w:val="Hyperlink"/>
+          </w:rPr>
+          <w:t xml:space="preserve">https://doi.org/10.5465/amr.2007.24345254</w:t>
+        </w:r>
+      </w:hyperlink>
     </w:p>
     <w:p>
       <w:pPr>
@@ -2418,8 +2462,19 @@
         <w:t xml:space="preserve">Academy of Management Review, 9</w:t>
       </w:r>
       <w:r>
-        <w:t xml:space="preserve">(2), 193–206. https://doi.org/10.5465/amr.1984.4277628</w:t>
-      </w:r>
+        <w:t xml:space="preserve">(2), 193–206.</w:t>
+      </w:r>
+      <w:r>
+        <w:t xml:space="preserve"> </w:t>
+      </w:r>
+      <w:hyperlink r:id="rId64">
+        <w:r>
+          <w:rPr>
+            <w:rStyle w:val="Hyperlink"/>
+          </w:rPr>
+          <w:t xml:space="preserve">https://doi.org/10.5465/amr.1984.4277628</w:t>
+        </w:r>
+      </w:hyperlink>
     </w:p>
     <w:p>
       <w:pPr>
@@ -2460,7 +2515,7 @@
           <w:iCs/>
           <w:i/>
         </w:rPr>
-        <w:t xml:space="preserve">Mind the gaps: Women in leadership in Viet Nam’s banking sector</w:t>
+        <w:t xml:space="preserve">Mind the gaps: Women in leadership in Viet Nam's banking sector</w:t>
       </w:r>
       <w:r>
         <w:t xml:space="preserve">. IFC, World Bank Group.</w:t>
@@ -2484,8 +2539,19 @@
         <w:t xml:space="preserve">Journal of International Business Studies, 8</w:t>
       </w:r>
       <w:r>
-        <w:t xml:space="preserve">(1), 23–32. https://doi.org/10.1057/palgrave.jibs.8490676</w:t>
-      </w:r>
+        <w:t xml:space="preserve">(1), 23–32.</w:t>
+      </w:r>
+      <w:r>
+        <w:t xml:space="preserve"> </w:t>
+      </w:r>
+      <w:hyperlink r:id="rId65">
+        <w:r>
+          <w:rPr>
+            <w:rStyle w:val="Hyperlink"/>
+          </w:rPr>
+          <w:t xml:space="preserve">https://doi.org/10.1057/palgrave.jibs.8490676</w:t>
+        </w:r>
+      </w:hyperlink>
     </w:p>
     <w:p>
       <w:pPr>
@@ -2505,8 +2571,19 @@
         <w:t xml:space="preserve">Journal of International Business Studies, 40</w:t>
       </w:r>
       <w:r>
-        <w:t xml:space="preserve">(9), 1411–1431. https://doi.org/10.1057/jibs.2009.24</w:t>
-      </w:r>
+        <w:t xml:space="preserve">(9), 1411–1431.</w:t>
+      </w:r>
+      <w:r>
+        <w:t xml:space="preserve"> </w:t>
+      </w:r>
+      <w:hyperlink r:id="rId66">
+        <w:r>
+          <w:rPr>
+            <w:rStyle w:val="Hyperlink"/>
+          </w:rPr>
+          <w:t xml:space="preserve">https://doi.org/10.1057/jibs.2009.24</w:t>
+        </w:r>
+      </w:hyperlink>
     </w:p>
     <w:p>
       <w:pPr>
@@ -2547,8 +2624,19 @@
         <w:t xml:space="preserve">Global Strategy Journal, 2</w:t>
       </w:r>
       <w:r>
-        <w:t xml:space="preserve">(2), 108–121. https://doi.org/10.1002/gsj.1028</w:t>
-      </w:r>
+        <w:t xml:space="preserve">(2), 108–121.</w:t>
+      </w:r>
+      <w:r>
+        <w:t xml:space="preserve"> </w:t>
+      </w:r>
+      <w:hyperlink r:id="rId67">
+        <w:r>
+          <w:rPr>
+            <w:rStyle w:val="Hyperlink"/>
+          </w:rPr>
+          <w:t xml:space="preserve">https://doi.org/10.1002/gsj.1028</w:t>
+        </w:r>
+      </w:hyperlink>
     </w:p>
     <w:p>
       <w:pPr>
@@ -2568,8 +2656,19 @@
         <w:t xml:space="preserve">Oxford Bulletin of Economics and Statistics, 72</w:t>
       </w:r>
       <w:r>
-        <w:t xml:space="preserve">(1), 109–118. https://doi.org/10.1111/j.1468-0084.2009.00569.x</w:t>
-      </w:r>
+        <w:t xml:space="preserve">(1), 109–118.</w:t>
+      </w:r>
+      <w:r>
+        <w:t xml:space="preserve"> </w:t>
+      </w:r>
+      <w:hyperlink r:id="rId68">
+        <w:r>
+          <w:rPr>
+            <w:rStyle w:val="Hyperlink"/>
+          </w:rPr>
+          <w:t xml:space="preserve">https://doi.org/10.1111/j.1468-0084.2009.00569.x</w:t>
+        </w:r>
+      </w:hyperlink>
     </w:p>
     <w:p>
       <w:pPr>
@@ -2589,8 +2688,19 @@
         <w:t xml:space="preserve">The American Statistician, 54</w:t>
       </w:r>
       <w:r>
-        <w:t xml:space="preserve">(3), 217–224. https://doi.org/10.1080/00031305.2000.10474549</w:t>
-      </w:r>
+        <w:t xml:space="preserve">(3), 217–224.</w:t>
+      </w:r>
+      <w:r>
+        <w:t xml:space="preserve"> </w:t>
+      </w:r>
+      <w:hyperlink r:id="rId69">
+        <w:r>
+          <w:rPr>
+            <w:rStyle w:val="Hyperlink"/>
+          </w:rPr>
+          <w:t xml:space="preserve">https://doi.org/10.1080/00031305.2000.10474549</w:t>
+        </w:r>
+      </w:hyperlink>
     </w:p>
     <w:p>
       <w:pPr>
@@ -2610,8 +2720,19 @@
         <w:t xml:space="preserve">Academy of Management Journal, 47</w:t>
       </w:r>
       <w:r>
-        <w:t xml:space="preserve">(4), 598–609. https://doi.org/10.2307/20159604</w:t>
-      </w:r>
+        <w:t xml:space="preserve">(4), 598–609.</w:t>
+      </w:r>
+      <w:r>
+        <w:t xml:space="preserve"> </w:t>
+      </w:r>
+      <w:hyperlink r:id="rId70">
+        <w:r>
+          <w:rPr>
+            <w:rStyle w:val="Hyperlink"/>
+          </w:rPr>
+          <w:t xml:space="preserve">https://doi.org/10.2307/20159604</w:t>
+        </w:r>
+      </w:hyperlink>
     </w:p>
     <w:p>
       <w:pPr>
@@ -2631,8 +2752,19 @@
         <w:t xml:space="preserve">Journal of International Business Studies, 47</w:t>
       </w:r>
       <w:r>
-        <w:t xml:space="preserve">(3), 386–408. https://doi.org/10.1057/jibs.2016.7</w:t>
-      </w:r>
+        <w:t xml:space="preserve">(3), 386–408.</w:t>
+      </w:r>
+      <w:r>
+        <w:t xml:space="preserve"> </w:t>
+      </w:r>
+      <w:hyperlink r:id="rId71">
+        <w:r>
+          <w:rPr>
+            <w:rStyle w:val="Hyperlink"/>
+          </w:rPr>
+          <w:t xml:space="preserve">https://doi.org/10.1057/jibs.2016.7</w:t>
+        </w:r>
+      </w:hyperlink>
     </w:p>
     <w:p>
       <w:pPr>
@@ -2694,8 +2826,19 @@
         <w:t xml:space="preserve">Journal of World Business, 43</w:t>
       </w:r>
       <w:r>
-        <w:t xml:space="preserve">(4), 475–485. https://doi.org/10.1016/j.jwb.2007.11.009</w:t>
-      </w:r>
+        <w:t xml:space="preserve">(4), 475–485.</w:t>
+      </w:r>
+      <w:r>
+        <w:t xml:space="preserve"> </w:t>
+      </w:r>
+      <w:hyperlink r:id="rId72">
+        <w:r>
+          <w:rPr>
+            <w:rStyle w:val="Hyperlink"/>
+          </w:rPr>
+          <w:t xml:space="preserve">https://doi.org/10.1016/j.jwb.2007.11.009</w:t>
+        </w:r>
+      </w:hyperlink>
     </w:p>
     <w:p>
       <w:pPr>
@@ -2736,8 +2879,19 @@
         <w:t xml:space="preserve">Journal of Management, 35</w:t>
       </w:r>
       <w:r>
-        <w:t xml:space="preserve">(3), 718–804. https://doi.org/10.1177/0149206308330560</w:t>
-      </w:r>
+        <w:t xml:space="preserve">(3), 718–804.</w:t>
+      </w:r>
+      <w:r>
+        <w:t xml:space="preserve"> </w:t>
+      </w:r>
+      <w:hyperlink r:id="rId73">
+        <w:r>
+          <w:rPr>
+            <w:rStyle w:val="Hyperlink"/>
+          </w:rPr>
+          <w:t xml:space="preserve">https://doi.org/10.1177/0149206308330560</w:t>
+        </w:r>
+      </w:hyperlink>
     </w:p>
     <w:p>
       <w:pPr>
@@ -2781,8 +2935,19 @@
         <w:t xml:space="preserve">Global Strategy Journal, 11</w:t>
       </w:r>
       <w:r>
-        <w:t xml:space="preserve">(1), 58–80. https://doi.org/10.1002/gsj.1336</w:t>
-      </w:r>
+        <w:t xml:space="preserve">(1), 58–80.</w:t>
+      </w:r>
+      <w:r>
+        <w:t xml:space="preserve"> </w:t>
+      </w:r>
+      <w:hyperlink r:id="rId74">
+        <w:r>
+          <w:rPr>
+            <w:rStyle w:val="Hyperlink"/>
+          </w:rPr>
+          <w:t xml:space="preserve">https://doi.org/10.1002/gsj.1336</w:t>
+        </w:r>
+      </w:hyperlink>
     </w:p>
     <w:p>
       <w:pPr>
@@ -2823,8 +2988,19 @@
         <w:t xml:space="preserve">Standard country or area codes for statistical use (M49)</w:t>
       </w:r>
       <w:r>
-        <w:t xml:space="preserve">. United Nations. https://unstats.un.org/unsd/methodology/m49/</w:t>
-      </w:r>
+        <w:t xml:space="preserve">. United Nations.</w:t>
+      </w:r>
+      <w:r>
+        <w:t xml:space="preserve"> </w:t>
+      </w:r>
+      <w:hyperlink r:id="rId75">
+        <w:r>
+          <w:rPr>
+            <w:rStyle w:val="Hyperlink"/>
+          </w:rPr>
+          <w:t xml:space="preserve">https://unstats.un.org/unsd/methodology/m49/</w:t>
+        </w:r>
+      </w:hyperlink>
     </w:p>
     <w:p>
       <w:pPr>
@@ -2844,8 +3020,19 @@
         <w:t xml:space="preserve">Journal of Business Research, 122</w:t>
       </w:r>
       <w:r>
-        <w:t xml:space="preserve">, 889–901. https://doi.org/10.1016/j.jbusres.2019.09.022</w:t>
-      </w:r>
+        <w:t xml:space="preserve">, 889–901.</w:t>
+      </w:r>
+      <w:r>
+        <w:t xml:space="preserve"> </w:t>
+      </w:r>
+      <w:hyperlink r:id="rId76">
+        <w:r>
+          <w:rPr>
+            <w:rStyle w:val="Hyperlink"/>
+          </w:rPr>
+          <w:t xml:space="preserve">https://doi.org/10.1016/j.jbusres.2019.09.022</w:t>
+        </w:r>
+      </w:hyperlink>
     </w:p>
     <w:p>
       <w:pPr>
@@ -2865,8 +3052,19 @@
         <w:t xml:space="preserve">Strategic Management Journal, 5</w:t>
       </w:r>
       <w:r>
-        <w:t xml:space="preserve">(2), 171–180. https://doi.org/10.1002/smj.4250050207</w:t>
-      </w:r>
+        <w:t xml:space="preserve">(2), 171–180.</w:t>
+      </w:r>
+      <w:r>
+        <w:t xml:space="preserve"> </w:t>
+      </w:r>
+      <w:hyperlink r:id="rId77">
+        <w:r>
+          <w:rPr>
+            <w:rStyle w:val="Hyperlink"/>
+          </w:rPr>
+          <w:t xml:space="preserve">https://doi.org/10.1002/smj.4250050207</w:t>
+        </w:r>
+      </w:hyperlink>
     </w:p>
     <w:p>
       <w:pPr>
@@ -2886,8 +3084,19 @@
         <w:t xml:space="preserve">Enterprise surveys: Sampling methodology</w:t>
       </w:r>
       <w:r>
-        <w:t xml:space="preserve">. World Bank Group. https://www.enterprisesurveys.org</w:t>
-      </w:r>
+        <w:t xml:space="preserve">. World Bank Group.</w:t>
+      </w:r>
+      <w:r>
+        <w:t xml:space="preserve"> </w:t>
+      </w:r>
+      <w:hyperlink r:id="rId78">
+        <w:r>
+          <w:rPr>
+            <w:rStyle w:val="Hyperlink"/>
+          </w:rPr>
+          <w:t xml:space="preserve">https://www.enterprisesurveys.org</w:t>
+        </w:r>
+      </w:hyperlink>
     </w:p>
     <w:p>
       <w:pPr>
@@ -2907,8 +3116,19 @@
         <w:t xml:space="preserve">Enterprise surveys</w:t>
       </w:r>
       <w:r>
-        <w:t xml:space="preserve">. https://www.enterprisesurveys.org</w:t>
-      </w:r>
+        <w:t xml:space="preserve">.</w:t>
+      </w:r>
+      <w:r>
+        <w:t xml:space="preserve"> </w:t>
+      </w:r>
+      <w:hyperlink r:id="rId78">
+        <w:r>
+          <w:rPr>
+            <w:rStyle w:val="Hyperlink"/>
+          </w:rPr>
+          <w:t xml:space="preserve">https://www.enterprisesurveys.org</w:t>
+        </w:r>
+      </w:hyperlink>
     </w:p>
     <w:p>
       <w:pPr>
@@ -2976,8 +3196,19 @@
         <w:t xml:space="preserve"> </w:t>
       </w:r>
       <w:r>
-        <w:t xml:space="preserve">(Prosperity Data360). World Bank Group. https://www.worldbank.org/ext/en/country/vietnam</w:t>
-      </w:r>
+        <w:t xml:space="preserve">(Prosperity Data360). World Bank Group.</w:t>
+      </w:r>
+      <w:r>
+        <w:t xml:space="preserve"> </w:t>
+      </w:r>
+      <w:hyperlink r:id="rId79">
+        <w:r>
+          <w:rPr>
+            <w:rStyle w:val="Hyperlink"/>
+          </w:rPr>
+          <w:t xml:space="preserve">https://www.worldbank.org/ext/en/country/vietnam</w:t>
+        </w:r>
+      </w:hyperlink>
     </w:p>
     <w:p>
       <w:pPr>
@@ -3042,8 +3273,19 @@
         <w:t xml:space="preserve"> </w:t>
       </w:r>
       <w:r>
-        <w:t xml:space="preserve">(Prosperity Data360). World Bank Group. https://www.worldbank.org/ext/en/country/vietnam</w:t>
-      </w:r>
+        <w:t xml:space="preserve">(Prosperity Data360). World Bank Group.</w:t>
+      </w:r>
+      <w:r>
+        <w:t xml:space="preserve"> </w:t>
+      </w:r>
+      <w:hyperlink r:id="rId79">
+        <w:r>
+          <w:rPr>
+            <w:rStyle w:val="Hyperlink"/>
+          </w:rPr>
+          <w:t xml:space="preserve">https://www.worldbank.org/ext/en/country/vietnam</w:t>
+        </w:r>
+      </w:hyperlink>
     </w:p>
     <w:p>
       <w:pPr>
@@ -3073,8 +3315,8 @@
         </w:pict>
       </w:r>
     </w:p>
-    <w:bookmarkEnd w:id="52"/>
-    <w:bookmarkStart w:id="53" w:name="appendix-a-model-sequence"/>
+    <w:bookmarkEnd w:id="80"/>
+    <w:bookmarkStart w:id="81" w:name="appendix-a-model-sequence"/>
     <w:p>
       <w:pPr>
         <w:pStyle w:val="Heading2"/>
@@ -3098,7 +3340,7 @@
     <w:tbl>
       <w:tblPr>
         <w:tblStyle w:val="Table"/>
-        <w:tblW w:type="pct" w:w="5000"/>
+        <w:tblW w:type="auto" w:w="0"/>
         <w:tblLook w:firstRow="1" w:lastRow="0" w:firstColumn="0" w:lastColumn="0" w:noHBand="0" w:noVBand="0" w:val="0020"/>
         <w:jc w:val="start"/>
       </w:tblPr>
@@ -3727,7 +3969,7 @@
     <w:tbl>
       <w:tblPr>
         <w:tblStyle w:val="Table"/>
-        <w:tblW w:type="pct" w:w="5000"/>
+        <w:tblW w:type="auto" w:w="0"/>
         <w:tblLook w:firstRow="1" w:lastRow="0" w:firstColumn="0" w:lastColumn="0" w:noHBand="0" w:noVBand="0" w:val="0020"/>
         <w:jc w:val="start"/>
       </w:tblPr>
@@ -4692,7 +4934,7 @@
     <w:tbl>
       <w:tblPr>
         <w:tblStyle w:val="Table"/>
-        <w:tblW w:type="pct" w:w="5000"/>
+        <w:tblW w:type="auto" w:w="0"/>
         <w:tblLook w:firstRow="1" w:lastRow="0" w:firstColumn="0" w:lastColumn="0" w:noHBand="0" w:noVBand="0" w:val="0020"/>
         <w:jc w:val="start"/>
       </w:tblPr>
@@ -5907,24 +6149,7 @@
         <w:t xml:space="preserve"> </w:t>
       </w:r>
       <w:r>
-        <w:t xml:space="preserve">HC1 robust SEs. *** p &lt; .001, ** p &lt; .01, * p &lt; .05, † p &lt; .10. Controls (female_owner, foreign_own_pct, firm_age, ln_size) included in M7–M10 but not reported for space. M11 (N=28,500, AdjR²=.057, TP=25.7%, LM p=.026): DAI×ICRV=+0.052</w:t>
-      </w:r>
-      <w:r>
-        <w:rPr>
-          <w:iCs/>
-          <w:i/>
-        </w:rPr>
-        <w:t xml:space="preserve">, three-way FSTS×DAI×ICRV=−0.016 (NS), mgr_experience=+0.022</w:t>
-      </w:r>
-      <w:r>
-        <w:rPr>
-          <w:bCs/>
-          <w:b/>
-        </w:rPr>
-        <w:t xml:space="preserve">, FSTS×mgr=+0.007 (NS), mgr_female=+0.210</w:t>
-      </w:r>
-      <w:r>
-        <w:t xml:space="preserve">*, female_owner=+0.122**.</w:t>
+        <w:t xml:space="preserve">HC1 robust SEs. *** p &lt; .001, ** p &lt; .01, * p &lt; .05, † p &lt; .10. Controls (female_owner, foreign_own_pct, firm_age, ln_size) included in M7–M10 but not reported for space. M11 (N=28,500, AdjR²=.057, TP=25.7%, LM p=.026): DAI×ICRV=+0.052*, three-way FSTS×DAI×ICRV=−0.016 (NS), mgr_experience=+0.022***, FSTS×mgr=+0.007 (NS), mgr_female=+0.210***, female_owner=+0.122**.</w:t>
       </w:r>
     </w:p>
     <w:p>
@@ -5934,8 +6159,8 @@
         </w:pict>
       </w:r>
     </w:p>
-    <w:bookmarkEnd w:id="53"/>
-    <w:bookmarkStart w:id="54" w:name="X09b5d89c7c8f35bf9d25d1bfe47da72b2ba58bf"/>
+    <w:bookmarkEnd w:id="81"/>
+    <w:bookmarkStart w:id="84" w:name="X09b5d89c7c8f35bf9d25d1bfe47da72b2ba58bf"/>
     <w:p>
       <w:pPr>
         <w:pStyle w:val="Heading2"/>
@@ -5961,7 +6186,7 @@
         <w:t xml:space="preserve">replication/Annex_TFP_regression_tables_March_11_2026.xlsx</w:t>
       </w:r>
       <w:r>
-        <w:t xml:space="preserve">. TFP residuals from these regressions can be used as an alternative dependent variable to ln(LP) to test whether the inverted-U relationship is robust to output-per-worker vs. total-factor productivity operationalisations.</w:t>
+        <w:t xml:space="preserve">. TFP residuals from these regressions can be used as an alternative dependent variable to ln(LP) to test whether the inverted-U relationship is robust to output-per-worker vs. total-factor productivity operationalisations.</w:t>
       </w:r>
     </w:p>
     <w:p>
@@ -5980,7 +6205,31 @@
           <w:iCs/>
           <w:i/>
         </w:rPr>
-        <w:t xml:space="preserve">Corresponding author: Phan Anh Tu, School of Economics, Can Tho University, patu@ctu.edu.vn, ORCID: 0000-0003-0667-3137</w:t>
+        <w:t xml:space="preserve">Corresponding author: Phan Anh Tu, School of Economics, Can Tho University,</w:t>
+      </w:r>
+      <w:r>
+        <w:rPr>
+          <w:iCs/>
+          <w:i/>
+        </w:rPr>
+        <w:t xml:space="preserve"> </w:t>
+      </w:r>
+      <w:hyperlink r:id="rId82">
+        <w:r>
+          <w:rPr>
+            <w:rStyle w:val="Hyperlink"/>
+            <w:iCs/>
+            <w:i/>
+          </w:rPr>
+          <w:t xml:space="preserve">patu@ctu.edu.vn</w:t>
+        </w:r>
+      </w:hyperlink>
+      <w:r>
+        <w:rPr>
+          <w:iCs/>
+          <w:i/>
+        </w:rPr>
+        <w:t xml:space="preserve">, ORCID: 0000-0003-0667-3137</w:t>
       </w:r>
       <w:r>
         <w:br/>
@@ -5990,11 +6239,35 @@
           <w:iCs/>
           <w:i/>
         </w:rPr>
-        <w:t xml:space="preserve">First author: Do Thuy Huong, Vinh Long University of Technology Education, huongdt@vlute.edu.vn, ORCID: 0000-0002-7711-2487</w:t>
-      </w:r>
-    </w:p>
-    <w:bookmarkEnd w:id="54"/>
-    <w:bookmarkEnd w:id="55"/>
+        <w:t xml:space="preserve">First author: Do Thuy Huong, Vinh Long University of Technology Education,</w:t>
+      </w:r>
+      <w:r>
+        <w:rPr>
+          <w:iCs/>
+          <w:i/>
+        </w:rPr>
+        <w:t xml:space="preserve"> </w:t>
+      </w:r>
+      <w:hyperlink r:id="rId83">
+        <w:r>
+          <w:rPr>
+            <w:rStyle w:val="Hyperlink"/>
+            <w:iCs/>
+            <w:i/>
+          </w:rPr>
+          <w:t xml:space="preserve">huongdt@vlute.edu.vn</w:t>
+        </w:r>
+      </w:hyperlink>
+      <w:r>
+        <w:rPr>
+          <w:iCs/>
+          <w:i/>
+        </w:rPr>
+        <w:t xml:space="preserve">, ORCID: 0000-0002-7711-2487</w:t>
+      </w:r>
+    </w:p>
+    <w:bookmarkEnd w:id="84"/>
+    <w:bookmarkEnd w:id="85"/>
     <w:sectPr>
       <w:pgSz w:h="16838" w:w="11906"/>
       <w:pgMar w:bottom="1417" w:left="1417" w:right="1417" w:top="1417"/>
@@ -6840,13 +7113,15 @@
     <w:link w:val="VerbatimChar"/>
     <w:pPr>
       <w:wordWrap w:val="off"/>
+      <w:shd w:val="clear" w:fill="f8f8f8"/>
     </w:pPr>
   </w:style>
   <w:style w:type="character" w:customStyle="1" w:styleId="KeywordTok">
     <w:name w:val="KeywordTok"/>
     <w:basedOn w:val="VerbatimChar"/>
     <w:rPr>
-      <w:color w:val="007020"/>
+      <w:color w:val="204a87"/>
+      <w:shd w:val="clear" w:fill="f8f8f8"/>
       <w:b/>
     </w:rPr>
   </w:style>
@@ -6854,85 +7129,96 @@
     <w:name w:val="DataTypeTok"/>
     <w:basedOn w:val="VerbatimChar"/>
     <w:rPr>
-      <w:color w:val="902000"/>
+      <w:color w:val="204a87"/>
+      <w:shd w:val="clear" w:fill="f8f8f8"/>
     </w:rPr>
   </w:style>
   <w:style w:type="character" w:customStyle="1" w:styleId="DecValTok">
     <w:name w:val="DecValTok"/>
     <w:basedOn w:val="VerbatimChar"/>
     <w:rPr>
-      <w:color w:val="40a070"/>
+      <w:color w:val="0000cf"/>
+      <w:shd w:val="clear" w:fill="f8f8f8"/>
     </w:rPr>
   </w:style>
   <w:style w:type="character" w:customStyle="1" w:styleId="BaseNTok">
     <w:name w:val="BaseNTok"/>
     <w:basedOn w:val="VerbatimChar"/>
     <w:rPr>
-      <w:color w:val="40a070"/>
+      <w:color w:val="0000cf"/>
+      <w:shd w:val="clear" w:fill="f8f8f8"/>
     </w:rPr>
   </w:style>
   <w:style w:type="character" w:customStyle="1" w:styleId="FloatTok">
     <w:name w:val="FloatTok"/>
     <w:basedOn w:val="VerbatimChar"/>
     <w:rPr>
-      <w:color w:val="40a070"/>
+      <w:color w:val="0000cf"/>
+      <w:shd w:val="clear" w:fill="f8f8f8"/>
     </w:rPr>
   </w:style>
   <w:style w:type="character" w:customStyle="1" w:styleId="ConstantTok">
     <w:name w:val="ConstantTok"/>
     <w:basedOn w:val="VerbatimChar"/>
     <w:rPr>
-      <w:color w:val="880000"/>
+      <w:color w:val="8f5902"/>
+      <w:shd w:val="clear" w:fill="f8f8f8"/>
     </w:rPr>
   </w:style>
   <w:style w:type="character" w:customStyle="1" w:styleId="CharTok">
     <w:name w:val="CharTok"/>
     <w:basedOn w:val="VerbatimChar"/>
     <w:rPr>
-      <w:color w:val="4070a0"/>
+      <w:color w:val="4e9a06"/>
+      <w:shd w:val="clear" w:fill="f8f8f8"/>
     </w:rPr>
   </w:style>
   <w:style w:type="character" w:customStyle="1" w:styleId="SpecialCharTok">
     <w:name w:val="SpecialCharTok"/>
     <w:basedOn w:val="VerbatimChar"/>
     <w:rPr>
-      <w:color w:val="4070a0"/>
+      <w:color w:val="ce5c00"/>
+      <w:shd w:val="clear" w:fill="f8f8f8"/>
+      <w:b/>
     </w:rPr>
   </w:style>
   <w:style w:type="character" w:customStyle="1" w:styleId="StringTok">
     <w:name w:val="StringTok"/>
     <w:basedOn w:val="VerbatimChar"/>
     <w:rPr>
-      <w:color w:val="4070a0"/>
+      <w:color w:val="4e9a06"/>
+      <w:shd w:val="clear" w:fill="f8f8f8"/>
     </w:rPr>
   </w:style>
   <w:style w:type="character" w:customStyle="1" w:styleId="VerbatimStringTok">
     <w:name w:val="VerbatimStringTok"/>
     <w:basedOn w:val="VerbatimChar"/>
     <w:rPr>
-      <w:color w:val="4070a0"/>
+      <w:color w:val="4e9a06"/>
+      <w:shd w:val="clear" w:fill="f8f8f8"/>
     </w:rPr>
   </w:style>
   <w:style w:type="character" w:customStyle="1" w:styleId="SpecialStringTok">
     <w:name w:val="SpecialStringTok"/>
     <w:basedOn w:val="VerbatimChar"/>
     <w:rPr>
-      <w:color w:val="bb6688"/>
+      <w:color w:val="4e9a06"/>
+      <w:shd w:val="clear" w:fill="f8f8f8"/>
     </w:rPr>
   </w:style>
   <w:style w:type="character" w:customStyle="1" w:styleId="ImportTok">
     <w:name w:val="ImportTok"/>
     <w:basedOn w:val="VerbatimChar"/>
     <w:rPr>
-      <w:color w:val="008000"/>
-      <w:b/>
+      <w:shd w:val="clear" w:fill="f8f8f8"/>
     </w:rPr>
   </w:style>
   <w:style w:type="character" w:customStyle="1" w:styleId="CommentTok">
     <w:name w:val="CommentTok"/>
     <w:basedOn w:val="VerbatimChar"/>
     <w:rPr>
-      <w:color w:val="60a0b0"/>
+      <w:color w:val="8f5902"/>
+      <w:shd w:val="clear" w:fill="f8f8f8"/>
       <w:i/>
     </w:rPr>
   </w:style>
@@ -6940,7 +7226,9 @@
     <w:name w:val="DocumentationTok"/>
     <w:basedOn w:val="VerbatimChar"/>
     <w:rPr>
-      <w:color w:val="ba2121"/>
+      <w:color w:val="8f5902"/>
+      <w:shd w:val="clear" w:fill="f8f8f8"/>
+      <w:b/>
       <w:i/>
     </w:rPr>
   </w:style>
@@ -6948,7 +7236,8 @@
     <w:name w:val="AnnotationTok"/>
     <w:basedOn w:val="VerbatimChar"/>
     <w:rPr>
-      <w:color w:val="60a0b0"/>
+      <w:color w:val="8f5902"/>
+      <w:shd w:val="clear" w:fill="f8f8f8"/>
       <w:b/>
       <w:i/>
     </w:rPr>
@@ -6957,7 +7246,8 @@
     <w:name w:val="CommentVarTok"/>
     <w:basedOn w:val="VerbatimChar"/>
     <w:rPr>
-      <w:color w:val="60a0b0"/>
+      <w:color w:val="8f5902"/>
+      <w:shd w:val="clear" w:fill="f8f8f8"/>
       <w:b/>
       <w:i/>
     </w:rPr>
@@ -6966,28 +7256,33 @@
     <w:name w:val="OtherTok"/>
     <w:basedOn w:val="VerbatimChar"/>
     <w:rPr>
-      <w:color w:val="007020"/>
+      <w:color w:val="8f5902"/>
+      <w:shd w:val="clear" w:fill="f8f8f8"/>
     </w:rPr>
   </w:style>
   <w:style w:type="character" w:customStyle="1" w:styleId="FunctionTok">
     <w:name w:val="FunctionTok"/>
     <w:basedOn w:val="VerbatimChar"/>
     <w:rPr>
-      <w:color w:val="06287e"/>
+      <w:color w:val="204a87"/>
+      <w:shd w:val="clear" w:fill="f8f8f8"/>
+      <w:b/>
     </w:rPr>
   </w:style>
   <w:style w:type="character" w:customStyle="1" w:styleId="VariableTok">
     <w:name w:val="VariableTok"/>
     <w:basedOn w:val="VerbatimChar"/>
     <w:rPr>
-      <w:color w:val="19177c"/>
+      <w:color w:val="000000"/>
+      <w:shd w:val="clear" w:fill="f8f8f8"/>
     </w:rPr>
   </w:style>
   <w:style w:type="character" w:customStyle="1" w:styleId="ControlFlowTok">
     <w:name w:val="ControlFlowTok"/>
     <w:basedOn w:val="VerbatimChar"/>
     <w:rPr>
-      <w:color w:val="007020"/>
+      <w:color w:val="204a87"/>
+      <w:shd w:val="clear" w:fill="f8f8f8"/>
       <w:b/>
     </w:rPr>
   </w:style>
@@ -6995,45 +7290,55 @@
     <w:name w:val="OperatorTok"/>
     <w:basedOn w:val="VerbatimChar"/>
     <w:rPr>
-      <w:color w:val="666666"/>
+      <w:color w:val="ce5c00"/>
+      <w:shd w:val="clear" w:fill="f8f8f8"/>
+      <w:b/>
     </w:rPr>
   </w:style>
   <w:style w:type="character" w:customStyle="1" w:styleId="BuiltInTok">
     <w:name w:val="BuiltInTok"/>
     <w:basedOn w:val="VerbatimChar"/>
     <w:rPr>
-      <w:color w:val="008000"/>
+      <w:shd w:val="clear" w:fill="f8f8f8"/>
     </w:rPr>
   </w:style>
   <w:style w:type="character" w:customStyle="1" w:styleId="ExtensionTok">
     <w:name w:val="ExtensionTok"/>
     <w:basedOn w:val="VerbatimChar"/>
-    <w:rPr/>
+    <w:rPr>
+      <w:shd w:val="clear" w:fill="f8f8f8"/>
+    </w:rPr>
   </w:style>
   <w:style w:type="character" w:customStyle="1" w:styleId="PreprocessorTok">
     <w:name w:val="PreprocessorTok"/>
     <w:basedOn w:val="VerbatimChar"/>
     <w:rPr>
-      <w:color w:val="bc7a00"/>
+      <w:color w:val="8f5902"/>
+      <w:shd w:val="clear" w:fill="f8f8f8"/>
+      <w:i/>
     </w:rPr>
   </w:style>
   <w:style w:type="character" w:customStyle="1" w:styleId="AttributeTok">
     <w:name w:val="AttributeTok"/>
     <w:basedOn w:val="VerbatimChar"/>
     <w:rPr>
-      <w:color w:val="7d9029"/>
+      <w:color w:val="204a87"/>
+      <w:shd w:val="clear" w:fill="f8f8f8"/>
     </w:rPr>
   </w:style>
   <w:style w:type="character" w:customStyle="1" w:styleId="RegionMarkerTok">
     <w:name w:val="RegionMarkerTok"/>
     <w:basedOn w:val="VerbatimChar"/>
-    <w:rPr/>
+    <w:rPr>
+      <w:shd w:val="clear" w:fill="f8f8f8"/>
+    </w:rPr>
   </w:style>
   <w:style w:type="character" w:customStyle="1" w:styleId="InformationTok">
     <w:name w:val="InformationTok"/>
     <w:basedOn w:val="VerbatimChar"/>
     <w:rPr>
-      <w:color w:val="60a0b0"/>
+      <w:color w:val="8f5902"/>
+      <w:shd w:val="clear" w:fill="f8f8f8"/>
       <w:b/>
       <w:i/>
     </w:rPr>
@@ -7042,7 +7347,8 @@
     <w:name w:val="WarningTok"/>
     <w:basedOn w:val="VerbatimChar"/>
     <w:rPr>
-      <w:color w:val="60a0b0"/>
+      <w:color w:val="8f5902"/>
+      <w:shd w:val="clear" w:fill="f8f8f8"/>
       <w:b/>
       <w:i/>
     </w:rPr>
@@ -7051,22 +7357,25 @@
     <w:name w:val="AlertTok"/>
     <w:basedOn w:val="VerbatimChar"/>
     <w:rPr>
-      <w:color w:val="ff0000"/>
-      <w:b/>
+      <w:color w:val="ef2929"/>
+      <w:shd w:val="clear" w:fill="f8f8f8"/>
     </w:rPr>
   </w:style>
   <w:style w:type="character" w:customStyle="1" w:styleId="ErrorTok">
     <w:name w:val="ErrorTok"/>
     <w:basedOn w:val="VerbatimChar"/>
     <w:rPr>
-      <w:color w:val="ff0000"/>
+      <w:color w:val="a40000"/>
+      <w:shd w:val="clear" w:fill="f8f8f8"/>
       <w:b/>
     </w:rPr>
   </w:style>
   <w:style w:type="character" w:customStyle="1" w:styleId="NormalTok">
     <w:name w:val="NormalTok"/>
     <w:basedOn w:val="VerbatimChar"/>
-    <w:rPr/>
+    <w:rPr>
+      <w:shd w:val="clear" w:fill="f8f8f8"/>
+    </w:rPr>
   </w:style>
 </w:styles>
 </file>

</xml_diff>